<commit_message>
Fix orientation: sua loi bit order render anh bitmap font (LSB-first) de anh A01-A11 xuoi dung chieu
</commit_message>
<xml_diff>
--- a/N24DCDT047_DT042_TuLeNhatLong_BaoCao.docx
+++ b/N24DCDT047_DT042_TuLeNhatLong_BaoCao.docx
@@ -1003,7 +1003,7 @@
         <w:keepNext w:val="0"/>
         <w:spacing w:before="0" w:after="320"/>
       </w:pPr>
-      <w:bookmarkStart w:id="0" w:name="_Toc25563"/>
+      <w:bookmarkStart w:id="0" w:name="_Toc5108"/>
       <w:r>
         <w:t>PHIẾU GIAO ĐỀ TÀI</w:t>
       </w:r>
@@ -1744,7 +1744,7 @@
         <w:keepNext w:val="0"/>
         <w:spacing w:before="0" w:after="320"/>
       </w:pPr>
-      <w:bookmarkStart w:id="1" w:name="_Toc17204"/>
+      <w:bookmarkStart w:id="1" w:name="_Toc8773"/>
       <w:r>
         <w:t>PHIẾU CHẤM VÀ ĐỐI CHIẾU MINH CHỨNG</w:t>
       </w:r>
@@ -2612,7 +2612,7 @@
         <w:pStyle w:val="3"/>
         <w:pageBreakBefore/>
       </w:pPr>
-      <w:bookmarkStart w:id="2" w:name="_Toc31772"/>
+      <w:bookmarkStart w:id="2" w:name="_Toc20934"/>
       <w:r>
         <w:t>CÁCH ĐỐI CHIẾU RUBRIC</w:t>
       </w:r>
@@ -2840,7 +2840,7 @@
         <w:keepNext w:val="0"/>
         <w:spacing w:before="0" w:after="320"/>
       </w:pPr>
-      <w:bookmarkStart w:id="3" w:name="_Toc27326"/>
+      <w:bookmarkStart w:id="3" w:name="_Toc3671"/>
       <w:r>
         <w:t>HƯỚNG DẪN ĐIỀN KHUNG BÁO CÁO</w:t>
       </w:r>
@@ -2925,7 +2925,7 @@
         <w:keepNext w:val="0"/>
         <w:spacing w:before="0" w:after="320"/>
       </w:pPr>
-      <w:bookmarkStart w:id="4" w:name="_Toc14391"/>
+      <w:bookmarkStart w:id="4" w:name="_Toc10262"/>
       <w:r>
         <w:t>LỜI CAM ĐOAN</w:t>
       </w:r>
@@ -3095,7 +3095,7 @@
         <w:keepNext w:val="0"/>
         <w:spacing w:before="0" w:after="320"/>
       </w:pPr>
-      <w:bookmarkStart w:id="5" w:name="_Toc4957"/>
+      <w:bookmarkStart w:id="5" w:name="_Toc6770"/>
       <w:r>
         <w:t>LỜI CẢM ƠN</w:t>
       </w:r>
@@ -3149,7 +3149,7 @@
         <w:keepNext w:val="0"/>
         <w:spacing w:before="0" w:after="320"/>
       </w:pPr>
-      <w:bookmarkStart w:id="6" w:name="_Toc18475"/>
+      <w:bookmarkStart w:id="6" w:name="_Toc15046"/>
       <w:r>
         <w:t>TÓM TẮT</w:t>
       </w:r>
@@ -3278,7 +3278,7 @@
         <w:fldChar w:fldCharType="begin"/>
       </w:r>
       <w:r>
-        <w:instrText xml:space="preserve"> HYPERLINK \l _Toc25563 </w:instrText>
+        <w:instrText xml:space="preserve"> HYPERLINK \l _Toc5108 </w:instrText>
       </w:r>
       <w:r>
         <w:fldChar w:fldCharType="separate"/>
@@ -3293,7 +3293,7 @@
         <w:fldChar w:fldCharType="begin"/>
       </w:r>
       <w:r>
-        <w:instrText xml:space="preserve"> PAGEREF _Toc25563 \h </w:instrText>
+        <w:instrText xml:space="preserve"> PAGEREF _Toc5108 \h </w:instrText>
       </w:r>
       <w:r>
         <w:fldChar w:fldCharType="separate"/>
@@ -3319,7 +3319,7 @@
         <w:fldChar w:fldCharType="begin"/>
       </w:r>
       <w:r>
-        <w:instrText xml:space="preserve"> HYPERLINK \l _Toc17204 </w:instrText>
+        <w:instrText xml:space="preserve"> HYPERLINK \l _Toc8773 </w:instrText>
       </w:r>
       <w:r>
         <w:fldChar w:fldCharType="separate"/>
@@ -3334,7 +3334,7 @@
         <w:fldChar w:fldCharType="begin"/>
       </w:r>
       <w:r>
-        <w:instrText xml:space="preserve"> PAGEREF _Toc17204 \h </w:instrText>
+        <w:instrText xml:space="preserve"> PAGEREF _Toc8773 \h </w:instrText>
       </w:r>
       <w:r>
         <w:fldChar w:fldCharType="separate"/>
@@ -3360,7 +3360,7 @@
         <w:fldChar w:fldCharType="begin"/>
       </w:r>
       <w:r>
-        <w:instrText xml:space="preserve"> HYPERLINK \l _Toc31772 </w:instrText>
+        <w:instrText xml:space="preserve"> HYPERLINK \l _Toc20934 </w:instrText>
       </w:r>
       <w:r>
         <w:fldChar w:fldCharType="separate"/>
@@ -3375,7 +3375,7 @@
         <w:fldChar w:fldCharType="begin"/>
       </w:r>
       <w:r>
-        <w:instrText xml:space="preserve"> PAGEREF _Toc31772 \h </w:instrText>
+        <w:instrText xml:space="preserve"> PAGEREF _Toc20934 \h </w:instrText>
       </w:r>
       <w:r>
         <w:fldChar w:fldCharType="separate"/>
@@ -3401,7 +3401,7 @@
         <w:fldChar w:fldCharType="begin"/>
       </w:r>
       <w:r>
-        <w:instrText xml:space="preserve"> HYPERLINK \l _Toc27326 </w:instrText>
+        <w:instrText xml:space="preserve"> HYPERLINK \l _Toc3671 </w:instrText>
       </w:r>
       <w:r>
         <w:fldChar w:fldCharType="separate"/>
@@ -3416,7 +3416,7 @@
         <w:fldChar w:fldCharType="begin"/>
       </w:r>
       <w:r>
-        <w:instrText xml:space="preserve"> PAGEREF _Toc27326 \h </w:instrText>
+        <w:instrText xml:space="preserve"> PAGEREF _Toc3671 \h </w:instrText>
       </w:r>
       <w:r>
         <w:fldChar w:fldCharType="separate"/>
@@ -3442,7 +3442,7 @@
         <w:fldChar w:fldCharType="begin"/>
       </w:r>
       <w:r>
-        <w:instrText xml:space="preserve"> HYPERLINK \l _Toc14391 </w:instrText>
+        <w:instrText xml:space="preserve"> HYPERLINK \l _Toc10262 </w:instrText>
       </w:r>
       <w:r>
         <w:fldChar w:fldCharType="separate"/>
@@ -3457,7 +3457,7 @@
         <w:fldChar w:fldCharType="begin"/>
       </w:r>
       <w:r>
-        <w:instrText xml:space="preserve"> PAGEREF _Toc14391 \h </w:instrText>
+        <w:instrText xml:space="preserve"> PAGEREF _Toc10262 \h </w:instrText>
       </w:r>
       <w:r>
         <w:fldChar w:fldCharType="separate"/>
@@ -3483,7 +3483,7 @@
         <w:fldChar w:fldCharType="begin"/>
       </w:r>
       <w:r>
-        <w:instrText xml:space="preserve"> HYPERLINK \l _Toc4957 </w:instrText>
+        <w:instrText xml:space="preserve"> HYPERLINK \l _Toc6770 </w:instrText>
       </w:r>
       <w:r>
         <w:fldChar w:fldCharType="separate"/>
@@ -3498,7 +3498,7 @@
         <w:fldChar w:fldCharType="begin"/>
       </w:r>
       <w:r>
-        <w:instrText xml:space="preserve"> PAGEREF _Toc4957 \h </w:instrText>
+        <w:instrText xml:space="preserve"> PAGEREF _Toc6770 \h </w:instrText>
       </w:r>
       <w:r>
         <w:fldChar w:fldCharType="separate"/>
@@ -3524,7 +3524,7 @@
         <w:fldChar w:fldCharType="begin"/>
       </w:r>
       <w:r>
-        <w:instrText xml:space="preserve"> HYPERLINK \l _Toc18475 </w:instrText>
+        <w:instrText xml:space="preserve"> HYPERLINK \l _Toc15046 </w:instrText>
       </w:r>
       <w:r>
         <w:fldChar w:fldCharType="separate"/>
@@ -3539,7 +3539,7 @@
         <w:fldChar w:fldCharType="begin"/>
       </w:r>
       <w:r>
-        <w:instrText xml:space="preserve"> PAGEREF _Toc18475 \h </w:instrText>
+        <w:instrText xml:space="preserve"> PAGEREF _Toc15046 \h </w:instrText>
       </w:r>
       <w:r>
         <w:fldChar w:fldCharType="separate"/>
@@ -3565,7 +3565,7 @@
         <w:fldChar w:fldCharType="begin"/>
       </w:r>
       <w:r>
-        <w:instrText xml:space="preserve"> HYPERLINK \l _Toc25646 </w:instrText>
+        <w:instrText xml:space="preserve"> HYPERLINK \l _Toc4352 </w:instrText>
       </w:r>
       <w:r>
         <w:fldChar w:fldCharType="separate"/>
@@ -3580,7 +3580,7 @@
         <w:fldChar w:fldCharType="begin"/>
       </w:r>
       <w:r>
-        <w:instrText xml:space="preserve"> PAGEREF _Toc25646 \h </w:instrText>
+        <w:instrText xml:space="preserve"> PAGEREF _Toc4352 \h </w:instrText>
       </w:r>
       <w:r>
         <w:fldChar w:fldCharType="separate"/>
@@ -3606,7 +3606,7 @@
         <w:fldChar w:fldCharType="begin"/>
       </w:r>
       <w:r>
-        <w:instrText xml:space="preserve"> HYPERLINK \l _Toc31059 </w:instrText>
+        <w:instrText xml:space="preserve"> HYPERLINK \l _Toc20576 </w:instrText>
       </w:r>
       <w:r>
         <w:fldChar w:fldCharType="separate"/>
@@ -3621,7 +3621,7 @@
         <w:fldChar w:fldCharType="begin"/>
       </w:r>
       <w:r>
-        <w:instrText xml:space="preserve"> PAGEREF _Toc31059 \h </w:instrText>
+        <w:instrText xml:space="preserve"> PAGEREF _Toc20576 \h </w:instrText>
       </w:r>
       <w:r>
         <w:fldChar w:fldCharType="separate"/>
@@ -3647,7 +3647,7 @@
         <w:fldChar w:fldCharType="begin"/>
       </w:r>
       <w:r>
-        <w:instrText xml:space="preserve"> HYPERLINK \l _Toc29960 </w:instrText>
+        <w:instrText xml:space="preserve"> HYPERLINK \l _Toc21767 </w:instrText>
       </w:r>
       <w:r>
         <w:fldChar w:fldCharType="separate"/>
@@ -3662,7 +3662,7 @@
         <w:fldChar w:fldCharType="begin"/>
       </w:r>
       <w:r>
-        <w:instrText xml:space="preserve"> PAGEREF _Toc29960 \h </w:instrText>
+        <w:instrText xml:space="preserve"> PAGEREF _Toc21767 \h </w:instrText>
       </w:r>
       <w:r>
         <w:fldChar w:fldCharType="separate"/>
@@ -3688,7 +3688,7 @@
         <w:fldChar w:fldCharType="begin"/>
       </w:r>
       <w:r>
-        <w:instrText xml:space="preserve"> HYPERLINK \l _Toc11367 </w:instrText>
+        <w:instrText xml:space="preserve"> HYPERLINK \l _Toc9195 </w:instrText>
       </w:r>
       <w:r>
         <w:fldChar w:fldCharType="separate"/>
@@ -3703,7 +3703,7 @@
         <w:fldChar w:fldCharType="begin"/>
       </w:r>
       <w:r>
-        <w:instrText xml:space="preserve"> PAGEREF _Toc11367 \h </w:instrText>
+        <w:instrText xml:space="preserve"> PAGEREF _Toc9195 \h </w:instrText>
       </w:r>
       <w:r>
         <w:fldChar w:fldCharType="separate"/>
@@ -3729,7 +3729,7 @@
         <w:fldChar w:fldCharType="begin"/>
       </w:r>
       <w:r>
-        <w:instrText xml:space="preserve"> HYPERLINK \l _Toc13060 </w:instrText>
+        <w:instrText xml:space="preserve"> HYPERLINK \l _Toc28964 </w:instrText>
       </w:r>
       <w:r>
         <w:fldChar w:fldCharType="separate"/>
@@ -3744,7 +3744,7 @@
         <w:fldChar w:fldCharType="begin"/>
       </w:r>
       <w:r>
-        <w:instrText xml:space="preserve"> PAGEREF _Toc13060 \h </w:instrText>
+        <w:instrText xml:space="preserve"> PAGEREF _Toc28964 \h </w:instrText>
       </w:r>
       <w:r>
         <w:fldChar w:fldCharType="separate"/>
@@ -3770,7 +3770,7 @@
         <w:fldChar w:fldCharType="begin"/>
       </w:r>
       <w:r>
-        <w:instrText xml:space="preserve"> HYPERLINK \l _Toc21619 </w:instrText>
+        <w:instrText xml:space="preserve"> HYPERLINK \l _Toc10876 </w:instrText>
       </w:r>
       <w:r>
         <w:fldChar w:fldCharType="separate"/>
@@ -3785,7 +3785,7 @@
         <w:fldChar w:fldCharType="begin"/>
       </w:r>
       <w:r>
-        <w:instrText xml:space="preserve"> PAGEREF _Toc21619 \h </w:instrText>
+        <w:instrText xml:space="preserve"> PAGEREF _Toc10876 \h </w:instrText>
       </w:r>
       <w:r>
         <w:fldChar w:fldCharType="separate"/>
@@ -3811,7 +3811,7 @@
         <w:fldChar w:fldCharType="begin"/>
       </w:r>
       <w:r>
-        <w:instrText xml:space="preserve"> HYPERLINK \l _Toc24062 </w:instrText>
+        <w:instrText xml:space="preserve"> HYPERLINK \l _Toc28505 </w:instrText>
       </w:r>
       <w:r>
         <w:fldChar w:fldCharType="separate"/>
@@ -3826,7 +3826,7 @@
         <w:fldChar w:fldCharType="begin"/>
       </w:r>
       <w:r>
-        <w:instrText xml:space="preserve"> PAGEREF _Toc24062 \h </w:instrText>
+        <w:instrText xml:space="preserve"> PAGEREF _Toc28505 \h </w:instrText>
       </w:r>
       <w:r>
         <w:fldChar w:fldCharType="separate"/>
@@ -3852,7 +3852,7 @@
         <w:fldChar w:fldCharType="begin"/>
       </w:r>
       <w:r>
-        <w:instrText xml:space="preserve"> HYPERLINK \l _Toc3778 </w:instrText>
+        <w:instrText xml:space="preserve"> HYPERLINK \l _Toc4680 </w:instrText>
       </w:r>
       <w:r>
         <w:fldChar w:fldCharType="separate"/>
@@ -3867,7 +3867,7 @@
         <w:fldChar w:fldCharType="begin"/>
       </w:r>
       <w:r>
-        <w:instrText xml:space="preserve"> PAGEREF _Toc3778 \h </w:instrText>
+        <w:instrText xml:space="preserve"> PAGEREF _Toc4680 \h </w:instrText>
       </w:r>
       <w:r>
         <w:fldChar w:fldCharType="separate"/>
@@ -3893,7 +3893,7 @@
         <w:fldChar w:fldCharType="begin"/>
       </w:r>
       <w:r>
-        <w:instrText xml:space="preserve"> HYPERLINK \l _Toc3960 </w:instrText>
+        <w:instrText xml:space="preserve"> HYPERLINK \l _Toc18521 </w:instrText>
       </w:r>
       <w:r>
         <w:fldChar w:fldCharType="separate"/>
@@ -3908,7 +3908,7 @@
         <w:fldChar w:fldCharType="begin"/>
       </w:r>
       <w:r>
-        <w:instrText xml:space="preserve"> PAGEREF _Toc3960 \h </w:instrText>
+        <w:instrText xml:space="preserve"> PAGEREF _Toc18521 \h </w:instrText>
       </w:r>
       <w:r>
         <w:fldChar w:fldCharType="separate"/>
@@ -3934,7 +3934,7 @@
         <w:fldChar w:fldCharType="begin"/>
       </w:r>
       <w:r>
-        <w:instrText xml:space="preserve"> HYPERLINK \l _Toc8900 </w:instrText>
+        <w:instrText xml:space="preserve"> HYPERLINK \l _Toc12093 </w:instrText>
       </w:r>
       <w:r>
         <w:fldChar w:fldCharType="separate"/>
@@ -3949,7 +3949,7 @@
         <w:fldChar w:fldCharType="begin"/>
       </w:r>
       <w:r>
-        <w:instrText xml:space="preserve"> PAGEREF _Toc8900 \h </w:instrText>
+        <w:instrText xml:space="preserve"> PAGEREF _Toc12093 \h </w:instrText>
       </w:r>
       <w:r>
         <w:fldChar w:fldCharType="separate"/>
@@ -3975,7 +3975,7 @@
         <w:fldChar w:fldCharType="begin"/>
       </w:r>
       <w:r>
-        <w:instrText xml:space="preserve"> HYPERLINK \l _Toc32071 </w:instrText>
+        <w:instrText xml:space="preserve"> HYPERLINK \l _Toc28220 </w:instrText>
       </w:r>
       <w:r>
         <w:fldChar w:fldCharType="separate"/>
@@ -3990,7 +3990,7 @@
         <w:fldChar w:fldCharType="begin"/>
       </w:r>
       <w:r>
-        <w:instrText xml:space="preserve"> PAGEREF _Toc32071 \h </w:instrText>
+        <w:instrText xml:space="preserve"> PAGEREF _Toc28220 \h </w:instrText>
       </w:r>
       <w:r>
         <w:fldChar w:fldCharType="separate"/>
@@ -4016,7 +4016,7 @@
         <w:fldChar w:fldCharType="begin"/>
       </w:r>
       <w:r>
-        <w:instrText xml:space="preserve"> HYPERLINK \l _Toc29302 </w:instrText>
+        <w:instrText xml:space="preserve"> HYPERLINK \l _Toc26989 </w:instrText>
       </w:r>
       <w:r>
         <w:fldChar w:fldCharType="separate"/>
@@ -4031,7 +4031,7 @@
         <w:fldChar w:fldCharType="begin"/>
       </w:r>
       <w:r>
-        <w:instrText xml:space="preserve"> PAGEREF _Toc29302 \h </w:instrText>
+        <w:instrText xml:space="preserve"> PAGEREF _Toc26989 \h </w:instrText>
       </w:r>
       <w:r>
         <w:fldChar w:fldCharType="separate"/>
@@ -4057,7 +4057,7 @@
         <w:fldChar w:fldCharType="begin"/>
       </w:r>
       <w:r>
-        <w:instrText xml:space="preserve"> HYPERLINK \l _Toc32496 </w:instrText>
+        <w:instrText xml:space="preserve"> HYPERLINK \l _Toc21948 </w:instrText>
       </w:r>
       <w:r>
         <w:fldChar w:fldCharType="separate"/>
@@ -4072,7 +4072,7 @@
         <w:fldChar w:fldCharType="begin"/>
       </w:r>
       <w:r>
-        <w:instrText xml:space="preserve"> PAGEREF _Toc32496 \h </w:instrText>
+        <w:instrText xml:space="preserve"> PAGEREF _Toc21948 \h </w:instrText>
       </w:r>
       <w:r>
         <w:fldChar w:fldCharType="separate"/>
@@ -4098,7 +4098,7 @@
         <w:fldChar w:fldCharType="begin"/>
       </w:r>
       <w:r>
-        <w:instrText xml:space="preserve"> HYPERLINK \l _Toc26338 </w:instrText>
+        <w:instrText xml:space="preserve"> HYPERLINK \l _Toc9173 </w:instrText>
       </w:r>
       <w:r>
         <w:fldChar w:fldCharType="separate"/>
@@ -4113,7 +4113,7 @@
         <w:fldChar w:fldCharType="begin"/>
       </w:r>
       <w:r>
-        <w:instrText xml:space="preserve"> PAGEREF _Toc26338 \h </w:instrText>
+        <w:instrText xml:space="preserve"> PAGEREF _Toc9173 \h </w:instrText>
       </w:r>
       <w:r>
         <w:fldChar w:fldCharType="separate"/>
@@ -4139,7 +4139,7 @@
         <w:fldChar w:fldCharType="begin"/>
       </w:r>
       <w:r>
-        <w:instrText xml:space="preserve"> HYPERLINK \l _Toc21149 </w:instrText>
+        <w:instrText xml:space="preserve"> HYPERLINK \l _Toc14955 </w:instrText>
       </w:r>
       <w:r>
         <w:fldChar w:fldCharType="separate"/>
@@ -4154,7 +4154,7 @@
         <w:fldChar w:fldCharType="begin"/>
       </w:r>
       <w:r>
-        <w:instrText xml:space="preserve"> PAGEREF _Toc21149 \h </w:instrText>
+        <w:instrText xml:space="preserve"> PAGEREF _Toc14955 \h </w:instrText>
       </w:r>
       <w:r>
         <w:fldChar w:fldCharType="separate"/>
@@ -4180,7 +4180,7 @@
         <w:fldChar w:fldCharType="begin"/>
       </w:r>
       <w:r>
-        <w:instrText xml:space="preserve"> HYPERLINK \l _Toc420 </w:instrText>
+        <w:instrText xml:space="preserve"> HYPERLINK \l _Toc1596 </w:instrText>
       </w:r>
       <w:r>
         <w:fldChar w:fldCharType="separate"/>
@@ -4195,7 +4195,7 @@
         <w:fldChar w:fldCharType="begin"/>
       </w:r>
       <w:r>
-        <w:instrText xml:space="preserve"> PAGEREF _Toc420 \h </w:instrText>
+        <w:instrText xml:space="preserve"> PAGEREF _Toc1596 \h </w:instrText>
       </w:r>
       <w:r>
         <w:fldChar w:fldCharType="separate"/>
@@ -4221,7 +4221,7 @@
         <w:fldChar w:fldCharType="begin"/>
       </w:r>
       <w:r>
-        <w:instrText xml:space="preserve"> HYPERLINK \l _Toc18198 </w:instrText>
+        <w:instrText xml:space="preserve"> HYPERLINK \l _Toc32126 </w:instrText>
       </w:r>
       <w:r>
         <w:fldChar w:fldCharType="separate"/>
@@ -4236,7 +4236,7 @@
         <w:fldChar w:fldCharType="begin"/>
       </w:r>
       <w:r>
-        <w:instrText xml:space="preserve"> PAGEREF _Toc18198 \h </w:instrText>
+        <w:instrText xml:space="preserve"> PAGEREF _Toc32126 \h </w:instrText>
       </w:r>
       <w:r>
         <w:fldChar w:fldCharType="separate"/>
@@ -4262,7 +4262,7 @@
         <w:fldChar w:fldCharType="begin"/>
       </w:r>
       <w:r>
-        <w:instrText xml:space="preserve"> HYPERLINK \l _Toc17309 </w:instrText>
+        <w:instrText xml:space="preserve"> HYPERLINK \l _Toc11080 </w:instrText>
       </w:r>
       <w:r>
         <w:fldChar w:fldCharType="separate"/>
@@ -4277,7 +4277,7 @@
         <w:fldChar w:fldCharType="begin"/>
       </w:r>
       <w:r>
-        <w:instrText xml:space="preserve"> PAGEREF _Toc17309 \h </w:instrText>
+        <w:instrText xml:space="preserve"> PAGEREF _Toc11080 \h </w:instrText>
       </w:r>
       <w:r>
         <w:fldChar w:fldCharType="separate"/>
@@ -4303,7 +4303,7 @@
         <w:fldChar w:fldCharType="begin"/>
       </w:r>
       <w:r>
-        <w:instrText xml:space="preserve"> HYPERLINK \l _Toc23073 </w:instrText>
+        <w:instrText xml:space="preserve"> HYPERLINK \l _Toc15402 </w:instrText>
       </w:r>
       <w:r>
         <w:fldChar w:fldCharType="separate"/>
@@ -4318,7 +4318,7 @@
         <w:fldChar w:fldCharType="begin"/>
       </w:r>
       <w:r>
-        <w:instrText xml:space="preserve"> PAGEREF _Toc23073 \h </w:instrText>
+        <w:instrText xml:space="preserve"> PAGEREF _Toc15402 \h </w:instrText>
       </w:r>
       <w:r>
         <w:fldChar w:fldCharType="separate"/>
@@ -4344,7 +4344,7 @@
         <w:fldChar w:fldCharType="begin"/>
       </w:r>
       <w:r>
-        <w:instrText xml:space="preserve"> HYPERLINK \l _Toc23099 </w:instrText>
+        <w:instrText xml:space="preserve"> HYPERLINK \l _Toc31736 </w:instrText>
       </w:r>
       <w:r>
         <w:fldChar w:fldCharType="separate"/>
@@ -4359,7 +4359,7 @@
         <w:fldChar w:fldCharType="begin"/>
       </w:r>
       <w:r>
-        <w:instrText xml:space="preserve"> PAGEREF _Toc23099 \h </w:instrText>
+        <w:instrText xml:space="preserve"> PAGEREF _Toc31736 \h </w:instrText>
       </w:r>
       <w:r>
         <w:fldChar w:fldCharType="separate"/>
@@ -4385,7 +4385,7 @@
         <w:fldChar w:fldCharType="begin"/>
       </w:r>
       <w:r>
-        <w:instrText xml:space="preserve"> HYPERLINK \l _Toc5934 </w:instrText>
+        <w:instrText xml:space="preserve"> HYPERLINK \l _Toc24992 </w:instrText>
       </w:r>
       <w:r>
         <w:fldChar w:fldCharType="separate"/>
@@ -4400,7 +4400,7 @@
         <w:fldChar w:fldCharType="begin"/>
       </w:r>
       <w:r>
-        <w:instrText xml:space="preserve"> PAGEREF _Toc5934 \h </w:instrText>
+        <w:instrText xml:space="preserve"> PAGEREF _Toc24992 \h </w:instrText>
       </w:r>
       <w:r>
         <w:fldChar w:fldCharType="separate"/>
@@ -4426,7 +4426,7 @@
         <w:fldChar w:fldCharType="begin"/>
       </w:r>
       <w:r>
-        <w:instrText xml:space="preserve"> HYPERLINK \l _Toc20477 </w:instrText>
+        <w:instrText xml:space="preserve"> HYPERLINK \l _Toc3104 </w:instrText>
       </w:r>
       <w:r>
         <w:fldChar w:fldCharType="separate"/>
@@ -4441,7 +4441,7 @@
         <w:fldChar w:fldCharType="begin"/>
       </w:r>
       <w:r>
-        <w:instrText xml:space="preserve"> PAGEREF _Toc20477 \h </w:instrText>
+        <w:instrText xml:space="preserve"> PAGEREF _Toc3104 \h </w:instrText>
       </w:r>
       <w:r>
         <w:fldChar w:fldCharType="separate"/>
@@ -4467,7 +4467,7 @@
         <w:fldChar w:fldCharType="begin"/>
       </w:r>
       <w:r>
-        <w:instrText xml:space="preserve"> HYPERLINK \l _Toc8268 </w:instrText>
+        <w:instrText xml:space="preserve"> HYPERLINK \l _Toc23081 </w:instrText>
       </w:r>
       <w:r>
         <w:fldChar w:fldCharType="separate"/>
@@ -4482,7 +4482,7 @@
         <w:fldChar w:fldCharType="begin"/>
       </w:r>
       <w:r>
-        <w:instrText xml:space="preserve"> PAGEREF _Toc8268 \h </w:instrText>
+        <w:instrText xml:space="preserve"> PAGEREF _Toc23081 \h </w:instrText>
       </w:r>
       <w:r>
         <w:fldChar w:fldCharType="separate"/>
@@ -4508,7 +4508,7 @@
         <w:fldChar w:fldCharType="begin"/>
       </w:r>
       <w:r>
-        <w:instrText xml:space="preserve"> HYPERLINK \l _Toc8732 </w:instrText>
+        <w:instrText xml:space="preserve"> HYPERLINK \l _Toc10143 </w:instrText>
       </w:r>
       <w:r>
         <w:fldChar w:fldCharType="separate"/>
@@ -4523,7 +4523,7 @@
         <w:fldChar w:fldCharType="begin"/>
       </w:r>
       <w:r>
-        <w:instrText xml:space="preserve"> PAGEREF _Toc8732 \h </w:instrText>
+        <w:instrText xml:space="preserve"> PAGEREF _Toc10143 \h </w:instrText>
       </w:r>
       <w:r>
         <w:fldChar w:fldCharType="separate"/>
@@ -4549,7 +4549,7 @@
         <w:fldChar w:fldCharType="begin"/>
       </w:r>
       <w:r>
-        <w:instrText xml:space="preserve"> HYPERLINK \l _Toc23463 </w:instrText>
+        <w:instrText xml:space="preserve"> HYPERLINK \l _Toc30714 </w:instrText>
       </w:r>
       <w:r>
         <w:fldChar w:fldCharType="separate"/>
@@ -4564,7 +4564,7 @@
         <w:fldChar w:fldCharType="begin"/>
       </w:r>
       <w:r>
-        <w:instrText xml:space="preserve"> PAGEREF _Toc23463 \h </w:instrText>
+        <w:instrText xml:space="preserve"> PAGEREF _Toc30714 \h </w:instrText>
       </w:r>
       <w:r>
         <w:fldChar w:fldCharType="separate"/>
@@ -4590,7 +4590,7 @@
         <w:fldChar w:fldCharType="begin"/>
       </w:r>
       <w:r>
-        <w:instrText xml:space="preserve"> HYPERLINK \l _Toc27780 </w:instrText>
+        <w:instrText xml:space="preserve"> HYPERLINK \l _Toc32355 </w:instrText>
       </w:r>
       <w:r>
         <w:fldChar w:fldCharType="separate"/>
@@ -4605,7 +4605,7 @@
         <w:fldChar w:fldCharType="begin"/>
       </w:r>
       <w:r>
-        <w:instrText xml:space="preserve"> PAGEREF _Toc27780 \h </w:instrText>
+        <w:instrText xml:space="preserve"> PAGEREF _Toc32355 \h </w:instrText>
       </w:r>
       <w:r>
         <w:fldChar w:fldCharType="separate"/>
@@ -4631,7 +4631,7 @@
         <w:fldChar w:fldCharType="begin"/>
       </w:r>
       <w:r>
-        <w:instrText xml:space="preserve"> HYPERLINK \l _Toc21031 </w:instrText>
+        <w:instrText xml:space="preserve"> HYPERLINK \l _Toc24492 </w:instrText>
       </w:r>
       <w:r>
         <w:fldChar w:fldCharType="separate"/>
@@ -4646,7 +4646,7 @@
         <w:fldChar w:fldCharType="begin"/>
       </w:r>
       <w:r>
-        <w:instrText xml:space="preserve"> PAGEREF _Toc21031 \h </w:instrText>
+        <w:instrText xml:space="preserve"> PAGEREF _Toc24492 \h </w:instrText>
       </w:r>
       <w:r>
         <w:fldChar w:fldCharType="separate"/>
@@ -4672,7 +4672,7 @@
         <w:fldChar w:fldCharType="begin"/>
       </w:r>
       <w:r>
-        <w:instrText xml:space="preserve"> HYPERLINK \l _Toc9852 </w:instrText>
+        <w:instrText xml:space="preserve"> HYPERLINK \l _Toc3450 </w:instrText>
       </w:r>
       <w:r>
         <w:fldChar w:fldCharType="separate"/>
@@ -4687,7 +4687,7 @@
         <w:fldChar w:fldCharType="begin"/>
       </w:r>
       <w:r>
-        <w:instrText xml:space="preserve"> PAGEREF _Toc9852 \h </w:instrText>
+        <w:instrText xml:space="preserve"> PAGEREF _Toc3450 \h </w:instrText>
       </w:r>
       <w:r>
         <w:fldChar w:fldCharType="separate"/>
@@ -4713,7 +4713,7 @@
         <w:fldChar w:fldCharType="begin"/>
       </w:r>
       <w:r>
-        <w:instrText xml:space="preserve"> HYPERLINK \l _Toc28655 </w:instrText>
+        <w:instrText xml:space="preserve"> HYPERLINK \l _Toc16770 </w:instrText>
       </w:r>
       <w:r>
         <w:fldChar w:fldCharType="separate"/>
@@ -4728,7 +4728,7 @@
         <w:fldChar w:fldCharType="begin"/>
       </w:r>
       <w:r>
-        <w:instrText xml:space="preserve"> PAGEREF _Toc28655 \h </w:instrText>
+        <w:instrText xml:space="preserve"> PAGEREF _Toc16770 \h </w:instrText>
       </w:r>
       <w:r>
         <w:fldChar w:fldCharType="separate"/>
@@ -4754,7 +4754,7 @@
         <w:fldChar w:fldCharType="begin"/>
       </w:r>
       <w:r>
-        <w:instrText xml:space="preserve"> HYPERLINK \l _Toc32178 </w:instrText>
+        <w:instrText xml:space="preserve"> HYPERLINK \l _Toc5570 </w:instrText>
       </w:r>
       <w:r>
         <w:fldChar w:fldCharType="separate"/>
@@ -4769,7 +4769,7 @@
         <w:fldChar w:fldCharType="begin"/>
       </w:r>
       <w:r>
-        <w:instrText xml:space="preserve"> PAGEREF _Toc32178 \h </w:instrText>
+        <w:instrText xml:space="preserve"> PAGEREF _Toc5570 \h </w:instrText>
       </w:r>
       <w:r>
         <w:fldChar w:fldCharType="separate"/>
@@ -4795,7 +4795,7 @@
         <w:fldChar w:fldCharType="begin"/>
       </w:r>
       <w:r>
-        <w:instrText xml:space="preserve"> HYPERLINK \l _Toc7615 </w:instrText>
+        <w:instrText xml:space="preserve"> HYPERLINK \l _Toc3561 </w:instrText>
       </w:r>
       <w:r>
         <w:fldChar w:fldCharType="separate"/>
@@ -4810,7 +4810,7 @@
         <w:fldChar w:fldCharType="begin"/>
       </w:r>
       <w:r>
-        <w:instrText xml:space="preserve"> PAGEREF _Toc7615 \h </w:instrText>
+        <w:instrText xml:space="preserve"> PAGEREF _Toc3561 \h </w:instrText>
       </w:r>
       <w:r>
         <w:fldChar w:fldCharType="separate"/>
@@ -4836,7 +4836,7 @@
         <w:fldChar w:fldCharType="begin"/>
       </w:r>
       <w:r>
-        <w:instrText xml:space="preserve"> HYPERLINK \l _Toc2697 </w:instrText>
+        <w:instrText xml:space="preserve"> HYPERLINK \l _Toc13554 </w:instrText>
       </w:r>
       <w:r>
         <w:fldChar w:fldCharType="separate"/>
@@ -4851,7 +4851,7 @@
         <w:fldChar w:fldCharType="begin"/>
       </w:r>
       <w:r>
-        <w:instrText xml:space="preserve"> PAGEREF _Toc2697 \h </w:instrText>
+        <w:instrText xml:space="preserve"> PAGEREF _Toc13554 \h </w:instrText>
       </w:r>
       <w:r>
         <w:fldChar w:fldCharType="separate"/>
@@ -4877,7 +4877,7 @@
         <w:fldChar w:fldCharType="begin"/>
       </w:r>
       <w:r>
-        <w:instrText xml:space="preserve"> HYPERLINK \l _Toc8844 </w:instrText>
+        <w:instrText xml:space="preserve"> HYPERLINK \l _Toc1739 </w:instrText>
       </w:r>
       <w:r>
         <w:fldChar w:fldCharType="separate"/>
@@ -4892,7 +4892,7 @@
         <w:fldChar w:fldCharType="begin"/>
       </w:r>
       <w:r>
-        <w:instrText xml:space="preserve"> PAGEREF _Toc8844 \h </w:instrText>
+        <w:instrText xml:space="preserve"> PAGEREF _Toc1739 \h </w:instrText>
       </w:r>
       <w:r>
         <w:fldChar w:fldCharType="separate"/>
@@ -4918,7 +4918,7 @@
         <w:fldChar w:fldCharType="begin"/>
       </w:r>
       <w:r>
-        <w:instrText xml:space="preserve"> HYPERLINK \l _Toc12239 </w:instrText>
+        <w:instrText xml:space="preserve"> HYPERLINK \l _Toc7187 </w:instrText>
       </w:r>
       <w:r>
         <w:fldChar w:fldCharType="separate"/>
@@ -4933,7 +4933,7 @@
         <w:fldChar w:fldCharType="begin"/>
       </w:r>
       <w:r>
-        <w:instrText xml:space="preserve"> PAGEREF _Toc12239 \h </w:instrText>
+        <w:instrText xml:space="preserve"> PAGEREF _Toc7187 \h </w:instrText>
       </w:r>
       <w:r>
         <w:fldChar w:fldCharType="separate"/>
@@ -4959,7 +4959,7 @@
         <w:fldChar w:fldCharType="begin"/>
       </w:r>
       <w:r>
-        <w:instrText xml:space="preserve"> HYPERLINK \l _Toc30419 </w:instrText>
+        <w:instrText xml:space="preserve"> HYPERLINK \l _Toc23729 </w:instrText>
       </w:r>
       <w:r>
         <w:fldChar w:fldCharType="separate"/>
@@ -4974,7 +4974,7 @@
         <w:fldChar w:fldCharType="begin"/>
       </w:r>
       <w:r>
-        <w:instrText xml:space="preserve"> PAGEREF _Toc30419 \h </w:instrText>
+        <w:instrText xml:space="preserve"> PAGEREF _Toc23729 \h </w:instrText>
       </w:r>
       <w:r>
         <w:fldChar w:fldCharType="separate"/>
@@ -5000,7 +5000,7 @@
         <w:fldChar w:fldCharType="begin"/>
       </w:r>
       <w:r>
-        <w:instrText xml:space="preserve"> HYPERLINK \l _Toc18768 </w:instrText>
+        <w:instrText xml:space="preserve"> HYPERLINK \l _Toc30373 </w:instrText>
       </w:r>
       <w:r>
         <w:fldChar w:fldCharType="separate"/>
@@ -5015,7 +5015,7 @@
         <w:fldChar w:fldCharType="begin"/>
       </w:r>
       <w:r>
-        <w:instrText xml:space="preserve"> PAGEREF _Toc18768 \h </w:instrText>
+        <w:instrText xml:space="preserve"> PAGEREF _Toc30373 \h </w:instrText>
       </w:r>
       <w:r>
         <w:fldChar w:fldCharType="separate"/>
@@ -5041,7 +5041,7 @@
         <w:fldChar w:fldCharType="begin"/>
       </w:r>
       <w:r>
-        <w:instrText xml:space="preserve"> HYPERLINK \l _Toc16233 </w:instrText>
+        <w:instrText xml:space="preserve"> HYPERLINK \l _Toc15820 </w:instrText>
       </w:r>
       <w:r>
         <w:fldChar w:fldCharType="separate"/>
@@ -5056,7 +5056,7 @@
         <w:fldChar w:fldCharType="begin"/>
       </w:r>
       <w:r>
-        <w:instrText xml:space="preserve"> PAGEREF _Toc16233 \h </w:instrText>
+        <w:instrText xml:space="preserve"> PAGEREF _Toc15820 \h </w:instrText>
       </w:r>
       <w:r>
         <w:fldChar w:fldCharType="separate"/>
@@ -5651,7 +5651,7 @@
         <w:fldChar w:fldCharType="begin"/>
       </w:r>
       <w:r>
-        <w:instrText xml:space="preserve"> HYPERLINK \l _Toc10212 </w:instrText>
+        <w:instrText xml:space="preserve"> HYPERLINK \l _Toc28673 </w:instrText>
       </w:r>
       <w:r>
         <w:fldChar w:fldCharType="separate"/>
@@ -5666,7 +5666,7 @@
         <w:fldChar w:fldCharType="begin"/>
       </w:r>
       <w:r>
-        <w:instrText xml:space="preserve"> PAGEREF _Toc10212 \h </w:instrText>
+        <w:instrText xml:space="preserve"> PAGEREF _Toc28673 \h </w:instrText>
       </w:r>
       <w:r>
         <w:fldChar w:fldCharType="separate"/>
@@ -5692,7 +5692,7 @@
         <w:fldChar w:fldCharType="begin"/>
       </w:r>
       <w:r>
-        <w:instrText xml:space="preserve"> HYPERLINK \l _Toc5073 </w:instrText>
+        <w:instrText xml:space="preserve"> HYPERLINK \l _Toc11859 </w:instrText>
       </w:r>
       <w:r>
         <w:fldChar w:fldCharType="separate"/>
@@ -5707,7 +5707,7 @@
         <w:fldChar w:fldCharType="begin"/>
       </w:r>
       <w:r>
-        <w:instrText xml:space="preserve"> PAGEREF _Toc5073 \h </w:instrText>
+        <w:instrText xml:space="preserve"> PAGEREF _Toc11859 \h </w:instrText>
       </w:r>
       <w:r>
         <w:fldChar w:fldCharType="separate"/>
@@ -5733,7 +5733,7 @@
         <w:fldChar w:fldCharType="begin"/>
       </w:r>
       <w:r>
-        <w:instrText xml:space="preserve"> HYPERLINK \l _Toc3806 </w:instrText>
+        <w:instrText xml:space="preserve"> HYPERLINK \l _Toc28857 </w:instrText>
       </w:r>
       <w:r>
         <w:fldChar w:fldCharType="separate"/>
@@ -5748,7 +5748,7 @@
         <w:fldChar w:fldCharType="begin"/>
       </w:r>
       <w:r>
-        <w:instrText xml:space="preserve"> PAGEREF _Toc3806 \h </w:instrText>
+        <w:instrText xml:space="preserve"> PAGEREF _Toc28857 \h </w:instrText>
       </w:r>
       <w:r>
         <w:fldChar w:fldCharType="separate"/>
@@ -5774,7 +5774,7 @@
         <w:fldChar w:fldCharType="begin"/>
       </w:r>
       <w:r>
-        <w:instrText xml:space="preserve"> HYPERLINK \l _Toc5229 </w:instrText>
+        <w:instrText xml:space="preserve"> HYPERLINK \l _Toc31971 </w:instrText>
       </w:r>
       <w:r>
         <w:fldChar w:fldCharType="separate"/>
@@ -5789,7 +5789,7 @@
         <w:fldChar w:fldCharType="begin"/>
       </w:r>
       <w:r>
-        <w:instrText xml:space="preserve"> PAGEREF _Toc5229 \h </w:instrText>
+        <w:instrText xml:space="preserve"> PAGEREF _Toc31971 \h </w:instrText>
       </w:r>
       <w:r>
         <w:fldChar w:fldCharType="separate"/>
@@ -5815,7 +5815,7 @@
         <w:fldChar w:fldCharType="begin"/>
       </w:r>
       <w:r>
-        <w:instrText xml:space="preserve"> HYPERLINK \l _Toc17931 </w:instrText>
+        <w:instrText xml:space="preserve"> HYPERLINK \l _Toc15362 </w:instrText>
       </w:r>
       <w:r>
         <w:fldChar w:fldCharType="separate"/>
@@ -5830,7 +5830,7 @@
         <w:fldChar w:fldCharType="begin"/>
       </w:r>
       <w:r>
-        <w:instrText xml:space="preserve"> PAGEREF _Toc17931 \h </w:instrText>
+        <w:instrText xml:space="preserve"> PAGEREF _Toc15362 \h </w:instrText>
       </w:r>
       <w:r>
         <w:fldChar w:fldCharType="separate"/>
@@ -5856,7 +5856,7 @@
         <w:fldChar w:fldCharType="begin"/>
       </w:r>
       <w:r>
-        <w:instrText xml:space="preserve"> HYPERLINK \l _Toc14081 </w:instrText>
+        <w:instrText xml:space="preserve"> HYPERLINK \l _Toc31422 </w:instrText>
       </w:r>
       <w:r>
         <w:fldChar w:fldCharType="separate"/>
@@ -5871,7 +5871,7 @@
         <w:fldChar w:fldCharType="begin"/>
       </w:r>
       <w:r>
-        <w:instrText xml:space="preserve"> PAGEREF _Toc14081 \h </w:instrText>
+        <w:instrText xml:space="preserve"> PAGEREF _Toc31422 \h </w:instrText>
       </w:r>
       <w:r>
         <w:fldChar w:fldCharType="separate"/>
@@ -5897,7 +5897,7 @@
         <w:fldChar w:fldCharType="begin"/>
       </w:r>
       <w:r>
-        <w:instrText xml:space="preserve"> HYPERLINK \l _Toc11429 </w:instrText>
+        <w:instrText xml:space="preserve"> HYPERLINK \l _Toc5488 </w:instrText>
       </w:r>
       <w:r>
         <w:fldChar w:fldCharType="separate"/>
@@ -5909,7 +5909,7 @@
         <w:sdtPr>
           <w:alias w:val="MÃ CA TRUY VẾT"/>
           <w:tag w:val="SV_0120"/>
-          <w:id w:val="147459990"/>
+          <w:id w:val="147458372"/>
           <w:text w:multiLine="1"/>
         </w:sdtPr>
         <w:sdtContent>
@@ -5925,7 +5925,7 @@
         <w:fldChar w:fldCharType="begin"/>
       </w:r>
       <w:r>
-        <w:instrText xml:space="preserve"> PAGEREF _Toc11429 \h </w:instrText>
+        <w:instrText xml:space="preserve"> PAGEREF _Toc5488 \h </w:instrText>
       </w:r>
       <w:r>
         <w:fldChar w:fldCharType="separate"/>
@@ -5951,7 +5951,7 @@
         <w:fldChar w:fldCharType="begin"/>
       </w:r>
       <w:r>
-        <w:instrText xml:space="preserve"> HYPERLINK \l _Toc9298 </w:instrText>
+        <w:instrText xml:space="preserve"> HYPERLINK \l _Toc7962 </w:instrText>
       </w:r>
       <w:r>
         <w:fldChar w:fldCharType="separate"/>
@@ -5966,7 +5966,7 @@
         <w:fldChar w:fldCharType="begin"/>
       </w:r>
       <w:r>
-        <w:instrText xml:space="preserve"> PAGEREF _Toc9298 \h </w:instrText>
+        <w:instrText xml:space="preserve"> PAGEREF _Toc7962 \h </w:instrText>
       </w:r>
       <w:r>
         <w:fldChar w:fldCharType="separate"/>
@@ -5992,7 +5992,7 @@
         <w:fldChar w:fldCharType="begin"/>
       </w:r>
       <w:r>
-        <w:instrText xml:space="preserve"> HYPERLINK \l _Toc23784 </w:instrText>
+        <w:instrText xml:space="preserve"> HYPERLINK \l _Toc6538 </w:instrText>
       </w:r>
       <w:r>
         <w:fldChar w:fldCharType="separate"/>
@@ -6007,7 +6007,7 @@
         <w:fldChar w:fldCharType="begin"/>
       </w:r>
       <w:r>
-        <w:instrText xml:space="preserve"> PAGEREF _Toc23784 \h </w:instrText>
+        <w:instrText xml:space="preserve"> PAGEREF _Toc6538 \h </w:instrText>
       </w:r>
       <w:r>
         <w:fldChar w:fldCharType="separate"/>
@@ -6033,7 +6033,7 @@
         <w:fldChar w:fldCharType="begin"/>
       </w:r>
       <w:r>
-        <w:instrText xml:space="preserve"> HYPERLINK \l _Toc6143 </w:instrText>
+        <w:instrText xml:space="preserve"> HYPERLINK \l _Toc13797 </w:instrText>
       </w:r>
       <w:r>
         <w:fldChar w:fldCharType="separate"/>
@@ -6048,7 +6048,7 @@
         <w:fldChar w:fldCharType="begin"/>
       </w:r>
       <w:r>
-        <w:instrText xml:space="preserve"> PAGEREF _Toc6143 \h </w:instrText>
+        <w:instrText xml:space="preserve"> PAGEREF _Toc13797 \h </w:instrText>
       </w:r>
       <w:r>
         <w:fldChar w:fldCharType="separate"/>
@@ -6074,7 +6074,7 @@
         <w:fldChar w:fldCharType="begin"/>
       </w:r>
       <w:r>
-        <w:instrText xml:space="preserve"> HYPERLINK \l _Toc11554 </w:instrText>
+        <w:instrText xml:space="preserve"> HYPERLINK \l _Toc2045 </w:instrText>
       </w:r>
       <w:r>
         <w:fldChar w:fldCharType="separate"/>
@@ -6089,7 +6089,7 @@
         <w:fldChar w:fldCharType="begin"/>
       </w:r>
       <w:r>
-        <w:instrText xml:space="preserve"> PAGEREF _Toc11554 \h </w:instrText>
+        <w:instrText xml:space="preserve"> PAGEREF _Toc2045 \h </w:instrText>
       </w:r>
       <w:r>
         <w:fldChar w:fldCharType="separate"/>
@@ -6115,7 +6115,7 @@
         <w:fldChar w:fldCharType="begin"/>
       </w:r>
       <w:r>
-        <w:instrText xml:space="preserve"> HYPERLINK \l _Toc31669 </w:instrText>
+        <w:instrText xml:space="preserve"> HYPERLINK \l _Toc32168 </w:instrText>
       </w:r>
       <w:r>
         <w:fldChar w:fldCharType="separate"/>
@@ -6130,7 +6130,7 @@
         <w:fldChar w:fldCharType="begin"/>
       </w:r>
       <w:r>
-        <w:instrText xml:space="preserve"> PAGEREF _Toc31669 \h </w:instrText>
+        <w:instrText xml:space="preserve"> PAGEREF _Toc32168 \h </w:instrText>
       </w:r>
       <w:r>
         <w:fldChar w:fldCharType="separate"/>
@@ -6156,7 +6156,7 @@
         <w:fldChar w:fldCharType="begin"/>
       </w:r>
       <w:r>
-        <w:instrText xml:space="preserve"> HYPERLINK \l _Toc632 </w:instrText>
+        <w:instrText xml:space="preserve"> HYPERLINK \l _Toc29823 </w:instrText>
       </w:r>
       <w:r>
         <w:fldChar w:fldCharType="separate"/>
@@ -6171,7 +6171,7 @@
         <w:fldChar w:fldCharType="begin"/>
       </w:r>
       <w:r>
-        <w:instrText xml:space="preserve"> PAGEREF _Toc632 \h </w:instrText>
+        <w:instrText xml:space="preserve"> PAGEREF _Toc29823 \h </w:instrText>
       </w:r>
       <w:r>
         <w:fldChar w:fldCharType="separate"/>
@@ -6197,7 +6197,7 @@
         <w:fldChar w:fldCharType="begin"/>
       </w:r>
       <w:r>
-        <w:instrText xml:space="preserve"> HYPERLINK \l _Toc366 </w:instrText>
+        <w:instrText xml:space="preserve"> HYPERLINK \l _Toc30056 </w:instrText>
       </w:r>
       <w:r>
         <w:fldChar w:fldCharType="separate"/>
@@ -6212,7 +6212,7 @@
         <w:fldChar w:fldCharType="begin"/>
       </w:r>
       <w:r>
-        <w:instrText xml:space="preserve"> PAGEREF _Toc366 \h </w:instrText>
+        <w:instrText xml:space="preserve"> PAGEREF _Toc30056 \h </w:instrText>
       </w:r>
       <w:r>
         <w:fldChar w:fldCharType="separate"/>
@@ -6238,7 +6238,7 @@
         <w:fldChar w:fldCharType="begin"/>
       </w:r>
       <w:r>
-        <w:instrText xml:space="preserve"> HYPERLINK \l _Toc19133 </w:instrText>
+        <w:instrText xml:space="preserve"> HYPERLINK \l _Toc15255 </w:instrText>
       </w:r>
       <w:r>
         <w:fldChar w:fldCharType="separate"/>
@@ -6253,7 +6253,7 @@
         <w:fldChar w:fldCharType="begin"/>
       </w:r>
       <w:r>
-        <w:instrText xml:space="preserve"> PAGEREF _Toc19133 \h </w:instrText>
+        <w:instrText xml:space="preserve"> PAGEREF _Toc15255 \h </w:instrText>
       </w:r>
       <w:r>
         <w:fldChar w:fldCharType="separate"/>
@@ -6327,7 +6327,7 @@
         <w:fldChar w:fldCharType="begin"/>
       </w:r>
       <w:r>
-        <w:instrText xml:space="preserve"> HYPERLINK \l _Toc24073 </w:instrText>
+        <w:instrText xml:space="preserve"> HYPERLINK \l _Toc17132 </w:instrText>
       </w:r>
       <w:r>
         <w:fldChar w:fldCharType="separate"/>
@@ -6339,7 +6339,7 @@
         <w:sdtPr>
           <w:alias w:val="MÃ CA HOẶC ĐỐI TƯỢNG"/>
           <w:tag w:val="SV_0265"/>
-          <w:id w:val="147453962"/>
+          <w:id w:val="147468777"/>
           <w:text w:multiLine="1"/>
         </w:sdtPr>
         <w:sdtContent>
@@ -6355,7 +6355,7 @@
         <w:fldChar w:fldCharType="begin"/>
       </w:r>
       <w:r>
-        <w:instrText xml:space="preserve"> PAGEREF _Toc24073 \h </w:instrText>
+        <w:instrText xml:space="preserve"> PAGEREF _Toc17132 \h </w:instrText>
       </w:r>
       <w:r>
         <w:fldChar w:fldCharType="separate"/>
@@ -6381,7 +6381,7 @@
         <w:fldChar w:fldCharType="begin"/>
       </w:r>
       <w:r>
-        <w:instrText xml:space="preserve"> HYPERLINK \l _Toc30443 </w:instrText>
+        <w:instrText xml:space="preserve"> HYPERLINK \l _Toc6512 </w:instrText>
       </w:r>
       <w:r>
         <w:fldChar w:fldCharType="separate"/>
@@ -6393,7 +6393,7 @@
         <w:sdtPr>
           <w:alias w:val="MÃ CA HOẶC ĐỐI TƯỢNG"/>
           <w:tag w:val="SV_0274"/>
-          <w:id w:val="147472533"/>
+          <w:id w:val="147454839"/>
           <w:text w:multiLine="1"/>
         </w:sdtPr>
         <w:sdtContent>
@@ -6409,7 +6409,7 @@
         <w:fldChar w:fldCharType="begin"/>
       </w:r>
       <w:r>
-        <w:instrText xml:space="preserve"> PAGEREF _Toc30443 \h </w:instrText>
+        <w:instrText xml:space="preserve"> PAGEREF _Toc6512 \h </w:instrText>
       </w:r>
       <w:r>
         <w:fldChar w:fldCharType="separate"/>
@@ -6435,7 +6435,7 @@
         <w:fldChar w:fldCharType="begin"/>
       </w:r>
       <w:r>
-        <w:instrText xml:space="preserve"> HYPERLINK \l _Toc19953 </w:instrText>
+        <w:instrText xml:space="preserve"> HYPERLINK \l _Toc2251 </w:instrText>
       </w:r>
       <w:r>
         <w:fldChar w:fldCharType="separate"/>
@@ -6447,7 +6447,7 @@
         <w:sdtPr>
           <w:alias w:val="MÃ CA HOẶC ĐỐI TƯỢNG"/>
           <w:tag w:val="SV_0278"/>
-          <w:id w:val="147471745"/>
+          <w:id w:val="147482026"/>
           <w:text w:multiLine="1"/>
         </w:sdtPr>
         <w:sdtContent>
@@ -6463,7 +6463,7 @@
         <w:fldChar w:fldCharType="begin"/>
       </w:r>
       <w:r>
-        <w:instrText xml:space="preserve"> PAGEREF _Toc19953 \h </w:instrText>
+        <w:instrText xml:space="preserve"> PAGEREF _Toc2251 \h </w:instrText>
       </w:r>
       <w:r>
         <w:fldChar w:fldCharType="separate"/>
@@ -6489,7 +6489,7 @@
         <w:fldChar w:fldCharType="begin"/>
       </w:r>
       <w:r>
-        <w:instrText xml:space="preserve"> HYPERLINK \l _Toc13073 </w:instrText>
+        <w:instrText xml:space="preserve"> HYPERLINK \l _Toc6516 </w:instrText>
       </w:r>
       <w:r>
         <w:fldChar w:fldCharType="separate"/>
@@ -6501,7 +6501,7 @@
         <w:sdtPr>
           <w:alias w:val="MÃ CA HOẶC ĐỐI TƯỢNG"/>
           <w:tag w:val="SV_0282"/>
-          <w:id w:val="147470115"/>
+          <w:id w:val="147471693"/>
           <w:text w:multiLine="1"/>
         </w:sdtPr>
         <w:sdtContent>
@@ -6517,7 +6517,7 @@
         <w:fldChar w:fldCharType="begin"/>
       </w:r>
       <w:r>
-        <w:instrText xml:space="preserve"> PAGEREF _Toc13073 \h </w:instrText>
+        <w:instrText xml:space="preserve"> PAGEREF _Toc6516 \h </w:instrText>
       </w:r>
       <w:r>
         <w:fldChar w:fldCharType="separate"/>
@@ -6543,7 +6543,7 @@
         <w:fldChar w:fldCharType="begin"/>
       </w:r>
       <w:r>
-        <w:instrText xml:space="preserve"> HYPERLINK \l _Toc6026 </w:instrText>
+        <w:instrText xml:space="preserve"> HYPERLINK \l _Toc25849 </w:instrText>
       </w:r>
       <w:r>
         <w:fldChar w:fldCharType="separate"/>
@@ -6555,7 +6555,7 @@
         <w:sdtPr>
           <w:alias w:val="MÃ CA HOẶC ĐỐI TƯỢNG"/>
           <w:tag w:val="SV_0287"/>
-          <w:id w:val="147479770"/>
+          <w:id w:val="147452739"/>
           <w:text w:multiLine="1"/>
         </w:sdtPr>
         <w:sdtContent>
@@ -6571,7 +6571,7 @@
         <w:fldChar w:fldCharType="begin"/>
       </w:r>
       <w:r>
-        <w:instrText xml:space="preserve"> PAGEREF _Toc6026 \h </w:instrText>
+        <w:instrText xml:space="preserve"> PAGEREF _Toc25849 \h </w:instrText>
       </w:r>
       <w:r>
         <w:fldChar w:fldCharType="separate"/>
@@ -6597,7 +6597,7 @@
         <w:fldChar w:fldCharType="begin"/>
       </w:r>
       <w:r>
-        <w:instrText xml:space="preserve"> HYPERLINK \l _Toc30528 </w:instrText>
+        <w:instrText xml:space="preserve"> HYPERLINK \l _Toc31962 </w:instrText>
       </w:r>
       <w:r>
         <w:fldChar w:fldCharType="separate"/>
@@ -6609,7 +6609,7 @@
         <w:sdtPr>
           <w:alias w:val="MÃ CA HOẶC ĐỐI TƯỢNG"/>
           <w:tag w:val="SV_0291"/>
-          <w:id w:val="147474545"/>
+          <w:id w:val="147479569"/>
           <w:text w:multiLine="1"/>
         </w:sdtPr>
         <w:sdtContent>
@@ -6625,7 +6625,7 @@
         <w:fldChar w:fldCharType="begin"/>
       </w:r>
       <w:r>
-        <w:instrText xml:space="preserve"> PAGEREF _Toc30528 \h </w:instrText>
+        <w:instrText xml:space="preserve"> PAGEREF _Toc31962 \h </w:instrText>
       </w:r>
       <w:r>
         <w:fldChar w:fldCharType="separate"/>
@@ -6651,7 +6651,7 @@
         <w:fldChar w:fldCharType="begin"/>
       </w:r>
       <w:r>
-        <w:instrText xml:space="preserve"> HYPERLINK \l _Toc5804 </w:instrText>
+        <w:instrText xml:space="preserve"> HYPERLINK \l _Toc11542 </w:instrText>
       </w:r>
       <w:r>
         <w:fldChar w:fldCharType="separate"/>
@@ -6663,7 +6663,7 @@
         <w:sdtPr>
           <w:alias w:val="MÃ CA HOẶC ĐỐI TƯỢNG"/>
           <w:tag w:val="SV_0296"/>
-          <w:id w:val="147452360"/>
+          <w:id w:val="147455399"/>
           <w:text w:multiLine="1"/>
         </w:sdtPr>
         <w:sdtContent>
@@ -6679,7 +6679,7 @@
         <w:fldChar w:fldCharType="begin"/>
       </w:r>
       <w:r>
-        <w:instrText xml:space="preserve"> PAGEREF _Toc5804 \h </w:instrText>
+        <w:instrText xml:space="preserve"> PAGEREF _Toc11542 \h </w:instrText>
       </w:r>
       <w:r>
         <w:fldChar w:fldCharType="separate"/>
@@ -6705,7 +6705,7 @@
         <w:fldChar w:fldCharType="begin"/>
       </w:r>
       <w:r>
-        <w:instrText xml:space="preserve"> HYPERLINK \l _Toc2798 </w:instrText>
+        <w:instrText xml:space="preserve"> HYPERLINK \l _Toc16179 </w:instrText>
       </w:r>
       <w:r>
         <w:fldChar w:fldCharType="separate"/>
@@ -6717,7 +6717,7 @@
         <w:sdtPr>
           <w:alias w:val="MÃ CA HOẶC ĐỐI TƯỢNG"/>
           <w:tag w:val="SV_0300"/>
-          <w:id w:val="147483266"/>
+          <w:id w:val="147476661"/>
           <w:text w:multiLine="1"/>
         </w:sdtPr>
         <w:sdtContent>
@@ -6733,7 +6733,7 @@
         <w:fldChar w:fldCharType="begin"/>
       </w:r>
       <w:r>
-        <w:instrText xml:space="preserve"> PAGEREF _Toc2798 \h </w:instrText>
+        <w:instrText xml:space="preserve"> PAGEREF _Toc16179 \h </w:instrText>
       </w:r>
       <w:r>
         <w:fldChar w:fldCharType="separate"/>
@@ -6759,7 +6759,7 @@
         <w:fldChar w:fldCharType="begin"/>
       </w:r>
       <w:r>
-        <w:instrText xml:space="preserve"> HYPERLINK \l _Toc19461 </w:instrText>
+        <w:instrText xml:space="preserve"> HYPERLINK \l _Toc16667 </w:instrText>
       </w:r>
       <w:r>
         <w:fldChar w:fldCharType="separate"/>
@@ -6771,7 +6771,7 @@
         <w:sdtPr>
           <w:alias w:val="MÃ CA HOẶC ĐỐI TƯỢNG"/>
           <w:tag w:val="SV_0304"/>
-          <w:id w:val="147470056"/>
+          <w:id w:val="147459248"/>
           <w:text w:multiLine="1"/>
         </w:sdtPr>
         <w:sdtContent>
@@ -6787,7 +6787,7 @@
         <w:fldChar w:fldCharType="begin"/>
       </w:r>
       <w:r>
-        <w:instrText xml:space="preserve"> PAGEREF _Toc19461 \h </w:instrText>
+        <w:instrText xml:space="preserve"> PAGEREF _Toc16667 \h </w:instrText>
       </w:r>
       <w:r>
         <w:fldChar w:fldCharType="separate"/>
@@ -6813,7 +6813,7 @@
         <w:fldChar w:fldCharType="begin"/>
       </w:r>
       <w:r>
-        <w:instrText xml:space="preserve"> HYPERLINK \l _Toc11994 </w:instrText>
+        <w:instrText xml:space="preserve"> HYPERLINK \l _Toc28825 </w:instrText>
       </w:r>
       <w:r>
         <w:fldChar w:fldCharType="separate"/>
@@ -6825,7 +6825,7 @@
         <w:sdtPr>
           <w:alias w:val="MÃ CA HOẶC ĐỐI TƯỢNG"/>
           <w:tag w:val="SV_0329"/>
-          <w:id w:val="147468172"/>
+          <w:id w:val="147481499"/>
           <w:text w:multiLine="1"/>
         </w:sdtPr>
         <w:sdtContent>
@@ -6841,7 +6841,7 @@
         <w:fldChar w:fldCharType="begin"/>
       </w:r>
       <w:r>
-        <w:instrText xml:space="preserve"> PAGEREF _Toc11994 \h </w:instrText>
+        <w:instrText xml:space="preserve"> PAGEREF _Toc28825 \h </w:instrText>
       </w:r>
       <w:r>
         <w:fldChar w:fldCharType="separate"/>
@@ -6867,7 +6867,7 @@
         <w:fldChar w:fldCharType="begin"/>
       </w:r>
       <w:r>
-        <w:instrText xml:space="preserve"> HYPERLINK \l _Toc21753 </w:instrText>
+        <w:instrText xml:space="preserve"> HYPERLINK \l _Toc26803 </w:instrText>
       </w:r>
       <w:r>
         <w:fldChar w:fldCharType="separate"/>
@@ -6879,7 +6879,7 @@
         <w:sdtPr>
           <w:alias w:val="MÃ CA HOẶC ĐỐI TƯỢNG"/>
           <w:tag w:val="SV_0332"/>
-          <w:id w:val="147482476"/>
+          <w:id w:val="147455828"/>
           <w:text w:multiLine="1"/>
         </w:sdtPr>
         <w:sdtContent>
@@ -6895,7 +6895,7 @@
         <w:fldChar w:fldCharType="begin"/>
       </w:r>
       <w:r>
-        <w:instrText xml:space="preserve"> PAGEREF _Toc21753 \h </w:instrText>
+        <w:instrText xml:space="preserve"> PAGEREF _Toc26803 \h </w:instrText>
       </w:r>
       <w:r>
         <w:fldChar w:fldCharType="separate"/>
@@ -6933,7 +6933,7 @@
         <w:keepNext w:val="0"/>
         <w:spacing w:before="0" w:after="320"/>
       </w:pPr>
-      <w:bookmarkStart w:id="7" w:name="_Toc25646"/>
+      <w:bookmarkStart w:id="7" w:name="_Toc4352"/>
       <w:r>
         <w:t>CHƯƠNG 1. TỔNG QUAN ĐỀ TÀI</w:t>
       </w:r>
@@ -6943,7 +6943,7 @@
       <w:pPr>
         <w:pStyle w:val="3"/>
       </w:pPr>
-      <w:bookmarkStart w:id="8" w:name="_Toc31059"/>
+      <w:bookmarkStart w:id="8" w:name="_Toc20576"/>
       <w:r>
         <w:t>1.1. Bài toán và lý do thực hiện</w:t>
       </w:r>
@@ -7030,7 +7030,7 @@
       <w:pPr>
         <w:pStyle w:val="3"/>
       </w:pPr>
-      <w:bookmarkStart w:id="9" w:name="_Toc29960"/>
+      <w:bookmarkStart w:id="9" w:name="_Toc21767"/>
       <w:r>
         <w:t>1.2. Mục tiêu và sản phẩm</w:t>
       </w:r>
@@ -7153,7 +7153,7 @@
       <w:pPr>
         <w:pStyle w:val="3"/>
       </w:pPr>
-      <w:bookmarkStart w:id="10" w:name="_Toc11367"/>
+      <w:bookmarkStart w:id="10" w:name="_Toc9195"/>
       <w:r>
         <w:t>1.3. Phạm vi, đầu vào và đầu ra</w:t>
       </w:r>
@@ -7389,7 +7389,7 @@
         <w:spacing w:before="0" w:after="100" w:line="269" w:lineRule="auto"/>
         <w:jc w:val="left"/>
       </w:pPr>
-      <w:bookmarkStart w:id="11" w:name="_Toc10212"/>
+      <w:bookmarkStart w:id="11" w:name="_Toc28673"/>
       <w:r>
         <w:t>Bảng 1.1 Đặc tả dữ liệu vào</w:t>
       </w:r>
@@ -7830,7 +7830,7 @@
         <w:spacing w:before="0" w:after="100" w:line="269" w:lineRule="auto"/>
         <w:jc w:val="left"/>
       </w:pPr>
-      <w:bookmarkStart w:id="12" w:name="_Toc5073"/>
+      <w:bookmarkStart w:id="12" w:name="_Toc11859"/>
       <w:r>
         <w:t>Bảng 1.2 Đặc tả kết quả đầu ra</w:t>
       </w:r>
@@ -8182,7 +8182,7 @@
       <w:pPr>
         <w:pStyle w:val="3"/>
       </w:pPr>
-      <w:bookmarkStart w:id="13" w:name="_Toc13060"/>
+      <w:bookmarkStart w:id="13" w:name="_Toc28964"/>
       <w:r>
         <w:t>1.4. Cách thực hiện và cấu trúc báo cáo</w:t>
       </w:r>
@@ -8342,7 +8342,7 @@
         <w:pStyle w:val="174"/>
         <w:spacing w:before="80" w:after="100" w:line="269" w:lineRule="auto"/>
       </w:pPr>
-      <w:bookmarkStart w:id="14" w:name="_Toc3806"/>
+      <w:bookmarkStart w:id="14" w:name="_Toc28857"/>
       <w:r>
         <w:t>Bảng 1.3 Đối chiếu yêu cầu và sản phẩm</w:t>
       </w:r>
@@ -9011,7 +9011,7 @@
         <w:keepNext w:val="0"/>
         <w:spacing w:before="0" w:after="320"/>
       </w:pPr>
-      <w:bookmarkStart w:id="15" w:name="_Toc21619"/>
+      <w:bookmarkStart w:id="15" w:name="_Toc10876"/>
       <w:r>
         <w:t>CHƯƠNG 2. CƠ SỞ LÝ THUYẾT</w:t>
       </w:r>
@@ -9021,7 +9021,7 @@
       <w:pPr>
         <w:pStyle w:val="3"/>
       </w:pPr>
-      <w:bookmarkStart w:id="16" w:name="_Toc24062"/>
+      <w:bookmarkStart w:id="16" w:name="_Toc28505"/>
       <w:r>
         <w:t>2.1. Khái niệm và mô hình dữ liệu</w:t>
       </w:r>
@@ -9153,7 +9153,7 @@
       <w:pPr>
         <w:pStyle w:val="3"/>
       </w:pPr>
-      <w:bookmarkStart w:id="17" w:name="_Toc3778"/>
+      <w:bookmarkStart w:id="17" w:name="_Toc4680"/>
       <w:r>
         <w:t>2.2. Cấu trúc dữ liệu sử dụng</w:t>
       </w:r>
@@ -9406,7 +9406,7 @@
         <w:pStyle w:val="174"/>
         <w:spacing w:before="80" w:after="100" w:line="269" w:lineRule="auto"/>
       </w:pPr>
-      <w:bookmarkStart w:id="18" w:name="_Toc5229"/>
+      <w:bookmarkStart w:id="18" w:name="_Toc31971"/>
       <w:r>
         <w:t>Bảng 2.1 Biến cấu trúc và điều kiện phải duy trì</w:t>
       </w:r>
@@ -9821,7 +9821,7 @@
       <w:pPr>
         <w:pStyle w:val="3"/>
       </w:pPr>
-      <w:bookmarkStart w:id="19" w:name="_Toc3960"/>
+      <w:bookmarkStart w:id="19" w:name="_Toc18521"/>
       <w:r>
         <w:t>2.3. Nguyên lý thuật toán</w:t>
       </w:r>
@@ -10055,7 +10055,7 @@
       <w:pPr>
         <w:pStyle w:val="3"/>
       </w:pPr>
-      <w:bookmarkStart w:id="20" w:name="_Toc8900"/>
+      <w:bookmarkStart w:id="20" w:name="_Toc12093"/>
       <w:r>
         <w:t>2.4. Cơ sở đánh giá thời gian và bộ nhớ</w:t>
       </w:r>
@@ -10236,7 +10236,7 @@
         <w:keepNext w:val="0"/>
         <w:spacing w:before="0" w:after="320"/>
       </w:pPr>
-      <w:bookmarkStart w:id="21" w:name="_Toc32071"/>
+      <w:bookmarkStart w:id="21" w:name="_Toc28220"/>
       <w:r>
         <w:t>CHƯƠNG 3. PHÂN TÍCH, THIẾT KẾ VÀ CÀI ĐẶT</w:t>
       </w:r>
@@ -10246,7 +10246,7 @@
       <w:pPr>
         <w:pStyle w:val="3"/>
       </w:pPr>
-      <w:bookmarkStart w:id="22" w:name="_Toc29302"/>
+      <w:bookmarkStart w:id="22" w:name="_Toc26989"/>
       <w:r>
         <w:t>3.1. Phân tích yêu cầu chương trình</w:t>
       </w:r>
@@ -10462,7 +10462,7 @@
       <w:pPr>
         <w:pStyle w:val="3"/>
       </w:pPr>
-      <w:bookmarkStart w:id="23" w:name="_Toc32496"/>
+      <w:bookmarkStart w:id="23" w:name="_Toc21948"/>
       <w:r>
         <w:t>3.2. Thiết kế các hàm và dữ liệu</w:t>
       </w:r>
@@ -10514,7 +10514,7 @@
         <w:pStyle w:val="174"/>
         <w:spacing w:before="80" w:after="100" w:line="269" w:lineRule="auto"/>
       </w:pPr>
-      <w:bookmarkStart w:id="24" w:name="_Toc17931"/>
+      <w:bookmarkStart w:id="24" w:name="_Toc15362"/>
       <w:r>
         <w:t>Bảng 3.1 Tổ chức các hàm và tệp</w:t>
       </w:r>
@@ -11205,7 +11205,7 @@
         <w:spacing w:before="0" w:after="100" w:line="269" w:lineRule="auto"/>
         <w:jc w:val="left"/>
       </w:pPr>
-      <w:bookmarkStart w:id="25" w:name="_Toc14081"/>
+      <w:bookmarkStart w:id="25" w:name="_Toc31422"/>
       <w:r>
         <w:t>Bảng 3.2 Tiền điều kiện và hậu điều kiện của các hàm</w:t>
       </w:r>
@@ -11846,7 +11846,7 @@
       <w:pPr>
         <w:pStyle w:val="3"/>
       </w:pPr>
-      <w:bookmarkStart w:id="26" w:name="_Toc26338"/>
+      <w:bookmarkStart w:id="26" w:name="_Toc9173"/>
       <w:r>
         <w:t>3.3. Thuật toán và mã nguồn chính</w:t>
       </w:r>
@@ -12752,7 +12752,7 @@
       <w:pPr>
         <w:pStyle w:val="3"/>
       </w:pPr>
-      <w:bookmarkStart w:id="27" w:name="_Toc21149"/>
+      <w:bookmarkStart w:id="27" w:name="_Toc14955"/>
       <w:r>
         <w:t>3.4. Lần vết ví dụ nhỏ</w:t>
       </w:r>
@@ -12869,7 +12869,7 @@
         <w:pStyle w:val="174"/>
         <w:spacing w:before="80" w:after="100" w:line="269" w:lineRule="auto"/>
       </w:pPr>
-      <w:bookmarkStart w:id="28" w:name="_Toc11429"/>
+      <w:bookmarkStart w:id="28" w:name="_Toc5488"/>
       <w:r>
         <w:t xml:space="preserve">Bảng 3.3 Truy vết ca </w:t>
       </w:r>
@@ -13547,7 +13547,7 @@
       <w:pPr>
         <w:pStyle w:val="3"/>
       </w:pPr>
-      <w:bookmarkStart w:id="29" w:name="_Toc420"/>
+      <w:bookmarkStart w:id="29" w:name="_Toc1596"/>
       <w:r>
         <w:t>3.5. Giải thích tính đúng và điều kiện dừng</w:t>
       </w:r>
@@ -13727,7 +13727,7 @@
       <w:pPr>
         <w:pStyle w:val="3"/>
       </w:pPr>
-      <w:bookmarkStart w:id="30" w:name="_Toc18198"/>
+      <w:bookmarkStart w:id="30" w:name="_Toc32126"/>
       <w:r>
         <w:t>3.6. Phân tích độ phức tạp</w:t>
       </w:r>
@@ -13788,7 +13788,7 @@
         <w:spacing w:before="0" w:after="100" w:line="269" w:lineRule="auto"/>
         <w:jc w:val="left"/>
       </w:pPr>
-      <w:bookmarkStart w:id="31" w:name="_Toc9298"/>
+      <w:bookmarkStart w:id="31" w:name="_Toc7962"/>
       <w:r>
         <w:t>Bảng 3.4 Chi phí của từng pha trong bản cài</w:t>
       </w:r>
@@ -14678,7 +14678,7 @@
         <w:keepNext w:val="0"/>
         <w:spacing w:before="0" w:after="320"/>
       </w:pPr>
-      <w:bookmarkStart w:id="32" w:name="_Toc17309"/>
+      <w:bookmarkStart w:id="32" w:name="_Toc11080"/>
       <w:r>
         <w:t>CHƯƠNG 4. KẾT QUẢ THỬ NGHIỆM VÀ NHẬN XÉT</w:t>
       </w:r>
@@ -14688,7 +14688,7 @@
       <w:pPr>
         <w:pStyle w:val="3"/>
       </w:pPr>
-      <w:bookmarkStart w:id="33" w:name="_Toc23073"/>
+      <w:bookmarkStart w:id="33" w:name="_Toc15402"/>
       <w:r>
         <w:t>4.1. Môi trường và kế hoạch kiểm thử</w:t>
       </w:r>
@@ -14904,7 +14904,7 @@
       <w:pPr>
         <w:pStyle w:val="3"/>
       </w:pPr>
-      <w:bookmarkStart w:id="34" w:name="_Toc23099"/>
+      <w:bookmarkStart w:id="34" w:name="_Toc31736"/>
       <w:r>
         <w:t>4.2. Bảng kết quả ít nhất 12 ca</w:t>
       </w:r>
@@ -14980,7 +14980,7 @@
         <w:spacing w:before="0" w:after="100" w:line="269" w:lineRule="auto"/>
         <w:jc w:val="left"/>
       </w:pPr>
-      <w:bookmarkStart w:id="35" w:name="_Toc23784"/>
+      <w:bookmarkStart w:id="35" w:name="_Toc6538"/>
       <w:r>
         <w:t>Bảng 4.1 Ánh xạ năm ca kiểm trên phiếu</w:t>
       </w:r>
@@ -15650,7 +15650,7 @@
         <w:pStyle w:val="174"/>
         <w:spacing w:before="80" w:after="100" w:line="269" w:lineRule="auto"/>
       </w:pPr>
-      <w:bookmarkStart w:id="36" w:name="_Toc6143"/>
+      <w:bookmarkStart w:id="36" w:name="_Toc13797"/>
       <w:r>
         <w:t>Bảng 4.2 Thiết kế ít nhất 12 ca kiểm độc lập</w:t>
       </w:r>
@@ -15693,6 +15693,12 @@
             <w:insideH w:val="single" w:color="D9D9D9" w:sz="4" w:space="0"/>
             <w:insideV w:val="single" w:color="D9D9D9" w:sz="4" w:space="0"/>
           </w:tblBorders>
+          <w:tblCellMar>
+            <w:top w:w="70" w:type="dxa"/>
+            <w:left w:w="70" w:type="dxa"/>
+            <w:bottom w:w="70" w:type="dxa"/>
+            <w:right w:w="70" w:type="dxa"/>
+          </w:tblCellMar>
         </w:tblPrEx>
         <w:trPr>
           <w:cantSplit/>
@@ -17003,7 +17009,7 @@
         <w:pageBreakBefore/>
         <w:spacing w:before="80" w:after="100" w:line="269" w:lineRule="auto"/>
       </w:pPr>
-      <w:bookmarkStart w:id="37" w:name="_Toc11554"/>
+      <w:bookmarkStart w:id="37" w:name="_Toc2045"/>
       <w:r>
         <w:t>Bảng 4.3 Actual kết luận và vị trí minh chứng</w:t>
       </w:r>
@@ -17046,6 +17052,12 @@
             <w:insideH w:val="single" w:color="D9D9D9" w:sz="4" w:space="0"/>
             <w:insideV w:val="single" w:color="D9D9D9" w:sz="4" w:space="0"/>
           </w:tblBorders>
+          <w:tblCellMar>
+            <w:top w:w="70" w:type="dxa"/>
+            <w:left w:w="70" w:type="dxa"/>
+            <w:bottom w:w="70" w:type="dxa"/>
+            <w:right w:w="70" w:type="dxa"/>
+          </w:tblCellMar>
         </w:tblPrEx>
         <w:trPr>
           <w:cantSplit/>
@@ -18358,7 +18370,7 @@
         <w:ind w:firstLine="0"/>
         <w:jc w:val="center"/>
       </w:pPr>
-      <w:bookmarkStart w:id="38" w:name="_Toc5934"/>
+      <w:bookmarkStart w:id="38" w:name="_Toc24992"/>
       <w:r>
         <w:t>4.3. Hai ví dụ trên phiếu</w:t>
       </w:r>
@@ -18531,7 +18543,7 @@
         <w:pStyle w:val="175"/>
         <w:spacing w:before="80" w:after="100" w:line="269" w:lineRule="auto"/>
       </w:pPr>
-      <w:bookmarkStart w:id="39" w:name="_Toc24073"/>
+      <w:bookmarkStart w:id="39" w:name="_Toc17132"/>
       <w:r>
         <w:t xml:space="preserve">Hình 4.1 Ví dụ 1 </w:t>
       </w:r>
@@ -18755,7 +18767,7 @@
         <w:pStyle w:val="175"/>
         <w:spacing w:before="80" w:after="100" w:line="269" w:lineRule="auto"/>
       </w:pPr>
-      <w:bookmarkStart w:id="40" w:name="_Toc30443"/>
+      <w:bookmarkStart w:id="40" w:name="_Toc6512"/>
       <w:r>
         <w:t xml:space="preserve">Hình 4.2 Ví dụ 2 </w:t>
       </w:r>
@@ -18806,7 +18818,7 @@
         <w:ind w:firstLine="0"/>
         <w:jc w:val="center"/>
       </w:pPr>
-      <w:bookmarkStart w:id="41" w:name="_Toc20477"/>
+      <w:bookmarkStart w:id="41" w:name="_Toc3104"/>
       <w:r>
         <w:t>4.4. Hai ca sinh viên tự thiết kế</w:t>
       </w:r>
@@ -18979,7 +18991,7 @@
         <w:pStyle w:val="175"/>
         <w:spacing w:before="80" w:after="100" w:line="269" w:lineRule="auto"/>
       </w:pPr>
-      <w:bookmarkStart w:id="42" w:name="_Toc19953"/>
+      <w:bookmarkStart w:id="42" w:name="_Toc2251"/>
       <w:r>
         <w:t xml:space="preserve">Hình 4.3 Ca tự thiết kế 1 </w:t>
       </w:r>
@@ -19189,7 +19201,7 @@
         <w:pStyle w:val="175"/>
         <w:spacing w:before="80" w:after="100" w:line="269" w:lineRule="auto"/>
       </w:pPr>
-      <w:bookmarkStart w:id="43" w:name="_Toc13073"/>
+      <w:bookmarkStart w:id="43" w:name="_Toc6516"/>
       <w:r>
         <w:t xml:space="preserve">Hình 4.4 Ca tự thiết kế 2 </w:t>
       </w:r>
@@ -19240,7 +19252,7 @@
         <w:ind w:firstLine="0"/>
         <w:jc w:val="center"/>
       </w:pPr>
-      <w:bookmarkStart w:id="44" w:name="_Toc8268"/>
+      <w:bookmarkStart w:id="44" w:name="_Toc23081"/>
       <w:r>
         <w:t>4.5. Ba ca biên phù hợp với đề tài</w:t>
       </w:r>
@@ -19445,7 +19457,7 @@
         <w:pStyle w:val="175"/>
         <w:spacing w:before="80" w:after="100" w:line="269" w:lineRule="auto"/>
       </w:pPr>
-      <w:bookmarkStart w:id="45" w:name="_Toc6026"/>
+      <w:bookmarkStart w:id="45" w:name="_Toc25849"/>
       <w:r>
         <w:t xml:space="preserve">Hình 4.5 Biên 1 </w:t>
       </w:r>
@@ -19655,7 +19667,7 @@
         <w:pStyle w:val="175"/>
         <w:spacing w:before="80" w:after="100" w:line="269" w:lineRule="auto"/>
       </w:pPr>
-      <w:bookmarkStart w:id="46" w:name="_Toc30528"/>
+      <w:bookmarkStart w:id="46" w:name="_Toc31962"/>
       <w:r>
         <w:t xml:space="preserve">Hình 4.6 Biên 2 </w:t>
       </w:r>
@@ -19897,7 +19909,7 @@
         <w:pStyle w:val="175"/>
         <w:spacing w:before="80" w:after="100" w:line="269" w:lineRule="auto"/>
       </w:pPr>
-      <w:bookmarkStart w:id="47" w:name="_Toc5804"/>
+      <w:bookmarkStart w:id="47" w:name="_Toc11542"/>
       <w:r>
         <w:t xml:space="preserve">Hình 4.7 Biên 3 </w:t>
       </w:r>
@@ -19944,7 +19956,7 @@
       <w:pPr>
         <w:pStyle w:val="3"/>
       </w:pPr>
-      <w:bookmarkStart w:id="48" w:name="_Toc8732"/>
+      <w:bookmarkStart w:id="48" w:name="_Toc10143"/>
       <w:r>
         <w:t>4.6. Kiểm tra input không hợp lệ — LOI01</w:t>
       </w:r>
@@ -20109,7 +20121,7 @@
         <w:pStyle w:val="175"/>
         <w:spacing w:before="80" w:after="100" w:line="269" w:lineRule="auto"/>
       </w:pPr>
-      <w:bookmarkStart w:id="49" w:name="_Toc2798"/>
+      <w:bookmarkStart w:id="49" w:name="_Toc16179"/>
       <w:r>
         <w:t xml:space="preserve">Hình 4.8 Input không hợp lệ </w:t>
       </w:r>
@@ -20156,7 +20168,7 @@
       <w:pPr>
         <w:pStyle w:val="3"/>
       </w:pPr>
-      <w:bookmarkStart w:id="50" w:name="_Toc23463"/>
+      <w:bookmarkStart w:id="50" w:name="_Toc30714"/>
       <w:r>
         <w:t>4.7. Kết quả toàn bộ kiểm thử</w:t>
       </w:r>
@@ -20393,7 +20405,7 @@
         <w:pStyle w:val="175"/>
         <w:spacing w:before="80" w:after="100" w:line="269" w:lineRule="auto"/>
       </w:pPr>
-      <w:bookmarkStart w:id="51" w:name="_Toc19461"/>
+      <w:bookmarkStart w:id="51" w:name="_Toc16667"/>
       <w:r>
         <w:t xml:space="preserve">Hình 4.9 Tổng kết kiểm thử </w:t>
       </w:r>
@@ -20440,7 +20452,7 @@
       <w:pPr>
         <w:pStyle w:val="3"/>
       </w:pPr>
-      <w:bookmarkStart w:id="52" w:name="_Toc27780"/>
+      <w:bookmarkStart w:id="52" w:name="_Toc32355"/>
       <w:r>
         <w:t>4.8. Khảo sát ba quy mô hoặc ba cấu hình hợp lệ</w:t>
       </w:r>
@@ -20702,7 +20714,7 @@
         <w:spacing w:before="0" w:after="100" w:line="269" w:lineRule="auto"/>
         <w:jc w:val="left"/>
       </w:pPr>
-      <w:bookmarkStart w:id="53" w:name="_Toc31669"/>
+      <w:bookmarkStart w:id="53" w:name="_Toc32168"/>
       <w:r>
         <w:t>Bảng 4.4 Khảo sát Q1 Q2 Q3</w:t>
       </w:r>
@@ -21268,7 +21280,7 @@
         <w:ind w:firstLine="0"/>
         <w:jc w:val="center"/>
       </w:pPr>
-      <w:bookmarkStart w:id="54" w:name="_Toc21031"/>
+      <w:bookmarkStart w:id="54" w:name="_Toc24492"/>
       <w:r>
         <w:t>4.9. GitHub và chạy lại từ bản clone sạch</w:t>
       </w:r>
@@ -21328,7 +21340,7 @@
         <w:pStyle w:val="174"/>
         <w:spacing w:before="80" w:after="100" w:line="269" w:lineRule="auto"/>
       </w:pPr>
-      <w:bookmarkStart w:id="55" w:name="_Toc632"/>
+      <w:bookmarkStart w:id="55" w:name="_Toc29823"/>
       <w:r>
         <w:t>Bảng 4.5 Kho mã và phiên bản có thể kiểm lại</w:t>
       </w:r>
@@ -21959,7 +21971,7 @@
         <w:pStyle w:val="175"/>
         <w:spacing w:before="80" w:after="100" w:line="269" w:lineRule="auto"/>
       </w:pPr>
-      <w:bookmarkStart w:id="56" w:name="_Toc11994"/>
+      <w:bookmarkStart w:id="56" w:name="_Toc28825"/>
       <w:r>
         <w:t xml:space="preserve">Hình 4.10 Clone sạch và chạy lại </w:t>
       </w:r>
@@ -22112,7 +22124,7 @@
         <w:pStyle w:val="175"/>
         <w:spacing w:before="80" w:after="100" w:line="269" w:lineRule="auto"/>
       </w:pPr>
-      <w:bookmarkStart w:id="57" w:name="_Toc21753"/>
+      <w:bookmarkStart w:id="57" w:name="_Toc26803"/>
       <w:r>
         <w:t xml:space="preserve">Hình 4.11 GitHub repo và commit </w:t>
       </w:r>
@@ -22161,7 +22173,7 @@
         <w:keepNext w:val="0"/>
         <w:spacing w:before="0" w:after="320"/>
       </w:pPr>
-      <w:bookmarkStart w:id="58" w:name="_Toc9852"/>
+      <w:bookmarkStart w:id="58" w:name="_Toc3450"/>
       <w:r>
         <w:t>CHƯƠNG 5. KẾT LUẬN VÀ HƯỚNG PHÁT TRIỂN</w:t>
       </w:r>
@@ -22171,7 +22183,7 @@
       <w:pPr>
         <w:pStyle w:val="3"/>
       </w:pPr>
-      <w:bookmarkStart w:id="59" w:name="_Toc28655"/>
+      <w:bookmarkStart w:id="59" w:name="_Toc16770"/>
       <w:r>
         <w:t>5.1. Mức hoàn thành so với phiếu</w:t>
       </w:r>
@@ -22222,7 +22234,7 @@
       <w:pPr>
         <w:pStyle w:val="3"/>
       </w:pPr>
-      <w:bookmarkStart w:id="60" w:name="_Toc32178"/>
+      <w:bookmarkStart w:id="60" w:name="_Toc5570"/>
       <w:r>
         <w:t>5.2. Giới hạn và bài học</w:t>
       </w:r>
@@ -22291,7 +22303,7 @@
       <w:pPr>
         <w:pStyle w:val="3"/>
       </w:pPr>
-      <w:bookmarkStart w:id="61" w:name="_Toc7615"/>
+      <w:bookmarkStart w:id="61" w:name="_Toc3561"/>
       <w:r>
         <w:t>5.3. Hướng phát triển phù hợp</w:t>
       </w:r>
@@ -22379,7 +22391,7 @@
         <w:pStyle w:val="174"/>
         <w:spacing w:before="80" w:after="100" w:line="269" w:lineRule="auto"/>
       </w:pPr>
-      <w:bookmarkStart w:id="62" w:name="_Toc366"/>
+      <w:bookmarkStart w:id="62" w:name="_Toc30056"/>
       <w:r>
         <w:t>Bảng 5.1 Mức hoàn thành và bằng chứng theo yêu cầu</w:t>
       </w:r>
@@ -23009,7 +23021,7 @@
         <w:keepNext w:val="0"/>
         <w:spacing w:before="0" w:after="320"/>
       </w:pPr>
-      <w:bookmarkStart w:id="63" w:name="_Toc2697"/>
+      <w:bookmarkStart w:id="63" w:name="_Toc13554"/>
       <w:r>
         <w:t>TÀI LIỆU THAM KHẢO</w:t>
       </w:r>
@@ -23075,7 +23087,7 @@
         <w:keepNext w:val="0"/>
         <w:spacing w:before="0" w:after="320"/>
       </w:pPr>
-      <w:bookmarkStart w:id="64" w:name="_Toc8844"/>
+      <w:bookmarkStart w:id="64" w:name="_Toc1739"/>
       <w:r>
         <w:t>PHỤ LỤC</w:t>
       </w:r>
@@ -23085,7 +23097,7 @@
       <w:pPr>
         <w:pStyle w:val="3"/>
       </w:pPr>
-      <w:bookmarkStart w:id="65" w:name="_Toc12239"/>
+      <w:bookmarkStart w:id="65" w:name="_Toc7187"/>
       <w:r>
         <w:t>PHỤ LỤC A. Tổ chức mã và hướng dẫn chạy</w:t>
       </w:r>
@@ -23575,7 +23587,7 @@
         <w:pStyle w:val="3"/>
         <w:pageBreakBefore/>
       </w:pPr>
-      <w:bookmarkStart w:id="66" w:name="_Toc30419"/>
+      <w:bookmarkStart w:id="66" w:name="_Toc23729"/>
       <w:r>
         <w:t>PHỤ LỤC B. Danh mục bằng chứng</w:t>
       </w:r>
@@ -24600,7 +24612,7 @@
         <w:pStyle w:val="3"/>
         <w:pageBreakBefore/>
       </w:pPr>
-      <w:bookmarkStart w:id="67" w:name="_Toc18768"/>
+      <w:bookmarkStart w:id="67" w:name="_Toc30373"/>
       <w:r>
         <w:t>PHỤ LỤC C. Tự kiểm trước khi nộp</w:t>
       </w:r>
@@ -24721,7 +24733,7 @@
         <w:pStyle w:val="3"/>
         <w:pageBreakBefore/>
       </w:pPr>
-      <w:bookmarkStart w:id="68" w:name="_Toc16233"/>
+      <w:bookmarkStart w:id="68" w:name="_Toc15820"/>
       <w:r>
         <w:t>PHỤ LỤC D HƯỚNG DẪN NỘP CLASSROOM</w:t>
       </w:r>
@@ -24769,7 +24781,7 @@
         <w:spacing w:before="0" w:after="100" w:line="269" w:lineRule="auto"/>
         <w:jc w:val="left"/>
       </w:pPr>
-      <w:bookmarkStart w:id="69" w:name="_Toc19133"/>
+      <w:bookmarkStart w:id="69" w:name="_Toc15255"/>
       <w:r>
         <w:t>Bảng PL.1 Bốn tệp cần nộp</w:t>
       </w:r>
@@ -25846,9 +25858,9 @@
     <w:lsdException w:uiPriority="99" w:name="index 7"/>
     <w:lsdException w:uiPriority="99" w:name="index 8"/>
     <w:lsdException w:uiPriority="99" w:name="index 9"/>
-    <w:lsdException w:uiPriority="39" w:semiHidden="0" w:name="toc 1"/>
-    <w:lsdException w:uiPriority="39" w:semiHidden="0" w:name="toc 2"/>
-    <w:lsdException w:uiPriority="39" w:semiHidden="0" w:name="toc 3"/>
+    <w:lsdException w:qFormat="1" w:uiPriority="39" w:semiHidden="0" w:name="toc 1"/>
+    <w:lsdException w:qFormat="1" w:uiPriority="39" w:semiHidden="0" w:name="toc 2"/>
+    <w:lsdException w:qFormat="1" w:uiPriority="39" w:semiHidden="0" w:name="toc 3"/>
     <w:lsdException w:uiPriority="39" w:name="toc 4"/>
     <w:lsdException w:uiPriority="39" w:name="toc 5"/>
     <w:lsdException w:uiPriority="39" w:name="toc 6"/>
@@ -25912,7 +25924,7 @@
     <w:lsdException w:uiPriority="99" w:name="Body Text Indent 2"/>
     <w:lsdException w:uiPriority="99" w:name="Body Text Indent 3"/>
     <w:lsdException w:uiPriority="99" w:name="Block Text"/>
-    <w:lsdException w:uiPriority="99" w:semiHidden="0" w:name="Hyperlink"/>
+    <w:lsdException w:qFormat="1" w:uiPriority="99" w:semiHidden="0" w:name="Hyperlink"/>
     <w:lsdException w:uiPriority="99" w:name="FollowedHyperlink"/>
     <w:lsdException w:qFormat="1" w:unhideWhenUsed="0" w:uiPriority="22" w:semiHidden="0" w:name="Strong"/>
     <w:lsdException w:qFormat="1" w:unhideWhenUsed="0" w:uiPriority="20" w:semiHidden="0" w:name="Emphasis"/>
@@ -25990,8 +26002,8 @@
     <w:lsdException w:unhideWhenUsed="0" w:uiPriority="69" w:semiHidden="0" w:name="Medium Grid 3"/>
     <w:lsdException w:unhideWhenUsed="0" w:uiPriority="70" w:semiHidden="0" w:name="Dark List"/>
     <w:lsdException w:unhideWhenUsed="0" w:uiPriority="71" w:semiHidden="0" w:name="Colorful Shading"/>
-    <w:lsdException w:qFormat="1" w:unhideWhenUsed="0" w:uiPriority="72" w:semiHidden="0" w:name="Colorful List"/>
-    <w:lsdException w:qFormat="1" w:unhideWhenUsed="0" w:uiPriority="73" w:semiHidden="0" w:name="Colorful Grid"/>
+    <w:lsdException w:unhideWhenUsed="0" w:uiPriority="72" w:semiHidden="0" w:name="Colorful List"/>
+    <w:lsdException w:unhideWhenUsed="0" w:uiPriority="73" w:semiHidden="0" w:name="Colorful Grid"/>
     <w:lsdException w:unhideWhenUsed="0" w:uiPriority="60" w:semiHidden="0" w:name="Light Shading Accent 1"/>
     <w:lsdException w:unhideWhenUsed="0" w:uiPriority="61" w:semiHidden="0" w:name="Light List Accent 1"/>
     <w:lsdException w:unhideWhenUsed="0" w:uiPriority="62" w:semiHidden="0" w:name="Light Grid Accent 1"/>
@@ -26007,8 +26019,8 @@
     <w:lsdException w:unhideWhenUsed="0" w:uiPriority="69" w:semiHidden="0" w:name="Medium Grid 3 Accent 1"/>
     <w:lsdException w:unhideWhenUsed="0" w:uiPriority="70" w:semiHidden="0" w:name="Dark List Accent 1"/>
     <w:lsdException w:unhideWhenUsed="0" w:uiPriority="71" w:semiHidden="0" w:name="Colorful Shading Accent 1"/>
-    <w:lsdException w:qFormat="1" w:unhideWhenUsed="0" w:uiPriority="72" w:semiHidden="0" w:name="Colorful List Accent 1"/>
-    <w:lsdException w:qFormat="1" w:unhideWhenUsed="0" w:uiPriority="73" w:semiHidden="0" w:name="Colorful Grid Accent 1"/>
+    <w:lsdException w:unhideWhenUsed="0" w:uiPriority="72" w:semiHidden="0" w:name="Colorful List Accent 1"/>
+    <w:lsdException w:unhideWhenUsed="0" w:uiPriority="73" w:semiHidden="0" w:name="Colorful Grid Accent 1"/>
     <w:lsdException w:unhideWhenUsed="0" w:uiPriority="60" w:semiHidden="0" w:name="Light Shading Accent 2"/>
     <w:lsdException w:unhideWhenUsed="0" w:uiPriority="61" w:semiHidden="0" w:name="Light List Accent 2"/>
     <w:lsdException w:unhideWhenUsed="0" w:uiPriority="62" w:semiHidden="0" w:name="Light Grid Accent 2"/>
@@ -26021,8 +26033,8 @@
     <w:lsdException w:unhideWhenUsed="0" w:uiPriority="69" w:semiHidden="0" w:name="Medium Grid 3 Accent 2"/>
     <w:lsdException w:unhideWhenUsed="0" w:uiPriority="70" w:semiHidden="0" w:name="Dark List Accent 2"/>
     <w:lsdException w:unhideWhenUsed="0" w:uiPriority="71" w:semiHidden="0" w:name="Colorful Shading Accent 2"/>
-    <w:lsdException w:qFormat="1" w:unhideWhenUsed="0" w:uiPriority="72" w:semiHidden="0" w:name="Colorful List Accent 2"/>
-    <w:lsdException w:qFormat="1" w:unhideWhenUsed="0" w:uiPriority="73" w:semiHidden="0" w:name="Colorful Grid Accent 2"/>
+    <w:lsdException w:unhideWhenUsed="0" w:uiPriority="72" w:semiHidden="0" w:name="Colorful List Accent 2"/>
+    <w:lsdException w:unhideWhenUsed="0" w:uiPriority="73" w:semiHidden="0" w:name="Colorful Grid Accent 2"/>
     <w:lsdException w:unhideWhenUsed="0" w:uiPriority="60" w:semiHidden="0" w:name="Light Shading Accent 3"/>
     <w:lsdException w:unhideWhenUsed="0" w:uiPriority="61" w:semiHidden="0" w:name="Light List Accent 3"/>
     <w:lsdException w:unhideWhenUsed="0" w:uiPriority="62" w:semiHidden="0" w:name="Light Grid Accent 3"/>
@@ -26035,8 +26047,8 @@
     <w:lsdException w:unhideWhenUsed="0" w:uiPriority="69" w:semiHidden="0" w:name="Medium Grid 3 Accent 3"/>
     <w:lsdException w:unhideWhenUsed="0" w:uiPriority="70" w:semiHidden="0" w:name="Dark List Accent 3"/>
     <w:lsdException w:unhideWhenUsed="0" w:uiPriority="71" w:semiHidden="0" w:name="Colorful Shading Accent 3"/>
-    <w:lsdException w:qFormat="1" w:unhideWhenUsed="0" w:uiPriority="72" w:semiHidden="0" w:name="Colorful List Accent 3"/>
-    <w:lsdException w:qFormat="1" w:unhideWhenUsed="0" w:uiPriority="73" w:semiHidden="0" w:name="Colorful Grid Accent 3"/>
+    <w:lsdException w:unhideWhenUsed="0" w:uiPriority="72" w:semiHidden="0" w:name="Colorful List Accent 3"/>
+    <w:lsdException w:unhideWhenUsed="0" w:uiPriority="73" w:semiHidden="0" w:name="Colorful Grid Accent 3"/>
     <w:lsdException w:unhideWhenUsed="0" w:uiPriority="60" w:semiHidden="0" w:name="Light Shading Accent 4"/>
     <w:lsdException w:unhideWhenUsed="0" w:uiPriority="61" w:semiHidden="0" w:name="Light List Accent 4"/>
     <w:lsdException w:unhideWhenUsed="0" w:uiPriority="62" w:semiHidden="0" w:name="Light Grid Accent 4"/>
@@ -26048,9 +26060,9 @@
     <w:lsdException w:unhideWhenUsed="0" w:uiPriority="68" w:semiHidden="0" w:name="Medium Grid 2 Accent 4"/>
     <w:lsdException w:unhideWhenUsed="0" w:uiPriority="69" w:semiHidden="0" w:name="Medium Grid 3 Accent 4"/>
     <w:lsdException w:unhideWhenUsed="0" w:uiPriority="70" w:semiHidden="0" w:name="Dark List Accent 4"/>
-    <w:lsdException w:qFormat="1" w:unhideWhenUsed="0" w:uiPriority="71" w:semiHidden="0" w:name="Colorful Shading Accent 4"/>
-    <w:lsdException w:qFormat="1" w:unhideWhenUsed="0" w:uiPriority="72" w:semiHidden="0" w:name="Colorful List Accent 4"/>
-    <w:lsdException w:qFormat="1" w:unhideWhenUsed="0" w:uiPriority="73" w:semiHidden="0" w:name="Colorful Grid Accent 4"/>
+    <w:lsdException w:unhideWhenUsed="0" w:uiPriority="71" w:semiHidden="0" w:name="Colorful Shading Accent 4"/>
+    <w:lsdException w:unhideWhenUsed="0" w:uiPriority="72" w:semiHidden="0" w:name="Colorful List Accent 4"/>
+    <w:lsdException w:unhideWhenUsed="0" w:uiPriority="73" w:semiHidden="0" w:name="Colorful Grid Accent 4"/>
     <w:lsdException w:unhideWhenUsed="0" w:uiPriority="60" w:semiHidden="0" w:name="Light Shading Accent 5"/>
     <w:lsdException w:unhideWhenUsed="0" w:uiPriority="61" w:semiHidden="0" w:name="Light List Accent 5"/>
     <w:lsdException w:unhideWhenUsed="0" w:uiPriority="62" w:semiHidden="0" w:name="Light Grid Accent 5"/>
@@ -26062,9 +26074,9 @@
     <w:lsdException w:unhideWhenUsed="0" w:uiPriority="68" w:semiHidden="0" w:name="Medium Grid 2 Accent 5"/>
     <w:lsdException w:unhideWhenUsed="0" w:uiPriority="69" w:semiHidden="0" w:name="Medium Grid 3 Accent 5"/>
     <w:lsdException w:unhideWhenUsed="0" w:uiPriority="70" w:semiHidden="0" w:name="Dark List Accent 5"/>
-    <w:lsdException w:qFormat="1" w:unhideWhenUsed="0" w:uiPriority="71" w:semiHidden="0" w:name="Colorful Shading Accent 5"/>
-    <w:lsdException w:qFormat="1" w:unhideWhenUsed="0" w:uiPriority="72" w:semiHidden="0" w:name="Colorful List Accent 5"/>
-    <w:lsdException w:qFormat="1" w:unhideWhenUsed="0" w:uiPriority="73" w:semiHidden="0" w:name="Colorful Grid Accent 5"/>
+    <w:lsdException w:unhideWhenUsed="0" w:uiPriority="71" w:semiHidden="0" w:name="Colorful Shading Accent 5"/>
+    <w:lsdException w:unhideWhenUsed="0" w:uiPriority="72" w:semiHidden="0" w:name="Colorful List Accent 5"/>
+    <w:lsdException w:unhideWhenUsed="0" w:uiPriority="73" w:semiHidden="0" w:name="Colorful Grid Accent 5"/>
     <w:lsdException w:unhideWhenUsed="0" w:uiPriority="60" w:semiHidden="0" w:name="Light Shading Accent 6"/>
     <w:lsdException w:unhideWhenUsed="0" w:uiPriority="61" w:semiHidden="0" w:name="Light List Accent 6"/>
     <w:lsdException w:unhideWhenUsed="0" w:uiPriority="62" w:semiHidden="0" w:name="Light Grid Accent 6"/>
@@ -26076,9 +26088,9 @@
     <w:lsdException w:unhideWhenUsed="0" w:uiPriority="68" w:semiHidden="0" w:name="Medium Grid 2 Accent 6"/>
     <w:lsdException w:unhideWhenUsed="0" w:uiPriority="69" w:semiHidden="0" w:name="Medium Grid 3 Accent 6"/>
     <w:lsdException w:unhideWhenUsed="0" w:uiPriority="70" w:semiHidden="0" w:name="Dark List Accent 6"/>
-    <w:lsdException w:qFormat="1" w:unhideWhenUsed="0" w:uiPriority="71" w:semiHidden="0" w:name="Colorful Shading Accent 6"/>
-    <w:lsdException w:qFormat="1" w:unhideWhenUsed="0" w:uiPriority="72" w:semiHidden="0" w:name="Colorful List Accent 6"/>
-    <w:lsdException w:qFormat="1" w:unhideWhenUsed="0" w:uiPriority="73" w:semiHidden="0" w:name="Colorful Grid Accent 6"/>
+    <w:lsdException w:unhideWhenUsed="0" w:uiPriority="71" w:semiHidden="0" w:name="Colorful Shading Accent 6"/>
+    <w:lsdException w:unhideWhenUsed="0" w:uiPriority="72" w:semiHidden="0" w:name="Colorful List Accent 6"/>
+    <w:lsdException w:unhideWhenUsed="0" w:uiPriority="73" w:semiHidden="0" w:name="Colorful Grid Accent 6"/>
   </w:latentStyles>
   <w:style w:type="paragraph" w:default="1" w:styleId="1">
     <w:name w:val="Normal"/>
@@ -26434,6 +26446,7 @@
     <w:name w:val="Hyperlink"/>
     <w:basedOn w:val="11"/>
     <w:unhideWhenUsed/>
+    <w:qFormat/>
     <w:uiPriority w:val="99"/>
     <w:rPr>
       <w:color w:val="0000FF" w:themeColor="hyperlink"/>
@@ -26689,6 +26702,7 @@
     <w:next w:val="1"/>
     <w:autoRedefine/>
     <w:unhideWhenUsed/>
+    <w:qFormat/>
     <w:uiPriority w:val="39"/>
     <w:pPr>
       <w:spacing w:after="100"/>
@@ -26700,6 +26714,7 @@
     <w:next w:val="1"/>
     <w:autoRedefine/>
     <w:unhideWhenUsed/>
+    <w:qFormat/>
     <w:uiPriority w:val="39"/>
     <w:pPr>
       <w:spacing w:after="100"/>
@@ -26712,6 +26727,7 @@
     <w:next w:val="1"/>
     <w:autoRedefine/>
     <w:unhideWhenUsed/>
+    <w:qFormat/>
     <w:uiPriority w:val="39"/>
     <w:pPr>
       <w:spacing w:after="100"/>
@@ -35893,7 +35909,6 @@
   <w:style w:type="table" w:styleId="122">
     <w:name w:val="Colorful Shading Accent 4"/>
     <w:basedOn w:val="12"/>
-    <w:qFormat/>
     <w:uiPriority w:val="71"/>
     <w:pPr>
       <w:spacing w:after="0" w:line="240" w:lineRule="auto"/>
@@ -36036,7 +36051,6 @@
   <w:style w:type="table" w:styleId="123">
     <w:name w:val="Colorful Shading Accent 5"/>
     <w:basedOn w:val="12"/>
-    <w:qFormat/>
     <w:uiPriority w:val="71"/>
     <w:pPr>
       <w:spacing w:after="0" w:line="240" w:lineRule="auto"/>
@@ -36179,7 +36193,6 @@
   <w:style w:type="table" w:styleId="124">
     <w:name w:val="Colorful Shading Accent 6"/>
     <w:basedOn w:val="12"/>
-    <w:qFormat/>
     <w:uiPriority w:val="71"/>
     <w:pPr>
       <w:spacing w:after="0" w:line="240" w:lineRule="auto"/>
@@ -36322,7 +36335,6 @@
   <w:style w:type="table" w:styleId="125">
     <w:name w:val="Colorful List"/>
     <w:basedOn w:val="12"/>
-    <w:qFormat/>
     <w:uiPriority w:val="72"/>
     <w:pPr>
       <w:spacing w:after="0" w:line="240" w:lineRule="auto"/>
@@ -36411,7 +36423,6 @@
   <w:style w:type="table" w:styleId="126">
     <w:name w:val="Colorful List Accent 1"/>
     <w:basedOn w:val="12"/>
-    <w:qFormat/>
     <w:uiPriority w:val="72"/>
     <w:pPr>
       <w:spacing w:after="0" w:line="240" w:lineRule="auto"/>
@@ -36500,7 +36511,6 @@
   <w:style w:type="table" w:styleId="127">
     <w:name w:val="Colorful List Accent 2"/>
     <w:basedOn w:val="12"/>
-    <w:qFormat/>
     <w:uiPriority w:val="72"/>
     <w:pPr>
       <w:spacing w:after="0" w:line="240" w:lineRule="auto"/>
@@ -36589,7 +36599,6 @@
   <w:style w:type="table" w:styleId="128">
     <w:name w:val="Colorful List Accent 3"/>
     <w:basedOn w:val="12"/>
-    <w:qFormat/>
     <w:uiPriority w:val="72"/>
     <w:pPr>
       <w:spacing w:after="0" w:line="240" w:lineRule="auto"/>
@@ -36678,7 +36687,6 @@
   <w:style w:type="table" w:styleId="129">
     <w:name w:val="Colorful List Accent 4"/>
     <w:basedOn w:val="12"/>
-    <w:qFormat/>
     <w:uiPriority w:val="72"/>
     <w:pPr>
       <w:spacing w:after="0" w:line="240" w:lineRule="auto"/>
@@ -36767,7 +36775,6 @@
   <w:style w:type="table" w:styleId="130">
     <w:name w:val="Colorful List Accent 5"/>
     <w:basedOn w:val="12"/>
-    <w:qFormat/>
     <w:uiPriority w:val="72"/>
     <w:pPr>
       <w:spacing w:after="0" w:line="240" w:lineRule="auto"/>
@@ -36856,7 +36863,6 @@
   <w:style w:type="table" w:styleId="131">
     <w:name w:val="Colorful List Accent 6"/>
     <w:basedOn w:val="12"/>
-    <w:qFormat/>
     <w:uiPriority w:val="72"/>
     <w:pPr>
       <w:spacing w:after="0" w:line="240" w:lineRule="auto"/>
@@ -36945,7 +36951,6 @@
   <w:style w:type="table" w:styleId="132">
     <w:name w:val="Colorful Grid"/>
     <w:basedOn w:val="12"/>
-    <w:qFormat/>
     <w:uiPriority w:val="73"/>
     <w:pPr>
       <w:spacing w:after="0" w:line="240" w:lineRule="auto"/>
@@ -37036,7 +37041,6 @@
   <w:style w:type="table" w:styleId="133">
     <w:name w:val="Colorful Grid Accent 1"/>
     <w:basedOn w:val="12"/>
-    <w:qFormat/>
     <w:uiPriority w:val="73"/>
     <w:pPr>
       <w:spacing w:after="0" w:line="240" w:lineRule="auto"/>
@@ -37127,7 +37131,6 @@
   <w:style w:type="table" w:styleId="134">
     <w:name w:val="Colorful Grid Accent 2"/>
     <w:basedOn w:val="12"/>
-    <w:qFormat/>
     <w:uiPriority w:val="73"/>
     <w:pPr>
       <w:spacing w:after="0" w:line="240" w:lineRule="auto"/>
@@ -37218,7 +37221,6 @@
   <w:style w:type="table" w:styleId="135">
     <w:name w:val="Colorful Grid Accent 3"/>
     <w:basedOn w:val="12"/>
-    <w:qFormat/>
     <w:uiPriority w:val="73"/>
     <w:pPr>
       <w:spacing w:after="0" w:line="240" w:lineRule="auto"/>
@@ -37309,7 +37311,6 @@
   <w:style w:type="table" w:styleId="136">
     <w:name w:val="Colorful Grid Accent 4"/>
     <w:basedOn w:val="12"/>
-    <w:qFormat/>
     <w:uiPriority w:val="73"/>
     <w:pPr>
       <w:spacing w:after="0" w:line="240" w:lineRule="auto"/>
@@ -37400,7 +37401,6 @@
   <w:style w:type="table" w:styleId="137">
     <w:name w:val="Colorful Grid Accent 5"/>
     <w:basedOn w:val="12"/>
-    <w:qFormat/>
     <w:uiPriority w:val="73"/>
     <w:pPr>
       <w:spacing w:after="0" w:line="240" w:lineRule="auto"/>
@@ -37491,7 +37491,6 @@
   <w:style w:type="table" w:styleId="138">
     <w:name w:val="Colorful Grid Accent 6"/>
     <w:basedOn w:val="12"/>
-    <w:qFormat/>
     <w:uiPriority w:val="73"/>
     <w:pPr>
       <w:spacing w:after="0" w:line="240" w:lineRule="auto"/>
@@ -38139,6 +38138,7 @@
   <w:style w:type="paragraph" w:customStyle="1" w:styleId="177">
     <w:name w:val="TOC 11"/>
     <w:basedOn w:val="1"/>
+    <w:qFormat/>
     <w:uiPriority w:val="0"/>
     <w:pPr>
       <w:tabs>
@@ -38153,6 +38153,7 @@
   <w:style w:type="paragraph" w:customStyle="1" w:styleId="178">
     <w:name w:val="TOC 21"/>
     <w:basedOn w:val="1"/>
+    <w:qFormat/>
     <w:uiPriority w:val="0"/>
     <w:pPr>
       <w:tabs>
@@ -38165,6 +38166,7 @@
   <w:style w:type="paragraph" w:customStyle="1" w:styleId="179">
     <w:name w:val="TOC 31"/>
     <w:basedOn w:val="1"/>
+    <w:qFormat/>
     <w:uiPriority w:val="0"/>
     <w:pPr>
       <w:tabs>

</xml_diff>

<commit_message>
Fix clipping: mo rong canvas anh dong de hien thi tron ven 100% noi dung khong bi che
</commit_message>
<xml_diff>
--- a/N24DCDT047_DT042_TuLeNhatLong_BaoCao.docx
+++ b/N24DCDT047_DT042_TuLeNhatLong_BaoCao.docx
@@ -1003,7 +1003,7 @@
         <w:keepNext w:val="0"/>
         <w:spacing w:before="0" w:after="320"/>
       </w:pPr>
-      <w:bookmarkStart w:id="0" w:name="_Toc5108"/>
+      <w:bookmarkStart w:id="0" w:name="_Toc8808"/>
       <w:r>
         <w:t>PHIẾU GIAO ĐỀ TÀI</w:t>
       </w:r>
@@ -1546,14 +1546,6 @@
       </w:tblGrid>
       <w:tr>
         <w:tblPrEx>
-          <w:tblBorders>
-            <w:top w:val="single" w:color="D9D9D9" w:sz="4" w:space="0"/>
-            <w:left w:val="single" w:color="D9D9D9" w:sz="4" w:space="0"/>
-            <w:bottom w:val="single" w:color="D9D9D9" w:sz="4" w:space="0"/>
-            <w:right w:val="single" w:color="D9D9D9" w:sz="4" w:space="0"/>
-            <w:insideH w:val="single" w:color="D9D9D9" w:sz="4" w:space="0"/>
-            <w:insideV w:val="single" w:color="D9D9D9" w:sz="4" w:space="0"/>
-          </w:tblBorders>
           <w:tblCellMar>
             <w:top w:w="70" w:type="dxa"/>
             <w:left w:w="70" w:type="dxa"/>
@@ -1744,7 +1736,7 @@
         <w:keepNext w:val="0"/>
         <w:spacing w:before="0" w:after="320"/>
       </w:pPr>
-      <w:bookmarkStart w:id="1" w:name="_Toc8773"/>
+      <w:bookmarkStart w:id="1" w:name="_Toc29789"/>
       <w:r>
         <w:t>PHIẾU CHẤM VÀ ĐỐI CHIẾU MINH CHỨNG</w:t>
       </w:r>
@@ -2612,7 +2604,7 @@
         <w:pStyle w:val="3"/>
         <w:pageBreakBefore/>
       </w:pPr>
-      <w:bookmarkStart w:id="2" w:name="_Toc20934"/>
+      <w:bookmarkStart w:id="2" w:name="_Toc10416"/>
       <w:r>
         <w:t>CÁCH ĐỐI CHIẾU RUBRIC</w:t>
       </w:r>
@@ -2840,7 +2832,7 @@
         <w:keepNext w:val="0"/>
         <w:spacing w:before="0" w:after="320"/>
       </w:pPr>
-      <w:bookmarkStart w:id="3" w:name="_Toc3671"/>
+      <w:bookmarkStart w:id="3" w:name="_Toc4430"/>
       <w:r>
         <w:t>HƯỚNG DẪN ĐIỀN KHUNG BÁO CÁO</w:t>
       </w:r>
@@ -2925,7 +2917,7 @@
         <w:keepNext w:val="0"/>
         <w:spacing w:before="0" w:after="320"/>
       </w:pPr>
-      <w:bookmarkStart w:id="4" w:name="_Toc10262"/>
+      <w:bookmarkStart w:id="4" w:name="_Toc31267"/>
       <w:r>
         <w:t>LỜI CAM ĐOAN</w:t>
       </w:r>
@@ -3095,7 +3087,7 @@
         <w:keepNext w:val="0"/>
         <w:spacing w:before="0" w:after="320"/>
       </w:pPr>
-      <w:bookmarkStart w:id="5" w:name="_Toc6770"/>
+      <w:bookmarkStart w:id="5" w:name="_Toc32075"/>
       <w:r>
         <w:t>LỜI CẢM ƠN</w:t>
       </w:r>
@@ -3149,7 +3141,7 @@
         <w:keepNext w:val="0"/>
         <w:spacing w:before="0" w:after="320"/>
       </w:pPr>
-      <w:bookmarkStart w:id="6" w:name="_Toc15046"/>
+      <w:bookmarkStart w:id="6" w:name="_Toc2509"/>
       <w:r>
         <w:t>TÓM TẮT</w:t>
       </w:r>
@@ -3278,7 +3270,7 @@
         <w:fldChar w:fldCharType="begin"/>
       </w:r>
       <w:r>
-        <w:instrText xml:space="preserve"> HYPERLINK \l _Toc5108 </w:instrText>
+        <w:instrText xml:space="preserve"> HYPERLINK \l _Toc8808 </w:instrText>
       </w:r>
       <w:r>
         <w:fldChar w:fldCharType="separate"/>
@@ -3293,7 +3285,7 @@
         <w:fldChar w:fldCharType="begin"/>
       </w:r>
       <w:r>
-        <w:instrText xml:space="preserve"> PAGEREF _Toc5108 \h </w:instrText>
+        <w:instrText xml:space="preserve"> PAGEREF _Toc8808 \h </w:instrText>
       </w:r>
       <w:r>
         <w:fldChar w:fldCharType="separate"/>
@@ -3319,7 +3311,7 @@
         <w:fldChar w:fldCharType="begin"/>
       </w:r>
       <w:r>
-        <w:instrText xml:space="preserve"> HYPERLINK \l _Toc8773 </w:instrText>
+        <w:instrText xml:space="preserve"> HYPERLINK \l _Toc29789 </w:instrText>
       </w:r>
       <w:r>
         <w:fldChar w:fldCharType="separate"/>
@@ -3334,7 +3326,7 @@
         <w:fldChar w:fldCharType="begin"/>
       </w:r>
       <w:r>
-        <w:instrText xml:space="preserve"> PAGEREF _Toc8773 \h </w:instrText>
+        <w:instrText xml:space="preserve"> PAGEREF _Toc29789 \h </w:instrText>
       </w:r>
       <w:r>
         <w:fldChar w:fldCharType="separate"/>
@@ -3360,7 +3352,7 @@
         <w:fldChar w:fldCharType="begin"/>
       </w:r>
       <w:r>
-        <w:instrText xml:space="preserve"> HYPERLINK \l _Toc20934 </w:instrText>
+        <w:instrText xml:space="preserve"> HYPERLINK \l _Toc10416 </w:instrText>
       </w:r>
       <w:r>
         <w:fldChar w:fldCharType="separate"/>
@@ -3375,7 +3367,7 @@
         <w:fldChar w:fldCharType="begin"/>
       </w:r>
       <w:r>
-        <w:instrText xml:space="preserve"> PAGEREF _Toc20934 \h </w:instrText>
+        <w:instrText xml:space="preserve"> PAGEREF _Toc10416 \h </w:instrText>
       </w:r>
       <w:r>
         <w:fldChar w:fldCharType="separate"/>
@@ -3401,7 +3393,7 @@
         <w:fldChar w:fldCharType="begin"/>
       </w:r>
       <w:r>
-        <w:instrText xml:space="preserve"> HYPERLINK \l _Toc3671 </w:instrText>
+        <w:instrText xml:space="preserve"> HYPERLINK \l _Toc4430 </w:instrText>
       </w:r>
       <w:r>
         <w:fldChar w:fldCharType="separate"/>
@@ -3416,7 +3408,7 @@
         <w:fldChar w:fldCharType="begin"/>
       </w:r>
       <w:r>
-        <w:instrText xml:space="preserve"> PAGEREF _Toc3671 \h </w:instrText>
+        <w:instrText xml:space="preserve"> PAGEREF _Toc4430 \h </w:instrText>
       </w:r>
       <w:r>
         <w:fldChar w:fldCharType="separate"/>
@@ -3442,7 +3434,7 @@
         <w:fldChar w:fldCharType="begin"/>
       </w:r>
       <w:r>
-        <w:instrText xml:space="preserve"> HYPERLINK \l _Toc10262 </w:instrText>
+        <w:instrText xml:space="preserve"> HYPERLINK \l _Toc31267 </w:instrText>
       </w:r>
       <w:r>
         <w:fldChar w:fldCharType="separate"/>
@@ -3457,7 +3449,7 @@
         <w:fldChar w:fldCharType="begin"/>
       </w:r>
       <w:r>
-        <w:instrText xml:space="preserve"> PAGEREF _Toc10262 \h </w:instrText>
+        <w:instrText xml:space="preserve"> PAGEREF _Toc31267 \h </w:instrText>
       </w:r>
       <w:r>
         <w:fldChar w:fldCharType="separate"/>
@@ -3483,7 +3475,7 @@
         <w:fldChar w:fldCharType="begin"/>
       </w:r>
       <w:r>
-        <w:instrText xml:space="preserve"> HYPERLINK \l _Toc6770 </w:instrText>
+        <w:instrText xml:space="preserve"> HYPERLINK \l _Toc32075 </w:instrText>
       </w:r>
       <w:r>
         <w:fldChar w:fldCharType="separate"/>
@@ -3498,7 +3490,7 @@
         <w:fldChar w:fldCharType="begin"/>
       </w:r>
       <w:r>
-        <w:instrText xml:space="preserve"> PAGEREF _Toc6770 \h </w:instrText>
+        <w:instrText xml:space="preserve"> PAGEREF _Toc32075 \h </w:instrText>
       </w:r>
       <w:r>
         <w:fldChar w:fldCharType="separate"/>
@@ -3524,7 +3516,7 @@
         <w:fldChar w:fldCharType="begin"/>
       </w:r>
       <w:r>
-        <w:instrText xml:space="preserve"> HYPERLINK \l _Toc15046 </w:instrText>
+        <w:instrText xml:space="preserve"> HYPERLINK \l _Toc2509 </w:instrText>
       </w:r>
       <w:r>
         <w:fldChar w:fldCharType="separate"/>
@@ -3539,7 +3531,7 @@
         <w:fldChar w:fldCharType="begin"/>
       </w:r>
       <w:r>
-        <w:instrText xml:space="preserve"> PAGEREF _Toc15046 \h </w:instrText>
+        <w:instrText xml:space="preserve"> PAGEREF _Toc2509 \h </w:instrText>
       </w:r>
       <w:r>
         <w:fldChar w:fldCharType="separate"/>
@@ -3565,7 +3557,7 @@
         <w:fldChar w:fldCharType="begin"/>
       </w:r>
       <w:r>
-        <w:instrText xml:space="preserve"> HYPERLINK \l _Toc4352 </w:instrText>
+        <w:instrText xml:space="preserve"> HYPERLINK \l _Toc30086 </w:instrText>
       </w:r>
       <w:r>
         <w:fldChar w:fldCharType="separate"/>
@@ -3580,7 +3572,7 @@
         <w:fldChar w:fldCharType="begin"/>
       </w:r>
       <w:r>
-        <w:instrText xml:space="preserve"> PAGEREF _Toc4352 \h </w:instrText>
+        <w:instrText xml:space="preserve"> PAGEREF _Toc30086 \h </w:instrText>
       </w:r>
       <w:r>
         <w:fldChar w:fldCharType="separate"/>
@@ -3606,7 +3598,7 @@
         <w:fldChar w:fldCharType="begin"/>
       </w:r>
       <w:r>
-        <w:instrText xml:space="preserve"> HYPERLINK \l _Toc20576 </w:instrText>
+        <w:instrText xml:space="preserve"> HYPERLINK \l _Toc17680 </w:instrText>
       </w:r>
       <w:r>
         <w:fldChar w:fldCharType="separate"/>
@@ -3621,7 +3613,7 @@
         <w:fldChar w:fldCharType="begin"/>
       </w:r>
       <w:r>
-        <w:instrText xml:space="preserve"> PAGEREF _Toc20576 \h </w:instrText>
+        <w:instrText xml:space="preserve"> PAGEREF _Toc17680 \h </w:instrText>
       </w:r>
       <w:r>
         <w:fldChar w:fldCharType="separate"/>
@@ -3647,7 +3639,7 @@
         <w:fldChar w:fldCharType="begin"/>
       </w:r>
       <w:r>
-        <w:instrText xml:space="preserve"> HYPERLINK \l _Toc21767 </w:instrText>
+        <w:instrText xml:space="preserve"> HYPERLINK \l _Toc2823 </w:instrText>
       </w:r>
       <w:r>
         <w:fldChar w:fldCharType="separate"/>
@@ -3662,7 +3654,7 @@
         <w:fldChar w:fldCharType="begin"/>
       </w:r>
       <w:r>
-        <w:instrText xml:space="preserve"> PAGEREF _Toc21767 \h </w:instrText>
+        <w:instrText xml:space="preserve"> PAGEREF _Toc2823 \h </w:instrText>
       </w:r>
       <w:r>
         <w:fldChar w:fldCharType="separate"/>
@@ -3688,7 +3680,7 @@
         <w:fldChar w:fldCharType="begin"/>
       </w:r>
       <w:r>
-        <w:instrText xml:space="preserve"> HYPERLINK \l _Toc9195 </w:instrText>
+        <w:instrText xml:space="preserve"> HYPERLINK \l _Toc5457 </w:instrText>
       </w:r>
       <w:r>
         <w:fldChar w:fldCharType="separate"/>
@@ -3703,7 +3695,7 @@
         <w:fldChar w:fldCharType="begin"/>
       </w:r>
       <w:r>
-        <w:instrText xml:space="preserve"> PAGEREF _Toc9195 \h </w:instrText>
+        <w:instrText xml:space="preserve"> PAGEREF _Toc5457 \h </w:instrText>
       </w:r>
       <w:r>
         <w:fldChar w:fldCharType="separate"/>
@@ -3729,7 +3721,7 @@
         <w:fldChar w:fldCharType="begin"/>
       </w:r>
       <w:r>
-        <w:instrText xml:space="preserve"> HYPERLINK \l _Toc28964 </w:instrText>
+        <w:instrText xml:space="preserve"> HYPERLINK \l _Toc13333 </w:instrText>
       </w:r>
       <w:r>
         <w:fldChar w:fldCharType="separate"/>
@@ -3744,7 +3736,7 @@
         <w:fldChar w:fldCharType="begin"/>
       </w:r>
       <w:r>
-        <w:instrText xml:space="preserve"> PAGEREF _Toc28964 \h </w:instrText>
+        <w:instrText xml:space="preserve"> PAGEREF _Toc13333 \h </w:instrText>
       </w:r>
       <w:r>
         <w:fldChar w:fldCharType="separate"/>
@@ -3770,7 +3762,7 @@
         <w:fldChar w:fldCharType="begin"/>
       </w:r>
       <w:r>
-        <w:instrText xml:space="preserve"> HYPERLINK \l _Toc10876 </w:instrText>
+        <w:instrText xml:space="preserve"> HYPERLINK \l _Toc26702 </w:instrText>
       </w:r>
       <w:r>
         <w:fldChar w:fldCharType="separate"/>
@@ -3785,7 +3777,7 @@
         <w:fldChar w:fldCharType="begin"/>
       </w:r>
       <w:r>
-        <w:instrText xml:space="preserve"> PAGEREF _Toc10876 \h </w:instrText>
+        <w:instrText xml:space="preserve"> PAGEREF _Toc26702 \h </w:instrText>
       </w:r>
       <w:r>
         <w:fldChar w:fldCharType="separate"/>
@@ -3811,7 +3803,7 @@
         <w:fldChar w:fldCharType="begin"/>
       </w:r>
       <w:r>
-        <w:instrText xml:space="preserve"> HYPERLINK \l _Toc28505 </w:instrText>
+        <w:instrText xml:space="preserve"> HYPERLINK \l _Toc32196 </w:instrText>
       </w:r>
       <w:r>
         <w:fldChar w:fldCharType="separate"/>
@@ -3826,7 +3818,7 @@
         <w:fldChar w:fldCharType="begin"/>
       </w:r>
       <w:r>
-        <w:instrText xml:space="preserve"> PAGEREF _Toc28505 \h </w:instrText>
+        <w:instrText xml:space="preserve"> PAGEREF _Toc32196 \h </w:instrText>
       </w:r>
       <w:r>
         <w:fldChar w:fldCharType="separate"/>
@@ -3852,7 +3844,7 @@
         <w:fldChar w:fldCharType="begin"/>
       </w:r>
       <w:r>
-        <w:instrText xml:space="preserve"> HYPERLINK \l _Toc4680 </w:instrText>
+        <w:instrText xml:space="preserve"> HYPERLINK \l _Toc15344 </w:instrText>
       </w:r>
       <w:r>
         <w:fldChar w:fldCharType="separate"/>
@@ -3867,7 +3859,7 @@
         <w:fldChar w:fldCharType="begin"/>
       </w:r>
       <w:r>
-        <w:instrText xml:space="preserve"> PAGEREF _Toc4680 \h </w:instrText>
+        <w:instrText xml:space="preserve"> PAGEREF _Toc15344 \h </w:instrText>
       </w:r>
       <w:r>
         <w:fldChar w:fldCharType="separate"/>
@@ -3893,7 +3885,7 @@
         <w:fldChar w:fldCharType="begin"/>
       </w:r>
       <w:r>
-        <w:instrText xml:space="preserve"> HYPERLINK \l _Toc18521 </w:instrText>
+        <w:instrText xml:space="preserve"> HYPERLINK \l _Toc1778 </w:instrText>
       </w:r>
       <w:r>
         <w:fldChar w:fldCharType="separate"/>
@@ -3908,7 +3900,7 @@
         <w:fldChar w:fldCharType="begin"/>
       </w:r>
       <w:r>
-        <w:instrText xml:space="preserve"> PAGEREF _Toc18521 \h </w:instrText>
+        <w:instrText xml:space="preserve"> PAGEREF _Toc1778 \h </w:instrText>
       </w:r>
       <w:r>
         <w:fldChar w:fldCharType="separate"/>
@@ -3934,7 +3926,7 @@
         <w:fldChar w:fldCharType="begin"/>
       </w:r>
       <w:r>
-        <w:instrText xml:space="preserve"> HYPERLINK \l _Toc12093 </w:instrText>
+        <w:instrText xml:space="preserve"> HYPERLINK \l _Toc20943 </w:instrText>
       </w:r>
       <w:r>
         <w:fldChar w:fldCharType="separate"/>
@@ -3949,7 +3941,7 @@
         <w:fldChar w:fldCharType="begin"/>
       </w:r>
       <w:r>
-        <w:instrText xml:space="preserve"> PAGEREF _Toc12093 \h </w:instrText>
+        <w:instrText xml:space="preserve"> PAGEREF _Toc20943 \h </w:instrText>
       </w:r>
       <w:r>
         <w:fldChar w:fldCharType="separate"/>
@@ -3975,7 +3967,7 @@
         <w:fldChar w:fldCharType="begin"/>
       </w:r>
       <w:r>
-        <w:instrText xml:space="preserve"> HYPERLINK \l _Toc28220 </w:instrText>
+        <w:instrText xml:space="preserve"> HYPERLINK \l _Toc30782 </w:instrText>
       </w:r>
       <w:r>
         <w:fldChar w:fldCharType="separate"/>
@@ -3990,7 +3982,7 @@
         <w:fldChar w:fldCharType="begin"/>
       </w:r>
       <w:r>
-        <w:instrText xml:space="preserve"> PAGEREF _Toc28220 \h </w:instrText>
+        <w:instrText xml:space="preserve"> PAGEREF _Toc30782 \h </w:instrText>
       </w:r>
       <w:r>
         <w:fldChar w:fldCharType="separate"/>
@@ -4016,7 +4008,7 @@
         <w:fldChar w:fldCharType="begin"/>
       </w:r>
       <w:r>
-        <w:instrText xml:space="preserve"> HYPERLINK \l _Toc26989 </w:instrText>
+        <w:instrText xml:space="preserve"> HYPERLINK \l _Toc4042 </w:instrText>
       </w:r>
       <w:r>
         <w:fldChar w:fldCharType="separate"/>
@@ -4031,7 +4023,7 @@
         <w:fldChar w:fldCharType="begin"/>
       </w:r>
       <w:r>
-        <w:instrText xml:space="preserve"> PAGEREF _Toc26989 \h </w:instrText>
+        <w:instrText xml:space="preserve"> PAGEREF _Toc4042 \h </w:instrText>
       </w:r>
       <w:r>
         <w:fldChar w:fldCharType="separate"/>
@@ -4057,7 +4049,7 @@
         <w:fldChar w:fldCharType="begin"/>
       </w:r>
       <w:r>
-        <w:instrText xml:space="preserve"> HYPERLINK \l _Toc21948 </w:instrText>
+        <w:instrText xml:space="preserve"> HYPERLINK \l _Toc2248 </w:instrText>
       </w:r>
       <w:r>
         <w:fldChar w:fldCharType="separate"/>
@@ -4072,7 +4064,7 @@
         <w:fldChar w:fldCharType="begin"/>
       </w:r>
       <w:r>
-        <w:instrText xml:space="preserve"> PAGEREF _Toc21948 \h </w:instrText>
+        <w:instrText xml:space="preserve"> PAGEREF _Toc2248 \h </w:instrText>
       </w:r>
       <w:r>
         <w:fldChar w:fldCharType="separate"/>
@@ -4098,7 +4090,7 @@
         <w:fldChar w:fldCharType="begin"/>
       </w:r>
       <w:r>
-        <w:instrText xml:space="preserve"> HYPERLINK \l _Toc9173 </w:instrText>
+        <w:instrText xml:space="preserve"> HYPERLINK \l _Toc32348 </w:instrText>
       </w:r>
       <w:r>
         <w:fldChar w:fldCharType="separate"/>
@@ -4113,7 +4105,7 @@
         <w:fldChar w:fldCharType="begin"/>
       </w:r>
       <w:r>
-        <w:instrText xml:space="preserve"> PAGEREF _Toc9173 \h </w:instrText>
+        <w:instrText xml:space="preserve"> PAGEREF _Toc32348 \h </w:instrText>
       </w:r>
       <w:r>
         <w:fldChar w:fldCharType="separate"/>
@@ -4139,7 +4131,7 @@
         <w:fldChar w:fldCharType="begin"/>
       </w:r>
       <w:r>
-        <w:instrText xml:space="preserve"> HYPERLINK \l _Toc14955 </w:instrText>
+        <w:instrText xml:space="preserve"> HYPERLINK \l _Toc23978 </w:instrText>
       </w:r>
       <w:r>
         <w:fldChar w:fldCharType="separate"/>
@@ -4154,7 +4146,7 @@
         <w:fldChar w:fldCharType="begin"/>
       </w:r>
       <w:r>
-        <w:instrText xml:space="preserve"> PAGEREF _Toc14955 \h </w:instrText>
+        <w:instrText xml:space="preserve"> PAGEREF _Toc23978 \h </w:instrText>
       </w:r>
       <w:r>
         <w:fldChar w:fldCharType="separate"/>
@@ -4180,7 +4172,7 @@
         <w:fldChar w:fldCharType="begin"/>
       </w:r>
       <w:r>
-        <w:instrText xml:space="preserve"> HYPERLINK \l _Toc1596 </w:instrText>
+        <w:instrText xml:space="preserve"> HYPERLINK \l _Toc6803 </w:instrText>
       </w:r>
       <w:r>
         <w:fldChar w:fldCharType="separate"/>
@@ -4195,7 +4187,7 @@
         <w:fldChar w:fldCharType="begin"/>
       </w:r>
       <w:r>
-        <w:instrText xml:space="preserve"> PAGEREF _Toc1596 \h </w:instrText>
+        <w:instrText xml:space="preserve"> PAGEREF _Toc6803 \h </w:instrText>
       </w:r>
       <w:r>
         <w:fldChar w:fldCharType="separate"/>
@@ -4221,7 +4213,7 @@
         <w:fldChar w:fldCharType="begin"/>
       </w:r>
       <w:r>
-        <w:instrText xml:space="preserve"> HYPERLINK \l _Toc32126 </w:instrText>
+        <w:instrText xml:space="preserve"> HYPERLINK \l _Toc17041 </w:instrText>
       </w:r>
       <w:r>
         <w:fldChar w:fldCharType="separate"/>
@@ -4236,7 +4228,7 @@
         <w:fldChar w:fldCharType="begin"/>
       </w:r>
       <w:r>
-        <w:instrText xml:space="preserve"> PAGEREF _Toc32126 \h </w:instrText>
+        <w:instrText xml:space="preserve"> PAGEREF _Toc17041 \h </w:instrText>
       </w:r>
       <w:r>
         <w:fldChar w:fldCharType="separate"/>
@@ -4262,7 +4254,7 @@
         <w:fldChar w:fldCharType="begin"/>
       </w:r>
       <w:r>
-        <w:instrText xml:space="preserve"> HYPERLINK \l _Toc11080 </w:instrText>
+        <w:instrText xml:space="preserve"> HYPERLINK \l _Toc8409 </w:instrText>
       </w:r>
       <w:r>
         <w:fldChar w:fldCharType="separate"/>
@@ -4277,7 +4269,7 @@
         <w:fldChar w:fldCharType="begin"/>
       </w:r>
       <w:r>
-        <w:instrText xml:space="preserve"> PAGEREF _Toc11080 \h </w:instrText>
+        <w:instrText xml:space="preserve"> PAGEREF _Toc8409 \h </w:instrText>
       </w:r>
       <w:r>
         <w:fldChar w:fldCharType="separate"/>
@@ -4303,7 +4295,7 @@
         <w:fldChar w:fldCharType="begin"/>
       </w:r>
       <w:r>
-        <w:instrText xml:space="preserve"> HYPERLINK \l _Toc15402 </w:instrText>
+        <w:instrText xml:space="preserve"> HYPERLINK \l _Toc27624 </w:instrText>
       </w:r>
       <w:r>
         <w:fldChar w:fldCharType="separate"/>
@@ -4318,7 +4310,7 @@
         <w:fldChar w:fldCharType="begin"/>
       </w:r>
       <w:r>
-        <w:instrText xml:space="preserve"> PAGEREF _Toc15402 \h </w:instrText>
+        <w:instrText xml:space="preserve"> PAGEREF _Toc27624 \h </w:instrText>
       </w:r>
       <w:r>
         <w:fldChar w:fldCharType="separate"/>
@@ -4344,7 +4336,7 @@
         <w:fldChar w:fldCharType="begin"/>
       </w:r>
       <w:r>
-        <w:instrText xml:space="preserve"> HYPERLINK \l _Toc31736 </w:instrText>
+        <w:instrText xml:space="preserve"> HYPERLINK \l _Toc24305 </w:instrText>
       </w:r>
       <w:r>
         <w:fldChar w:fldCharType="separate"/>
@@ -4359,7 +4351,7 @@
         <w:fldChar w:fldCharType="begin"/>
       </w:r>
       <w:r>
-        <w:instrText xml:space="preserve"> PAGEREF _Toc31736 \h </w:instrText>
+        <w:instrText xml:space="preserve"> PAGEREF _Toc24305 \h </w:instrText>
       </w:r>
       <w:r>
         <w:fldChar w:fldCharType="separate"/>
@@ -4385,7 +4377,7 @@
         <w:fldChar w:fldCharType="begin"/>
       </w:r>
       <w:r>
-        <w:instrText xml:space="preserve"> HYPERLINK \l _Toc24992 </w:instrText>
+        <w:instrText xml:space="preserve"> HYPERLINK \l _Toc14182 </w:instrText>
       </w:r>
       <w:r>
         <w:fldChar w:fldCharType="separate"/>
@@ -4400,7 +4392,7 @@
         <w:fldChar w:fldCharType="begin"/>
       </w:r>
       <w:r>
-        <w:instrText xml:space="preserve"> PAGEREF _Toc24992 \h </w:instrText>
+        <w:instrText xml:space="preserve"> PAGEREF _Toc14182 \h </w:instrText>
       </w:r>
       <w:r>
         <w:fldChar w:fldCharType="separate"/>
@@ -4426,7 +4418,7 @@
         <w:fldChar w:fldCharType="begin"/>
       </w:r>
       <w:r>
-        <w:instrText xml:space="preserve"> HYPERLINK \l _Toc3104 </w:instrText>
+        <w:instrText xml:space="preserve"> HYPERLINK \l _Toc20171 </w:instrText>
       </w:r>
       <w:r>
         <w:fldChar w:fldCharType="separate"/>
@@ -4441,7 +4433,7 @@
         <w:fldChar w:fldCharType="begin"/>
       </w:r>
       <w:r>
-        <w:instrText xml:space="preserve"> PAGEREF _Toc3104 \h </w:instrText>
+        <w:instrText xml:space="preserve"> PAGEREF _Toc20171 \h </w:instrText>
       </w:r>
       <w:r>
         <w:fldChar w:fldCharType="separate"/>
@@ -4467,7 +4459,7 @@
         <w:fldChar w:fldCharType="begin"/>
       </w:r>
       <w:r>
-        <w:instrText xml:space="preserve"> HYPERLINK \l _Toc23081 </w:instrText>
+        <w:instrText xml:space="preserve"> HYPERLINK \l _Toc17920 </w:instrText>
       </w:r>
       <w:r>
         <w:fldChar w:fldCharType="separate"/>
@@ -4482,7 +4474,7 @@
         <w:fldChar w:fldCharType="begin"/>
       </w:r>
       <w:r>
-        <w:instrText xml:space="preserve"> PAGEREF _Toc23081 \h </w:instrText>
+        <w:instrText xml:space="preserve"> PAGEREF _Toc17920 \h </w:instrText>
       </w:r>
       <w:r>
         <w:fldChar w:fldCharType="separate"/>
@@ -4508,7 +4500,7 @@
         <w:fldChar w:fldCharType="begin"/>
       </w:r>
       <w:r>
-        <w:instrText xml:space="preserve"> HYPERLINK \l _Toc10143 </w:instrText>
+        <w:instrText xml:space="preserve"> HYPERLINK \l _Toc2341 </w:instrText>
       </w:r>
       <w:r>
         <w:fldChar w:fldCharType="separate"/>
@@ -4523,7 +4515,7 @@
         <w:fldChar w:fldCharType="begin"/>
       </w:r>
       <w:r>
-        <w:instrText xml:space="preserve"> PAGEREF _Toc10143 \h </w:instrText>
+        <w:instrText xml:space="preserve"> PAGEREF _Toc2341 \h </w:instrText>
       </w:r>
       <w:r>
         <w:fldChar w:fldCharType="separate"/>
@@ -4549,7 +4541,7 @@
         <w:fldChar w:fldCharType="begin"/>
       </w:r>
       <w:r>
-        <w:instrText xml:space="preserve"> HYPERLINK \l _Toc30714 </w:instrText>
+        <w:instrText xml:space="preserve"> HYPERLINK \l _Toc25237 </w:instrText>
       </w:r>
       <w:r>
         <w:fldChar w:fldCharType="separate"/>
@@ -4564,7 +4556,7 @@
         <w:fldChar w:fldCharType="begin"/>
       </w:r>
       <w:r>
-        <w:instrText xml:space="preserve"> PAGEREF _Toc30714 \h </w:instrText>
+        <w:instrText xml:space="preserve"> PAGEREF _Toc25237 \h </w:instrText>
       </w:r>
       <w:r>
         <w:fldChar w:fldCharType="separate"/>
@@ -4590,7 +4582,7 @@
         <w:fldChar w:fldCharType="begin"/>
       </w:r>
       <w:r>
-        <w:instrText xml:space="preserve"> HYPERLINK \l _Toc32355 </w:instrText>
+        <w:instrText xml:space="preserve"> HYPERLINK \l _Toc22039 </w:instrText>
       </w:r>
       <w:r>
         <w:fldChar w:fldCharType="separate"/>
@@ -4605,7 +4597,7 @@
         <w:fldChar w:fldCharType="begin"/>
       </w:r>
       <w:r>
-        <w:instrText xml:space="preserve"> PAGEREF _Toc32355 \h </w:instrText>
+        <w:instrText xml:space="preserve"> PAGEREF _Toc22039 \h </w:instrText>
       </w:r>
       <w:r>
         <w:fldChar w:fldCharType="separate"/>
@@ -4631,7 +4623,7 @@
         <w:fldChar w:fldCharType="begin"/>
       </w:r>
       <w:r>
-        <w:instrText xml:space="preserve"> HYPERLINK \l _Toc24492 </w:instrText>
+        <w:instrText xml:space="preserve"> HYPERLINK \l _Toc716 </w:instrText>
       </w:r>
       <w:r>
         <w:fldChar w:fldCharType="separate"/>
@@ -4646,7 +4638,7 @@
         <w:fldChar w:fldCharType="begin"/>
       </w:r>
       <w:r>
-        <w:instrText xml:space="preserve"> PAGEREF _Toc24492 \h </w:instrText>
+        <w:instrText xml:space="preserve"> PAGEREF _Toc716 \h </w:instrText>
       </w:r>
       <w:r>
         <w:fldChar w:fldCharType="separate"/>
@@ -4672,7 +4664,7 @@
         <w:fldChar w:fldCharType="begin"/>
       </w:r>
       <w:r>
-        <w:instrText xml:space="preserve"> HYPERLINK \l _Toc3450 </w:instrText>
+        <w:instrText xml:space="preserve"> HYPERLINK \l _Toc4846 </w:instrText>
       </w:r>
       <w:r>
         <w:fldChar w:fldCharType="separate"/>
@@ -4687,7 +4679,7 @@
         <w:fldChar w:fldCharType="begin"/>
       </w:r>
       <w:r>
-        <w:instrText xml:space="preserve"> PAGEREF _Toc3450 \h </w:instrText>
+        <w:instrText xml:space="preserve"> PAGEREF _Toc4846 \h </w:instrText>
       </w:r>
       <w:r>
         <w:fldChar w:fldCharType="separate"/>
@@ -4713,7 +4705,7 @@
         <w:fldChar w:fldCharType="begin"/>
       </w:r>
       <w:r>
-        <w:instrText xml:space="preserve"> HYPERLINK \l _Toc16770 </w:instrText>
+        <w:instrText xml:space="preserve"> HYPERLINK \l _Toc23541 </w:instrText>
       </w:r>
       <w:r>
         <w:fldChar w:fldCharType="separate"/>
@@ -4728,7 +4720,7 @@
         <w:fldChar w:fldCharType="begin"/>
       </w:r>
       <w:r>
-        <w:instrText xml:space="preserve"> PAGEREF _Toc16770 \h </w:instrText>
+        <w:instrText xml:space="preserve"> PAGEREF _Toc23541 \h </w:instrText>
       </w:r>
       <w:r>
         <w:fldChar w:fldCharType="separate"/>
@@ -4754,7 +4746,7 @@
         <w:fldChar w:fldCharType="begin"/>
       </w:r>
       <w:r>
-        <w:instrText xml:space="preserve"> HYPERLINK \l _Toc5570 </w:instrText>
+        <w:instrText xml:space="preserve"> HYPERLINK \l _Toc8204 </w:instrText>
       </w:r>
       <w:r>
         <w:fldChar w:fldCharType="separate"/>
@@ -4769,7 +4761,7 @@
         <w:fldChar w:fldCharType="begin"/>
       </w:r>
       <w:r>
-        <w:instrText xml:space="preserve"> PAGEREF _Toc5570 \h </w:instrText>
+        <w:instrText xml:space="preserve"> PAGEREF _Toc8204 \h </w:instrText>
       </w:r>
       <w:r>
         <w:fldChar w:fldCharType="separate"/>
@@ -4795,7 +4787,7 @@
         <w:fldChar w:fldCharType="begin"/>
       </w:r>
       <w:r>
-        <w:instrText xml:space="preserve"> HYPERLINK \l _Toc3561 </w:instrText>
+        <w:instrText xml:space="preserve"> HYPERLINK \l _Toc5106 </w:instrText>
       </w:r>
       <w:r>
         <w:fldChar w:fldCharType="separate"/>
@@ -4810,7 +4802,7 @@
         <w:fldChar w:fldCharType="begin"/>
       </w:r>
       <w:r>
-        <w:instrText xml:space="preserve"> PAGEREF _Toc3561 \h </w:instrText>
+        <w:instrText xml:space="preserve"> PAGEREF _Toc5106 \h </w:instrText>
       </w:r>
       <w:r>
         <w:fldChar w:fldCharType="separate"/>
@@ -4836,7 +4828,7 @@
         <w:fldChar w:fldCharType="begin"/>
       </w:r>
       <w:r>
-        <w:instrText xml:space="preserve"> HYPERLINK \l _Toc13554 </w:instrText>
+        <w:instrText xml:space="preserve"> HYPERLINK \l _Toc24234 </w:instrText>
       </w:r>
       <w:r>
         <w:fldChar w:fldCharType="separate"/>
@@ -4851,7 +4843,7 @@
         <w:fldChar w:fldCharType="begin"/>
       </w:r>
       <w:r>
-        <w:instrText xml:space="preserve"> PAGEREF _Toc13554 \h </w:instrText>
+        <w:instrText xml:space="preserve"> PAGEREF _Toc24234 \h </w:instrText>
       </w:r>
       <w:r>
         <w:fldChar w:fldCharType="separate"/>
@@ -4877,7 +4869,7 @@
         <w:fldChar w:fldCharType="begin"/>
       </w:r>
       <w:r>
-        <w:instrText xml:space="preserve"> HYPERLINK \l _Toc1739 </w:instrText>
+        <w:instrText xml:space="preserve"> HYPERLINK \l _Toc5750 </w:instrText>
       </w:r>
       <w:r>
         <w:fldChar w:fldCharType="separate"/>
@@ -4892,7 +4884,7 @@
         <w:fldChar w:fldCharType="begin"/>
       </w:r>
       <w:r>
-        <w:instrText xml:space="preserve"> PAGEREF _Toc1739 \h </w:instrText>
+        <w:instrText xml:space="preserve"> PAGEREF _Toc5750 \h </w:instrText>
       </w:r>
       <w:r>
         <w:fldChar w:fldCharType="separate"/>
@@ -4918,7 +4910,7 @@
         <w:fldChar w:fldCharType="begin"/>
       </w:r>
       <w:r>
-        <w:instrText xml:space="preserve"> HYPERLINK \l _Toc7187 </w:instrText>
+        <w:instrText xml:space="preserve"> HYPERLINK \l _Toc17828 </w:instrText>
       </w:r>
       <w:r>
         <w:fldChar w:fldCharType="separate"/>
@@ -4933,7 +4925,7 @@
         <w:fldChar w:fldCharType="begin"/>
       </w:r>
       <w:r>
-        <w:instrText xml:space="preserve"> PAGEREF _Toc7187 \h </w:instrText>
+        <w:instrText xml:space="preserve"> PAGEREF _Toc17828 \h </w:instrText>
       </w:r>
       <w:r>
         <w:fldChar w:fldCharType="separate"/>
@@ -4959,7 +4951,7 @@
         <w:fldChar w:fldCharType="begin"/>
       </w:r>
       <w:r>
-        <w:instrText xml:space="preserve"> HYPERLINK \l _Toc23729 </w:instrText>
+        <w:instrText xml:space="preserve"> HYPERLINK \l _Toc6422 </w:instrText>
       </w:r>
       <w:r>
         <w:fldChar w:fldCharType="separate"/>
@@ -4974,7 +4966,7 @@
         <w:fldChar w:fldCharType="begin"/>
       </w:r>
       <w:r>
-        <w:instrText xml:space="preserve"> PAGEREF _Toc23729 \h </w:instrText>
+        <w:instrText xml:space="preserve"> PAGEREF _Toc6422 \h </w:instrText>
       </w:r>
       <w:r>
         <w:fldChar w:fldCharType="separate"/>
@@ -5000,7 +4992,7 @@
         <w:fldChar w:fldCharType="begin"/>
       </w:r>
       <w:r>
-        <w:instrText xml:space="preserve"> HYPERLINK \l _Toc30373 </w:instrText>
+        <w:instrText xml:space="preserve"> HYPERLINK \l _Toc3519 </w:instrText>
       </w:r>
       <w:r>
         <w:fldChar w:fldCharType="separate"/>
@@ -5015,7 +5007,7 @@
         <w:fldChar w:fldCharType="begin"/>
       </w:r>
       <w:r>
-        <w:instrText xml:space="preserve"> PAGEREF _Toc30373 \h </w:instrText>
+        <w:instrText xml:space="preserve"> PAGEREF _Toc3519 \h </w:instrText>
       </w:r>
       <w:r>
         <w:fldChar w:fldCharType="separate"/>
@@ -5041,7 +5033,7 @@
         <w:fldChar w:fldCharType="begin"/>
       </w:r>
       <w:r>
-        <w:instrText xml:space="preserve"> HYPERLINK \l _Toc15820 </w:instrText>
+        <w:instrText xml:space="preserve"> HYPERLINK \l _Toc27900 </w:instrText>
       </w:r>
       <w:r>
         <w:fldChar w:fldCharType="separate"/>
@@ -5056,7 +5048,7 @@
         <w:fldChar w:fldCharType="begin"/>
       </w:r>
       <w:r>
-        <w:instrText xml:space="preserve"> PAGEREF _Toc15820 \h </w:instrText>
+        <w:instrText xml:space="preserve"> PAGEREF _Toc27900 \h </w:instrText>
       </w:r>
       <w:r>
         <w:fldChar w:fldCharType="separate"/>
@@ -5651,7 +5643,7 @@
         <w:fldChar w:fldCharType="begin"/>
       </w:r>
       <w:r>
-        <w:instrText xml:space="preserve"> HYPERLINK \l _Toc28673 </w:instrText>
+        <w:instrText xml:space="preserve"> HYPERLINK \l _Toc14599 </w:instrText>
       </w:r>
       <w:r>
         <w:fldChar w:fldCharType="separate"/>
@@ -5666,7 +5658,7 @@
         <w:fldChar w:fldCharType="begin"/>
       </w:r>
       <w:r>
-        <w:instrText xml:space="preserve"> PAGEREF _Toc28673 \h </w:instrText>
+        <w:instrText xml:space="preserve"> PAGEREF _Toc14599 \h </w:instrText>
       </w:r>
       <w:r>
         <w:fldChar w:fldCharType="separate"/>
@@ -5692,7 +5684,7 @@
         <w:fldChar w:fldCharType="begin"/>
       </w:r>
       <w:r>
-        <w:instrText xml:space="preserve"> HYPERLINK \l _Toc11859 </w:instrText>
+        <w:instrText xml:space="preserve"> HYPERLINK \l _Toc29517 </w:instrText>
       </w:r>
       <w:r>
         <w:fldChar w:fldCharType="separate"/>
@@ -5707,7 +5699,7 @@
         <w:fldChar w:fldCharType="begin"/>
       </w:r>
       <w:r>
-        <w:instrText xml:space="preserve"> PAGEREF _Toc11859 \h </w:instrText>
+        <w:instrText xml:space="preserve"> PAGEREF _Toc29517 \h </w:instrText>
       </w:r>
       <w:r>
         <w:fldChar w:fldCharType="separate"/>
@@ -5733,7 +5725,7 @@
         <w:fldChar w:fldCharType="begin"/>
       </w:r>
       <w:r>
-        <w:instrText xml:space="preserve"> HYPERLINK \l _Toc28857 </w:instrText>
+        <w:instrText xml:space="preserve"> HYPERLINK \l _Toc5689 </w:instrText>
       </w:r>
       <w:r>
         <w:fldChar w:fldCharType="separate"/>
@@ -5748,7 +5740,7 @@
         <w:fldChar w:fldCharType="begin"/>
       </w:r>
       <w:r>
-        <w:instrText xml:space="preserve"> PAGEREF _Toc28857 \h </w:instrText>
+        <w:instrText xml:space="preserve"> PAGEREF _Toc5689 \h </w:instrText>
       </w:r>
       <w:r>
         <w:fldChar w:fldCharType="separate"/>
@@ -5774,7 +5766,7 @@
         <w:fldChar w:fldCharType="begin"/>
       </w:r>
       <w:r>
-        <w:instrText xml:space="preserve"> HYPERLINK \l _Toc31971 </w:instrText>
+        <w:instrText xml:space="preserve"> HYPERLINK \l _Toc29038 </w:instrText>
       </w:r>
       <w:r>
         <w:fldChar w:fldCharType="separate"/>
@@ -5789,7 +5781,7 @@
         <w:fldChar w:fldCharType="begin"/>
       </w:r>
       <w:r>
-        <w:instrText xml:space="preserve"> PAGEREF _Toc31971 \h </w:instrText>
+        <w:instrText xml:space="preserve"> PAGEREF _Toc29038 \h </w:instrText>
       </w:r>
       <w:r>
         <w:fldChar w:fldCharType="separate"/>
@@ -5815,7 +5807,7 @@
         <w:fldChar w:fldCharType="begin"/>
       </w:r>
       <w:r>
-        <w:instrText xml:space="preserve"> HYPERLINK \l _Toc15362 </w:instrText>
+        <w:instrText xml:space="preserve"> HYPERLINK \l _Toc10321 </w:instrText>
       </w:r>
       <w:r>
         <w:fldChar w:fldCharType="separate"/>
@@ -5830,7 +5822,7 @@
         <w:fldChar w:fldCharType="begin"/>
       </w:r>
       <w:r>
-        <w:instrText xml:space="preserve"> PAGEREF _Toc15362 \h </w:instrText>
+        <w:instrText xml:space="preserve"> PAGEREF _Toc10321 \h </w:instrText>
       </w:r>
       <w:r>
         <w:fldChar w:fldCharType="separate"/>
@@ -5856,7 +5848,7 @@
         <w:fldChar w:fldCharType="begin"/>
       </w:r>
       <w:r>
-        <w:instrText xml:space="preserve"> HYPERLINK \l _Toc31422 </w:instrText>
+        <w:instrText xml:space="preserve"> HYPERLINK \l _Toc11476 </w:instrText>
       </w:r>
       <w:r>
         <w:fldChar w:fldCharType="separate"/>
@@ -5871,7 +5863,7 @@
         <w:fldChar w:fldCharType="begin"/>
       </w:r>
       <w:r>
-        <w:instrText xml:space="preserve"> PAGEREF _Toc31422 \h </w:instrText>
+        <w:instrText xml:space="preserve"> PAGEREF _Toc11476 \h </w:instrText>
       </w:r>
       <w:r>
         <w:fldChar w:fldCharType="separate"/>
@@ -5897,7 +5889,7 @@
         <w:fldChar w:fldCharType="begin"/>
       </w:r>
       <w:r>
-        <w:instrText xml:space="preserve"> HYPERLINK \l _Toc5488 </w:instrText>
+        <w:instrText xml:space="preserve"> HYPERLINK \l _Toc23477 </w:instrText>
       </w:r>
       <w:r>
         <w:fldChar w:fldCharType="separate"/>
@@ -5909,7 +5901,7 @@
         <w:sdtPr>
           <w:alias w:val="MÃ CA TRUY VẾT"/>
           <w:tag w:val="SV_0120"/>
-          <w:id w:val="147458372"/>
+          <w:id w:val="147464658"/>
           <w:text w:multiLine="1"/>
         </w:sdtPr>
         <w:sdtContent>
@@ -5925,7 +5917,7 @@
         <w:fldChar w:fldCharType="begin"/>
       </w:r>
       <w:r>
-        <w:instrText xml:space="preserve"> PAGEREF _Toc5488 \h </w:instrText>
+        <w:instrText xml:space="preserve"> PAGEREF _Toc23477 \h </w:instrText>
       </w:r>
       <w:r>
         <w:fldChar w:fldCharType="separate"/>
@@ -5951,7 +5943,7 @@
         <w:fldChar w:fldCharType="begin"/>
       </w:r>
       <w:r>
-        <w:instrText xml:space="preserve"> HYPERLINK \l _Toc7962 </w:instrText>
+        <w:instrText xml:space="preserve"> HYPERLINK \l _Toc12809 </w:instrText>
       </w:r>
       <w:r>
         <w:fldChar w:fldCharType="separate"/>
@@ -5966,7 +5958,7 @@
         <w:fldChar w:fldCharType="begin"/>
       </w:r>
       <w:r>
-        <w:instrText xml:space="preserve"> PAGEREF _Toc7962 \h </w:instrText>
+        <w:instrText xml:space="preserve"> PAGEREF _Toc12809 \h </w:instrText>
       </w:r>
       <w:r>
         <w:fldChar w:fldCharType="separate"/>
@@ -5992,7 +5984,7 @@
         <w:fldChar w:fldCharType="begin"/>
       </w:r>
       <w:r>
-        <w:instrText xml:space="preserve"> HYPERLINK \l _Toc6538 </w:instrText>
+        <w:instrText xml:space="preserve"> HYPERLINK \l _Toc32149 </w:instrText>
       </w:r>
       <w:r>
         <w:fldChar w:fldCharType="separate"/>
@@ -6007,7 +5999,7 @@
         <w:fldChar w:fldCharType="begin"/>
       </w:r>
       <w:r>
-        <w:instrText xml:space="preserve"> PAGEREF _Toc6538 \h </w:instrText>
+        <w:instrText xml:space="preserve"> PAGEREF _Toc32149 \h </w:instrText>
       </w:r>
       <w:r>
         <w:fldChar w:fldCharType="separate"/>
@@ -6033,7 +6025,7 @@
         <w:fldChar w:fldCharType="begin"/>
       </w:r>
       <w:r>
-        <w:instrText xml:space="preserve"> HYPERLINK \l _Toc13797 </w:instrText>
+        <w:instrText xml:space="preserve"> HYPERLINK \l _Toc2306 </w:instrText>
       </w:r>
       <w:r>
         <w:fldChar w:fldCharType="separate"/>
@@ -6048,7 +6040,7 @@
         <w:fldChar w:fldCharType="begin"/>
       </w:r>
       <w:r>
-        <w:instrText xml:space="preserve"> PAGEREF _Toc13797 \h </w:instrText>
+        <w:instrText xml:space="preserve"> PAGEREF _Toc2306 \h </w:instrText>
       </w:r>
       <w:r>
         <w:fldChar w:fldCharType="separate"/>
@@ -6074,7 +6066,7 @@
         <w:fldChar w:fldCharType="begin"/>
       </w:r>
       <w:r>
-        <w:instrText xml:space="preserve"> HYPERLINK \l _Toc2045 </w:instrText>
+        <w:instrText xml:space="preserve"> HYPERLINK \l _Toc20349 </w:instrText>
       </w:r>
       <w:r>
         <w:fldChar w:fldCharType="separate"/>
@@ -6089,7 +6081,7 @@
         <w:fldChar w:fldCharType="begin"/>
       </w:r>
       <w:r>
-        <w:instrText xml:space="preserve"> PAGEREF _Toc2045 \h </w:instrText>
+        <w:instrText xml:space="preserve"> PAGEREF _Toc20349 \h </w:instrText>
       </w:r>
       <w:r>
         <w:fldChar w:fldCharType="separate"/>
@@ -6115,7 +6107,7 @@
         <w:fldChar w:fldCharType="begin"/>
       </w:r>
       <w:r>
-        <w:instrText xml:space="preserve"> HYPERLINK \l _Toc32168 </w:instrText>
+        <w:instrText xml:space="preserve"> HYPERLINK \l _Toc26875 </w:instrText>
       </w:r>
       <w:r>
         <w:fldChar w:fldCharType="separate"/>
@@ -6130,7 +6122,7 @@
         <w:fldChar w:fldCharType="begin"/>
       </w:r>
       <w:r>
-        <w:instrText xml:space="preserve"> PAGEREF _Toc32168 \h </w:instrText>
+        <w:instrText xml:space="preserve"> PAGEREF _Toc26875 \h </w:instrText>
       </w:r>
       <w:r>
         <w:fldChar w:fldCharType="separate"/>
@@ -6156,7 +6148,7 @@
         <w:fldChar w:fldCharType="begin"/>
       </w:r>
       <w:r>
-        <w:instrText xml:space="preserve"> HYPERLINK \l _Toc29823 </w:instrText>
+        <w:instrText xml:space="preserve"> HYPERLINK \l _Toc8226 </w:instrText>
       </w:r>
       <w:r>
         <w:fldChar w:fldCharType="separate"/>
@@ -6171,7 +6163,7 @@
         <w:fldChar w:fldCharType="begin"/>
       </w:r>
       <w:r>
-        <w:instrText xml:space="preserve"> PAGEREF _Toc29823 \h </w:instrText>
+        <w:instrText xml:space="preserve"> PAGEREF _Toc8226 \h </w:instrText>
       </w:r>
       <w:r>
         <w:fldChar w:fldCharType="separate"/>
@@ -6197,7 +6189,7 @@
         <w:fldChar w:fldCharType="begin"/>
       </w:r>
       <w:r>
-        <w:instrText xml:space="preserve"> HYPERLINK \l _Toc30056 </w:instrText>
+        <w:instrText xml:space="preserve"> HYPERLINK \l _Toc20603 </w:instrText>
       </w:r>
       <w:r>
         <w:fldChar w:fldCharType="separate"/>
@@ -6212,7 +6204,7 @@
         <w:fldChar w:fldCharType="begin"/>
       </w:r>
       <w:r>
-        <w:instrText xml:space="preserve"> PAGEREF _Toc30056 \h </w:instrText>
+        <w:instrText xml:space="preserve"> PAGEREF _Toc20603 \h </w:instrText>
       </w:r>
       <w:r>
         <w:fldChar w:fldCharType="separate"/>
@@ -6238,7 +6230,7 @@
         <w:fldChar w:fldCharType="begin"/>
       </w:r>
       <w:r>
-        <w:instrText xml:space="preserve"> HYPERLINK \l _Toc15255 </w:instrText>
+        <w:instrText xml:space="preserve"> HYPERLINK \l _Toc23540 </w:instrText>
       </w:r>
       <w:r>
         <w:fldChar w:fldCharType="separate"/>
@@ -6253,7 +6245,7 @@
         <w:fldChar w:fldCharType="begin"/>
       </w:r>
       <w:r>
-        <w:instrText xml:space="preserve"> PAGEREF _Toc15255 \h </w:instrText>
+        <w:instrText xml:space="preserve"> PAGEREF _Toc23540 \h </w:instrText>
       </w:r>
       <w:r>
         <w:fldChar w:fldCharType="separate"/>
@@ -6327,7 +6319,7 @@
         <w:fldChar w:fldCharType="begin"/>
       </w:r>
       <w:r>
-        <w:instrText xml:space="preserve"> HYPERLINK \l _Toc17132 </w:instrText>
+        <w:instrText xml:space="preserve"> HYPERLINK \l _Toc23301 </w:instrText>
       </w:r>
       <w:r>
         <w:fldChar w:fldCharType="separate"/>
@@ -6339,7 +6331,7 @@
         <w:sdtPr>
           <w:alias w:val="MÃ CA HOẶC ĐỐI TƯỢNG"/>
           <w:tag w:val="SV_0265"/>
-          <w:id w:val="147468777"/>
+          <w:id w:val="147461596"/>
           <w:text w:multiLine="1"/>
         </w:sdtPr>
         <w:sdtContent>
@@ -6355,7 +6347,7 @@
         <w:fldChar w:fldCharType="begin"/>
       </w:r>
       <w:r>
-        <w:instrText xml:space="preserve"> PAGEREF _Toc17132 \h </w:instrText>
+        <w:instrText xml:space="preserve"> PAGEREF _Toc23301 \h </w:instrText>
       </w:r>
       <w:r>
         <w:fldChar w:fldCharType="separate"/>
@@ -6381,7 +6373,7 @@
         <w:fldChar w:fldCharType="begin"/>
       </w:r>
       <w:r>
-        <w:instrText xml:space="preserve"> HYPERLINK \l _Toc6512 </w:instrText>
+        <w:instrText xml:space="preserve"> HYPERLINK \l _Toc11687 </w:instrText>
       </w:r>
       <w:r>
         <w:fldChar w:fldCharType="separate"/>
@@ -6393,7 +6385,7 @@
         <w:sdtPr>
           <w:alias w:val="MÃ CA HOẶC ĐỐI TƯỢNG"/>
           <w:tag w:val="SV_0274"/>
-          <w:id w:val="147454839"/>
+          <w:id w:val="147471292"/>
           <w:text w:multiLine="1"/>
         </w:sdtPr>
         <w:sdtContent>
@@ -6409,7 +6401,7 @@
         <w:fldChar w:fldCharType="begin"/>
       </w:r>
       <w:r>
-        <w:instrText xml:space="preserve"> PAGEREF _Toc6512 \h </w:instrText>
+        <w:instrText xml:space="preserve"> PAGEREF _Toc11687 \h </w:instrText>
       </w:r>
       <w:r>
         <w:fldChar w:fldCharType="separate"/>
@@ -6435,7 +6427,7 @@
         <w:fldChar w:fldCharType="begin"/>
       </w:r>
       <w:r>
-        <w:instrText xml:space="preserve"> HYPERLINK \l _Toc2251 </w:instrText>
+        <w:instrText xml:space="preserve"> HYPERLINK \l _Toc7989 </w:instrText>
       </w:r>
       <w:r>
         <w:fldChar w:fldCharType="separate"/>
@@ -6447,7 +6439,7 @@
         <w:sdtPr>
           <w:alias w:val="MÃ CA HOẶC ĐỐI TƯỢNG"/>
           <w:tag w:val="SV_0278"/>
-          <w:id w:val="147482026"/>
+          <w:id w:val="147477946"/>
           <w:text w:multiLine="1"/>
         </w:sdtPr>
         <w:sdtContent>
@@ -6463,7 +6455,7 @@
         <w:fldChar w:fldCharType="begin"/>
       </w:r>
       <w:r>
-        <w:instrText xml:space="preserve"> PAGEREF _Toc2251 \h </w:instrText>
+        <w:instrText xml:space="preserve"> PAGEREF _Toc7989 \h </w:instrText>
       </w:r>
       <w:r>
         <w:fldChar w:fldCharType="separate"/>
@@ -6489,7 +6481,7 @@
         <w:fldChar w:fldCharType="begin"/>
       </w:r>
       <w:r>
-        <w:instrText xml:space="preserve"> HYPERLINK \l _Toc6516 </w:instrText>
+        <w:instrText xml:space="preserve"> HYPERLINK \l _Toc25440 </w:instrText>
       </w:r>
       <w:r>
         <w:fldChar w:fldCharType="separate"/>
@@ -6501,7 +6493,7 @@
         <w:sdtPr>
           <w:alias w:val="MÃ CA HOẶC ĐỐI TƯỢNG"/>
           <w:tag w:val="SV_0282"/>
-          <w:id w:val="147471693"/>
+          <w:id w:val="147471093"/>
           <w:text w:multiLine="1"/>
         </w:sdtPr>
         <w:sdtContent>
@@ -6517,7 +6509,7 @@
         <w:fldChar w:fldCharType="begin"/>
       </w:r>
       <w:r>
-        <w:instrText xml:space="preserve"> PAGEREF _Toc6516 \h </w:instrText>
+        <w:instrText xml:space="preserve"> PAGEREF _Toc25440 \h </w:instrText>
       </w:r>
       <w:r>
         <w:fldChar w:fldCharType="separate"/>
@@ -6543,7 +6535,7 @@
         <w:fldChar w:fldCharType="begin"/>
       </w:r>
       <w:r>
-        <w:instrText xml:space="preserve"> HYPERLINK \l _Toc25849 </w:instrText>
+        <w:instrText xml:space="preserve"> HYPERLINK \l _Toc3279 </w:instrText>
       </w:r>
       <w:r>
         <w:fldChar w:fldCharType="separate"/>
@@ -6555,7 +6547,7 @@
         <w:sdtPr>
           <w:alias w:val="MÃ CA HOẶC ĐỐI TƯỢNG"/>
           <w:tag w:val="SV_0287"/>
-          <w:id w:val="147452739"/>
+          <w:id w:val="147468146"/>
           <w:text w:multiLine="1"/>
         </w:sdtPr>
         <w:sdtContent>
@@ -6571,7 +6563,7 @@
         <w:fldChar w:fldCharType="begin"/>
       </w:r>
       <w:r>
-        <w:instrText xml:space="preserve"> PAGEREF _Toc25849 \h </w:instrText>
+        <w:instrText xml:space="preserve"> PAGEREF _Toc3279 \h </w:instrText>
       </w:r>
       <w:r>
         <w:fldChar w:fldCharType="separate"/>
@@ -6597,7 +6589,7 @@
         <w:fldChar w:fldCharType="begin"/>
       </w:r>
       <w:r>
-        <w:instrText xml:space="preserve"> HYPERLINK \l _Toc31962 </w:instrText>
+        <w:instrText xml:space="preserve"> HYPERLINK \l _Toc11618 </w:instrText>
       </w:r>
       <w:r>
         <w:fldChar w:fldCharType="separate"/>
@@ -6609,7 +6601,7 @@
         <w:sdtPr>
           <w:alias w:val="MÃ CA HOẶC ĐỐI TƯỢNG"/>
           <w:tag w:val="SV_0291"/>
-          <w:id w:val="147479569"/>
+          <w:id w:val="147483643"/>
           <w:text w:multiLine="1"/>
         </w:sdtPr>
         <w:sdtContent>
@@ -6625,7 +6617,7 @@
         <w:fldChar w:fldCharType="begin"/>
       </w:r>
       <w:r>
-        <w:instrText xml:space="preserve"> PAGEREF _Toc31962 \h </w:instrText>
+        <w:instrText xml:space="preserve"> PAGEREF _Toc11618 \h </w:instrText>
       </w:r>
       <w:r>
         <w:fldChar w:fldCharType="separate"/>
@@ -6651,7 +6643,7 @@
         <w:fldChar w:fldCharType="begin"/>
       </w:r>
       <w:r>
-        <w:instrText xml:space="preserve"> HYPERLINK \l _Toc11542 </w:instrText>
+        <w:instrText xml:space="preserve"> HYPERLINK \l _Toc14583 </w:instrText>
       </w:r>
       <w:r>
         <w:fldChar w:fldCharType="separate"/>
@@ -6663,7 +6655,7 @@
         <w:sdtPr>
           <w:alias w:val="MÃ CA HOẶC ĐỐI TƯỢNG"/>
           <w:tag w:val="SV_0296"/>
-          <w:id w:val="147455399"/>
+          <w:id w:val="147461300"/>
           <w:text w:multiLine="1"/>
         </w:sdtPr>
         <w:sdtContent>
@@ -6679,7 +6671,7 @@
         <w:fldChar w:fldCharType="begin"/>
       </w:r>
       <w:r>
-        <w:instrText xml:space="preserve"> PAGEREF _Toc11542 \h </w:instrText>
+        <w:instrText xml:space="preserve"> PAGEREF _Toc14583 \h </w:instrText>
       </w:r>
       <w:r>
         <w:fldChar w:fldCharType="separate"/>
@@ -6705,7 +6697,7 @@
         <w:fldChar w:fldCharType="begin"/>
       </w:r>
       <w:r>
-        <w:instrText xml:space="preserve"> HYPERLINK \l _Toc16179 </w:instrText>
+        <w:instrText xml:space="preserve"> HYPERLINK \l _Toc17019 </w:instrText>
       </w:r>
       <w:r>
         <w:fldChar w:fldCharType="separate"/>
@@ -6717,7 +6709,7 @@
         <w:sdtPr>
           <w:alias w:val="MÃ CA HOẶC ĐỐI TƯỢNG"/>
           <w:tag w:val="SV_0300"/>
-          <w:id w:val="147476661"/>
+          <w:id w:val="147471006"/>
           <w:text w:multiLine="1"/>
         </w:sdtPr>
         <w:sdtContent>
@@ -6733,7 +6725,7 @@
         <w:fldChar w:fldCharType="begin"/>
       </w:r>
       <w:r>
-        <w:instrText xml:space="preserve"> PAGEREF _Toc16179 \h </w:instrText>
+        <w:instrText xml:space="preserve"> PAGEREF _Toc17019 \h </w:instrText>
       </w:r>
       <w:r>
         <w:fldChar w:fldCharType="separate"/>
@@ -6759,7 +6751,7 @@
         <w:fldChar w:fldCharType="begin"/>
       </w:r>
       <w:r>
-        <w:instrText xml:space="preserve"> HYPERLINK \l _Toc16667 </w:instrText>
+        <w:instrText xml:space="preserve"> HYPERLINK \l _Toc1176 </w:instrText>
       </w:r>
       <w:r>
         <w:fldChar w:fldCharType="separate"/>
@@ -6771,7 +6763,7 @@
         <w:sdtPr>
           <w:alias w:val="MÃ CA HOẶC ĐỐI TƯỢNG"/>
           <w:tag w:val="SV_0304"/>
-          <w:id w:val="147459248"/>
+          <w:id w:val="147453807"/>
           <w:text w:multiLine="1"/>
         </w:sdtPr>
         <w:sdtContent>
@@ -6787,7 +6779,7 @@
         <w:fldChar w:fldCharType="begin"/>
       </w:r>
       <w:r>
-        <w:instrText xml:space="preserve"> PAGEREF _Toc16667 \h </w:instrText>
+        <w:instrText xml:space="preserve"> PAGEREF _Toc1176 \h </w:instrText>
       </w:r>
       <w:r>
         <w:fldChar w:fldCharType="separate"/>
@@ -6813,7 +6805,7 @@
         <w:fldChar w:fldCharType="begin"/>
       </w:r>
       <w:r>
-        <w:instrText xml:space="preserve"> HYPERLINK \l _Toc28825 </w:instrText>
+        <w:instrText xml:space="preserve"> HYPERLINK \l _Toc14325 </w:instrText>
       </w:r>
       <w:r>
         <w:fldChar w:fldCharType="separate"/>
@@ -6825,7 +6817,7 @@
         <w:sdtPr>
           <w:alias w:val="MÃ CA HOẶC ĐỐI TƯỢNG"/>
           <w:tag w:val="SV_0329"/>
-          <w:id w:val="147481499"/>
+          <w:id w:val="147474655"/>
           <w:text w:multiLine="1"/>
         </w:sdtPr>
         <w:sdtContent>
@@ -6841,7 +6833,7 @@
         <w:fldChar w:fldCharType="begin"/>
       </w:r>
       <w:r>
-        <w:instrText xml:space="preserve"> PAGEREF _Toc28825 \h </w:instrText>
+        <w:instrText xml:space="preserve"> PAGEREF _Toc14325 \h </w:instrText>
       </w:r>
       <w:r>
         <w:fldChar w:fldCharType="separate"/>
@@ -6867,7 +6859,7 @@
         <w:fldChar w:fldCharType="begin"/>
       </w:r>
       <w:r>
-        <w:instrText xml:space="preserve"> HYPERLINK \l _Toc26803 </w:instrText>
+        <w:instrText xml:space="preserve"> HYPERLINK \l _Toc12212 </w:instrText>
       </w:r>
       <w:r>
         <w:fldChar w:fldCharType="separate"/>
@@ -6879,7 +6871,7 @@
         <w:sdtPr>
           <w:alias w:val="MÃ CA HOẶC ĐỐI TƯỢNG"/>
           <w:tag w:val="SV_0332"/>
-          <w:id w:val="147455828"/>
+          <w:id w:val="147472955"/>
           <w:text w:multiLine="1"/>
         </w:sdtPr>
         <w:sdtContent>
@@ -6895,7 +6887,7 @@
         <w:fldChar w:fldCharType="begin"/>
       </w:r>
       <w:r>
-        <w:instrText xml:space="preserve"> PAGEREF _Toc26803 \h </w:instrText>
+        <w:instrText xml:space="preserve"> PAGEREF _Toc12212 \h </w:instrText>
       </w:r>
       <w:r>
         <w:fldChar w:fldCharType="separate"/>
@@ -6933,7 +6925,7 @@
         <w:keepNext w:val="0"/>
         <w:spacing w:before="0" w:after="320"/>
       </w:pPr>
-      <w:bookmarkStart w:id="7" w:name="_Toc4352"/>
+      <w:bookmarkStart w:id="7" w:name="_Toc30086"/>
       <w:r>
         <w:t>CHƯƠNG 1. TỔNG QUAN ĐỀ TÀI</w:t>
       </w:r>
@@ -6943,7 +6935,7 @@
       <w:pPr>
         <w:pStyle w:val="3"/>
       </w:pPr>
-      <w:bookmarkStart w:id="8" w:name="_Toc20576"/>
+      <w:bookmarkStart w:id="8" w:name="_Toc17680"/>
       <w:r>
         <w:t>1.1. Bài toán và lý do thực hiện</w:t>
       </w:r>
@@ -7030,7 +7022,7 @@
       <w:pPr>
         <w:pStyle w:val="3"/>
       </w:pPr>
-      <w:bookmarkStart w:id="9" w:name="_Toc21767"/>
+      <w:bookmarkStart w:id="9" w:name="_Toc2823"/>
       <w:r>
         <w:t>1.2. Mục tiêu và sản phẩm</w:t>
       </w:r>
@@ -7153,7 +7145,7 @@
       <w:pPr>
         <w:pStyle w:val="3"/>
       </w:pPr>
-      <w:bookmarkStart w:id="10" w:name="_Toc9195"/>
+      <w:bookmarkStart w:id="10" w:name="_Toc5457"/>
       <w:r>
         <w:t>1.3. Phạm vi, đầu vào và đầu ra</w:t>
       </w:r>
@@ -7389,7 +7381,7 @@
         <w:spacing w:before="0" w:after="100" w:line="269" w:lineRule="auto"/>
         <w:jc w:val="left"/>
       </w:pPr>
-      <w:bookmarkStart w:id="11" w:name="_Toc28673"/>
+      <w:bookmarkStart w:id="11" w:name="_Toc14599"/>
       <w:r>
         <w:t>Bảng 1.1 Đặc tả dữ liệu vào</w:t>
       </w:r>
@@ -7830,7 +7822,7 @@
         <w:spacing w:before="0" w:after="100" w:line="269" w:lineRule="auto"/>
         <w:jc w:val="left"/>
       </w:pPr>
-      <w:bookmarkStart w:id="12" w:name="_Toc11859"/>
+      <w:bookmarkStart w:id="12" w:name="_Toc29517"/>
       <w:r>
         <w:t>Bảng 1.2 Đặc tả kết quả đầu ra</w:t>
       </w:r>
@@ -7865,14 +7857,6 @@
       </w:tblGrid>
       <w:tr>
         <w:tblPrEx>
-          <w:tblBorders>
-            <w:top w:val="single" w:color="D9D9D9" w:sz="4" w:space="0"/>
-            <w:left w:val="single" w:color="D9D9D9" w:sz="4" w:space="0"/>
-            <w:bottom w:val="single" w:color="D9D9D9" w:sz="4" w:space="0"/>
-            <w:right w:val="single" w:color="D9D9D9" w:sz="4" w:space="0"/>
-            <w:insideH w:val="single" w:color="D9D9D9" w:sz="4" w:space="0"/>
-            <w:insideV w:val="single" w:color="D9D9D9" w:sz="4" w:space="0"/>
-          </w:tblBorders>
           <w:tblCellMar>
             <w:top w:w="80" w:type="dxa"/>
             <w:left w:w="80" w:type="dxa"/>
@@ -8182,7 +8166,7 @@
       <w:pPr>
         <w:pStyle w:val="3"/>
       </w:pPr>
-      <w:bookmarkStart w:id="13" w:name="_Toc28964"/>
+      <w:bookmarkStart w:id="13" w:name="_Toc13333"/>
       <w:r>
         <w:t>1.4. Cách thực hiện và cấu trúc báo cáo</w:t>
       </w:r>
@@ -8342,7 +8326,7 @@
         <w:pStyle w:val="174"/>
         <w:spacing w:before="80" w:after="100" w:line="269" w:lineRule="auto"/>
       </w:pPr>
-      <w:bookmarkStart w:id="14" w:name="_Toc28857"/>
+      <w:bookmarkStart w:id="14" w:name="_Toc5689"/>
       <w:r>
         <w:t>Bảng 1.3 Đối chiếu yêu cầu và sản phẩm</w:t>
       </w:r>
@@ -9011,7 +8995,7 @@
         <w:keepNext w:val="0"/>
         <w:spacing w:before="0" w:after="320"/>
       </w:pPr>
-      <w:bookmarkStart w:id="15" w:name="_Toc10876"/>
+      <w:bookmarkStart w:id="15" w:name="_Toc26702"/>
       <w:r>
         <w:t>CHƯƠNG 2. CƠ SỞ LÝ THUYẾT</w:t>
       </w:r>
@@ -9021,7 +9005,7 @@
       <w:pPr>
         <w:pStyle w:val="3"/>
       </w:pPr>
-      <w:bookmarkStart w:id="16" w:name="_Toc28505"/>
+      <w:bookmarkStart w:id="16" w:name="_Toc32196"/>
       <w:r>
         <w:t>2.1. Khái niệm và mô hình dữ liệu</w:t>
       </w:r>
@@ -9153,7 +9137,7 @@
       <w:pPr>
         <w:pStyle w:val="3"/>
       </w:pPr>
-      <w:bookmarkStart w:id="17" w:name="_Toc4680"/>
+      <w:bookmarkStart w:id="17" w:name="_Toc15344"/>
       <w:r>
         <w:t>2.2. Cấu trúc dữ liệu sử dụng</w:t>
       </w:r>
@@ -9406,7 +9390,7 @@
         <w:pStyle w:val="174"/>
         <w:spacing w:before="80" w:after="100" w:line="269" w:lineRule="auto"/>
       </w:pPr>
-      <w:bookmarkStart w:id="18" w:name="_Toc31971"/>
+      <w:bookmarkStart w:id="18" w:name="_Toc29038"/>
       <w:r>
         <w:t>Bảng 2.1 Biến cấu trúc và điều kiện phải duy trì</w:t>
       </w:r>
@@ -9440,14 +9424,6 @@
       </w:tblGrid>
       <w:tr>
         <w:tblPrEx>
-          <w:tblBorders>
-            <w:top w:val="single" w:color="D9D9D9" w:sz="4" w:space="0"/>
-            <w:left w:val="single" w:color="D9D9D9" w:sz="4" w:space="0"/>
-            <w:bottom w:val="single" w:color="D9D9D9" w:sz="4" w:space="0"/>
-            <w:right w:val="single" w:color="D9D9D9" w:sz="4" w:space="0"/>
-            <w:insideH w:val="single" w:color="D9D9D9" w:sz="4" w:space="0"/>
-            <w:insideV w:val="single" w:color="D9D9D9" w:sz="4" w:space="0"/>
-          </w:tblBorders>
           <w:tblCellMar>
             <w:top w:w="70" w:type="dxa"/>
             <w:left w:w="70" w:type="dxa"/>
@@ -9821,7 +9797,7 @@
       <w:pPr>
         <w:pStyle w:val="3"/>
       </w:pPr>
-      <w:bookmarkStart w:id="19" w:name="_Toc18521"/>
+      <w:bookmarkStart w:id="19" w:name="_Toc1778"/>
       <w:r>
         <w:t>2.3. Nguyên lý thuật toán</w:t>
       </w:r>
@@ -10055,7 +10031,7 @@
       <w:pPr>
         <w:pStyle w:val="3"/>
       </w:pPr>
-      <w:bookmarkStart w:id="20" w:name="_Toc12093"/>
+      <w:bookmarkStart w:id="20" w:name="_Toc20943"/>
       <w:r>
         <w:t>2.4. Cơ sở đánh giá thời gian và bộ nhớ</w:t>
       </w:r>
@@ -10236,7 +10212,7 @@
         <w:keepNext w:val="0"/>
         <w:spacing w:before="0" w:after="320"/>
       </w:pPr>
-      <w:bookmarkStart w:id="21" w:name="_Toc28220"/>
+      <w:bookmarkStart w:id="21" w:name="_Toc30782"/>
       <w:r>
         <w:t>CHƯƠNG 3. PHÂN TÍCH, THIẾT KẾ VÀ CÀI ĐẶT</w:t>
       </w:r>
@@ -10246,7 +10222,7 @@
       <w:pPr>
         <w:pStyle w:val="3"/>
       </w:pPr>
-      <w:bookmarkStart w:id="22" w:name="_Toc26989"/>
+      <w:bookmarkStart w:id="22" w:name="_Toc4042"/>
       <w:r>
         <w:t>3.1. Phân tích yêu cầu chương trình</w:t>
       </w:r>
@@ -10462,7 +10438,7 @@
       <w:pPr>
         <w:pStyle w:val="3"/>
       </w:pPr>
-      <w:bookmarkStart w:id="23" w:name="_Toc21948"/>
+      <w:bookmarkStart w:id="23" w:name="_Toc2248"/>
       <w:r>
         <w:t>3.2. Thiết kế các hàm và dữ liệu</w:t>
       </w:r>
@@ -10514,7 +10490,7 @@
         <w:pStyle w:val="174"/>
         <w:spacing w:before="80" w:after="100" w:line="269" w:lineRule="auto"/>
       </w:pPr>
-      <w:bookmarkStart w:id="24" w:name="_Toc15362"/>
+      <w:bookmarkStart w:id="24" w:name="_Toc10321"/>
       <w:r>
         <w:t>Bảng 3.1 Tổ chức các hàm và tệp</w:t>
       </w:r>
@@ -11205,7 +11181,7 @@
         <w:spacing w:before="0" w:after="100" w:line="269" w:lineRule="auto"/>
         <w:jc w:val="left"/>
       </w:pPr>
-      <w:bookmarkStart w:id="25" w:name="_Toc31422"/>
+      <w:bookmarkStart w:id="25" w:name="_Toc11476"/>
       <w:r>
         <w:t>Bảng 3.2 Tiền điều kiện và hậu điều kiện của các hàm</w:t>
       </w:r>
@@ -11846,7 +11822,7 @@
       <w:pPr>
         <w:pStyle w:val="3"/>
       </w:pPr>
-      <w:bookmarkStart w:id="26" w:name="_Toc9173"/>
+      <w:bookmarkStart w:id="26" w:name="_Toc32348"/>
       <w:r>
         <w:t>3.3. Thuật toán và mã nguồn chính</w:t>
       </w:r>
@@ -12752,7 +12728,7 @@
       <w:pPr>
         <w:pStyle w:val="3"/>
       </w:pPr>
-      <w:bookmarkStart w:id="27" w:name="_Toc14955"/>
+      <w:bookmarkStart w:id="27" w:name="_Toc23978"/>
       <w:r>
         <w:t>3.4. Lần vết ví dụ nhỏ</w:t>
       </w:r>
@@ -12869,7 +12845,7 @@
         <w:pStyle w:val="174"/>
         <w:spacing w:before="80" w:after="100" w:line="269" w:lineRule="auto"/>
       </w:pPr>
-      <w:bookmarkStart w:id="28" w:name="_Toc5488"/>
+      <w:bookmarkStart w:id="28" w:name="_Toc23477"/>
       <w:r>
         <w:t xml:space="preserve">Bảng 3.3 Truy vết ca </w:t>
       </w:r>
@@ -12918,14 +12894,6 @@
       </w:tblGrid>
       <w:tr>
         <w:tblPrEx>
-          <w:tblBorders>
-            <w:top w:val="single" w:color="D9D9D9" w:sz="4" w:space="0"/>
-            <w:left w:val="single" w:color="D9D9D9" w:sz="4" w:space="0"/>
-            <w:bottom w:val="single" w:color="D9D9D9" w:sz="4" w:space="0"/>
-            <w:right w:val="single" w:color="D9D9D9" w:sz="4" w:space="0"/>
-            <w:insideH w:val="single" w:color="D9D9D9" w:sz="4" w:space="0"/>
-            <w:insideV w:val="single" w:color="D9D9D9" w:sz="4" w:space="0"/>
-          </w:tblBorders>
           <w:tblCellMar>
             <w:top w:w="70" w:type="dxa"/>
             <w:left w:w="70" w:type="dxa"/>
@@ -13547,7 +13515,7 @@
       <w:pPr>
         <w:pStyle w:val="3"/>
       </w:pPr>
-      <w:bookmarkStart w:id="29" w:name="_Toc1596"/>
+      <w:bookmarkStart w:id="29" w:name="_Toc6803"/>
       <w:r>
         <w:t>3.5. Giải thích tính đúng và điều kiện dừng</w:t>
       </w:r>
@@ -13727,7 +13695,7 @@
       <w:pPr>
         <w:pStyle w:val="3"/>
       </w:pPr>
-      <w:bookmarkStart w:id="30" w:name="_Toc32126"/>
+      <w:bookmarkStart w:id="30" w:name="_Toc17041"/>
       <w:r>
         <w:t>3.6. Phân tích độ phức tạp</w:t>
       </w:r>
@@ -13788,7 +13756,7 @@
         <w:spacing w:before="0" w:after="100" w:line="269" w:lineRule="auto"/>
         <w:jc w:val="left"/>
       </w:pPr>
-      <w:bookmarkStart w:id="31" w:name="_Toc7962"/>
+      <w:bookmarkStart w:id="31" w:name="_Toc12809"/>
       <w:r>
         <w:t>Bảng 3.4 Chi phí của từng pha trong bản cài</w:t>
       </w:r>
@@ -14678,7 +14646,7 @@
         <w:keepNext w:val="0"/>
         <w:spacing w:before="0" w:after="320"/>
       </w:pPr>
-      <w:bookmarkStart w:id="32" w:name="_Toc11080"/>
+      <w:bookmarkStart w:id="32" w:name="_Toc8409"/>
       <w:r>
         <w:t>CHƯƠNG 4. KẾT QUẢ THỬ NGHIỆM VÀ NHẬN XÉT</w:t>
       </w:r>
@@ -14688,7 +14656,7 @@
       <w:pPr>
         <w:pStyle w:val="3"/>
       </w:pPr>
-      <w:bookmarkStart w:id="33" w:name="_Toc15402"/>
+      <w:bookmarkStart w:id="33" w:name="_Toc27624"/>
       <w:r>
         <w:t>4.1. Môi trường và kế hoạch kiểm thử</w:t>
       </w:r>
@@ -14904,7 +14872,7 @@
       <w:pPr>
         <w:pStyle w:val="3"/>
       </w:pPr>
-      <w:bookmarkStart w:id="34" w:name="_Toc31736"/>
+      <w:bookmarkStart w:id="34" w:name="_Toc24305"/>
       <w:r>
         <w:t>4.2. Bảng kết quả ít nhất 12 ca</w:t>
       </w:r>
@@ -14980,7 +14948,7 @@
         <w:spacing w:before="0" w:after="100" w:line="269" w:lineRule="auto"/>
         <w:jc w:val="left"/>
       </w:pPr>
-      <w:bookmarkStart w:id="35" w:name="_Toc6538"/>
+      <w:bookmarkStart w:id="35" w:name="_Toc32149"/>
       <w:r>
         <w:t>Bảng 4.1 Ánh xạ năm ca kiểm trên phiếu</w:t>
       </w:r>
@@ -15029,14 +14997,6 @@
       </w:tblGrid>
       <w:tr>
         <w:tblPrEx>
-          <w:tblBorders>
-            <w:top w:val="single" w:color="D9D9D9" w:sz="4" w:space="0"/>
-            <w:left w:val="single" w:color="D9D9D9" w:sz="4" w:space="0"/>
-            <w:bottom w:val="single" w:color="D9D9D9" w:sz="4" w:space="0"/>
-            <w:right w:val="single" w:color="D9D9D9" w:sz="4" w:space="0"/>
-            <w:insideH w:val="single" w:color="D9D9D9" w:sz="4" w:space="0"/>
-            <w:insideV w:val="single" w:color="D9D9D9" w:sz="4" w:space="0"/>
-          </w:tblBorders>
           <w:tblCellMar>
             <w:top w:w="80" w:type="dxa"/>
             <w:left w:w="80" w:type="dxa"/>
@@ -15650,7 +15610,7 @@
         <w:pStyle w:val="174"/>
         <w:spacing w:before="80" w:after="100" w:line="269" w:lineRule="auto"/>
       </w:pPr>
-      <w:bookmarkStart w:id="36" w:name="_Toc13797"/>
+      <w:bookmarkStart w:id="36" w:name="_Toc2306"/>
       <w:r>
         <w:t>Bảng 4.2 Thiết kế ít nhất 12 ca kiểm độc lập</w:t>
       </w:r>
@@ -15685,14 +15645,6 @@
       </w:tblGrid>
       <w:tr>
         <w:tblPrEx>
-          <w:tblBorders>
-            <w:top w:val="single" w:color="D9D9D9" w:sz="4" w:space="0"/>
-            <w:left w:val="single" w:color="D9D9D9" w:sz="4" w:space="0"/>
-            <w:bottom w:val="single" w:color="D9D9D9" w:sz="4" w:space="0"/>
-            <w:right w:val="single" w:color="D9D9D9" w:sz="4" w:space="0"/>
-            <w:insideH w:val="single" w:color="D9D9D9" w:sz="4" w:space="0"/>
-            <w:insideV w:val="single" w:color="D9D9D9" w:sz="4" w:space="0"/>
-          </w:tblBorders>
           <w:tblCellMar>
             <w:top w:w="70" w:type="dxa"/>
             <w:left w:w="70" w:type="dxa"/>
@@ -17009,7 +16961,7 @@
         <w:pageBreakBefore/>
         <w:spacing w:before="80" w:after="100" w:line="269" w:lineRule="auto"/>
       </w:pPr>
-      <w:bookmarkStart w:id="37" w:name="_Toc2045"/>
+      <w:bookmarkStart w:id="37" w:name="_Toc20349"/>
       <w:r>
         <w:t>Bảng 4.3 Actual kết luận và vị trí minh chứng</w:t>
       </w:r>
@@ -17044,14 +16996,6 @@
       </w:tblGrid>
       <w:tr>
         <w:tblPrEx>
-          <w:tblBorders>
-            <w:top w:val="single" w:color="D9D9D9" w:sz="4" w:space="0"/>
-            <w:left w:val="single" w:color="D9D9D9" w:sz="4" w:space="0"/>
-            <w:bottom w:val="single" w:color="D9D9D9" w:sz="4" w:space="0"/>
-            <w:right w:val="single" w:color="D9D9D9" w:sz="4" w:space="0"/>
-            <w:insideH w:val="single" w:color="D9D9D9" w:sz="4" w:space="0"/>
-            <w:insideV w:val="single" w:color="D9D9D9" w:sz="4" w:space="0"/>
-          </w:tblBorders>
           <w:tblCellMar>
             <w:top w:w="70" w:type="dxa"/>
             <w:left w:w="70" w:type="dxa"/>
@@ -18370,7 +18314,7 @@
         <w:ind w:firstLine="0"/>
         <w:jc w:val="center"/>
       </w:pPr>
-      <w:bookmarkStart w:id="38" w:name="_Toc24992"/>
+      <w:bookmarkStart w:id="38" w:name="_Toc14182"/>
       <w:r>
         <w:t>4.3. Hai ví dụ trên phiếu</w:t>
       </w:r>
@@ -18498,7 +18442,7 @@
             <w:r>
               <w:drawing>
                 <wp:inline distT="0" distB="0" distL="114300" distR="114300">
-                  <wp:extent cx="5303520" cy="1861820"/>
+                  <wp:extent cx="5303520" cy="1557020"/>
                   <wp:effectExtent l="0" t="0" r="0" b="12700"/>
                   <wp:docPr id="1" name="Picture 1"/>
                   <wp:cNvGraphicFramePr>
@@ -18522,7 +18466,7 @@
                         <pic:spPr>
                           <a:xfrm>
                             <a:off x="0" y="0"/>
-                            <a:ext cx="5303520" cy="1862125"/>
+                            <a:ext cx="5303520" cy="1557539"/>
                           </a:xfrm>
                           <a:prstGeom prst="rect">
                             <a:avLst/>
@@ -18543,7 +18487,7 @@
         <w:pStyle w:val="175"/>
         <w:spacing w:before="80" w:after="100" w:line="269" w:lineRule="auto"/>
       </w:pPr>
-      <w:bookmarkStart w:id="39" w:name="_Toc17132"/>
+      <w:bookmarkStart w:id="39" w:name="_Toc23301"/>
       <w:r>
         <w:t xml:space="preserve">Hình 4.1 Ví dụ 1 </w:t>
       </w:r>
@@ -18722,8 +18666,8 @@
             <w:r>
               <w:drawing>
                 <wp:inline distT="0" distB="0" distL="114300" distR="114300">
-                  <wp:extent cx="5303520" cy="1508125"/>
-                  <wp:effectExtent l="0" t="0" r="0" b="635"/>
+                  <wp:extent cx="5303520" cy="1341120"/>
+                  <wp:effectExtent l="0" t="0" r="0" b="0"/>
                   <wp:docPr id="2" name="Picture 2"/>
                   <wp:cNvGraphicFramePr>
                     <a:graphicFrameLocks xmlns:a="http://schemas.openxmlformats.org/drawingml/2006/main" noChangeAspect="1"/>
@@ -18746,7 +18690,7 @@
                         <pic:spPr>
                           <a:xfrm>
                             <a:off x="0" y="0"/>
-                            <a:ext cx="5303520" cy="1508557"/>
+                            <a:ext cx="5303520" cy="1341602"/>
                           </a:xfrm>
                           <a:prstGeom prst="rect">
                             <a:avLst/>
@@ -18767,7 +18711,7 @@
         <w:pStyle w:val="175"/>
         <w:spacing w:before="80" w:after="100" w:line="269" w:lineRule="auto"/>
       </w:pPr>
-      <w:bookmarkStart w:id="40" w:name="_Toc6512"/>
+      <w:bookmarkStart w:id="40" w:name="_Toc11687"/>
       <w:r>
         <w:t xml:space="preserve">Hình 4.2 Ví dụ 2 </w:t>
       </w:r>
@@ -18818,7 +18762,7 @@
         <w:ind w:firstLine="0"/>
         <w:jc w:val="center"/>
       </w:pPr>
-      <w:bookmarkStart w:id="41" w:name="_Toc3104"/>
+      <w:bookmarkStart w:id="41" w:name="_Toc20171"/>
       <w:r>
         <w:t>4.4. Hai ca sinh viên tự thiết kế</w:t>
       </w:r>
@@ -18946,8 +18890,8 @@
             <w:r>
               <w:drawing>
                 <wp:inline distT="0" distB="0" distL="114300" distR="114300">
-                  <wp:extent cx="5303520" cy="2686685"/>
-                  <wp:effectExtent l="0" t="0" r="0" b="10795"/>
+                  <wp:extent cx="5303520" cy="2182495"/>
+                  <wp:effectExtent l="0" t="0" r="0" b="12065"/>
                   <wp:docPr id="3" name="Picture 3"/>
                   <wp:cNvGraphicFramePr>
                     <a:graphicFrameLocks xmlns:a="http://schemas.openxmlformats.org/drawingml/2006/main" noChangeAspect="1"/>
@@ -18970,7 +18914,7 @@
                         <pic:spPr>
                           <a:xfrm>
                             <a:off x="0" y="0"/>
-                            <a:ext cx="5303520" cy="2687117"/>
+                            <a:ext cx="5303520" cy="2182676"/>
                           </a:xfrm>
                           <a:prstGeom prst="rect">
                             <a:avLst/>
@@ -18991,7 +18935,7 @@
         <w:pStyle w:val="175"/>
         <w:spacing w:before="80" w:after="100" w:line="269" w:lineRule="auto"/>
       </w:pPr>
-      <w:bookmarkStart w:id="42" w:name="_Toc2251"/>
+      <w:bookmarkStart w:id="42" w:name="_Toc7989"/>
       <w:r>
         <w:t xml:space="preserve">Hình 4.3 Ca tự thiết kế 1 </w:t>
       </w:r>
@@ -19156,8 +19100,8 @@
             <w:r>
               <w:drawing>
                 <wp:inline distT="0" distB="0" distL="114300" distR="114300">
-                  <wp:extent cx="5303520" cy="1743710"/>
-                  <wp:effectExtent l="0" t="0" r="0" b="8890"/>
+                  <wp:extent cx="5303520" cy="1550670"/>
+                  <wp:effectExtent l="0" t="0" r="0" b="3810"/>
                   <wp:docPr id="4" name="Picture 4"/>
                   <wp:cNvGraphicFramePr>
                     <a:graphicFrameLocks xmlns:a="http://schemas.openxmlformats.org/drawingml/2006/main" noChangeAspect="1"/>
@@ -19180,7 +19124,7 @@
                         <pic:spPr>
                           <a:xfrm>
                             <a:off x="0" y="0"/>
-                            <a:ext cx="5303520" cy="1744268"/>
+                            <a:ext cx="5303520" cy="1551227"/>
                           </a:xfrm>
                           <a:prstGeom prst="rect">
                             <a:avLst/>
@@ -19201,7 +19145,7 @@
         <w:pStyle w:val="175"/>
         <w:spacing w:before="80" w:after="100" w:line="269" w:lineRule="auto"/>
       </w:pPr>
-      <w:bookmarkStart w:id="43" w:name="_Toc6516"/>
+      <w:bookmarkStart w:id="43" w:name="_Toc25440"/>
       <w:r>
         <w:t xml:space="preserve">Hình 4.4 Ca tự thiết kế 2 </w:t>
       </w:r>
@@ -19252,7 +19196,7 @@
         <w:ind w:firstLine="0"/>
         <w:jc w:val="center"/>
       </w:pPr>
-      <w:bookmarkStart w:id="44" w:name="_Toc23081"/>
+      <w:bookmarkStart w:id="44" w:name="_Toc17920"/>
       <w:r>
         <w:t>4.5. Ba ca biên phù hợp với đề tài</w:t>
       </w:r>
@@ -19412,8 +19356,8 @@
             <w:r>
               <w:drawing>
                 <wp:inline distT="0" distB="0" distL="114300" distR="114300">
-                  <wp:extent cx="5303520" cy="1508125"/>
-                  <wp:effectExtent l="0" t="0" r="0" b="635"/>
+                  <wp:extent cx="5303520" cy="1320165"/>
+                  <wp:effectExtent l="0" t="0" r="0" b="5715"/>
                   <wp:docPr id="5" name="Picture 5"/>
                   <wp:cNvGraphicFramePr>
                     <a:graphicFrameLocks xmlns:a="http://schemas.openxmlformats.org/drawingml/2006/main" noChangeAspect="1"/>
@@ -19436,7 +19380,7 @@
                         <pic:spPr>
                           <a:xfrm>
                             <a:off x="0" y="0"/>
-                            <a:ext cx="5303520" cy="1508557"/>
+                            <a:ext cx="5303520" cy="1320721"/>
                           </a:xfrm>
                           <a:prstGeom prst="rect">
                             <a:avLst/>
@@ -19457,7 +19401,7 @@
         <w:pStyle w:val="175"/>
         <w:spacing w:before="80" w:after="100" w:line="269" w:lineRule="auto"/>
       </w:pPr>
-      <w:bookmarkStart w:id="45" w:name="_Toc25849"/>
+      <w:bookmarkStart w:id="45" w:name="_Toc3279"/>
       <w:r>
         <w:t xml:space="preserve">Hình 4.5 Biên 1 </w:t>
       </w:r>
@@ -19622,8 +19566,8 @@
             <w:r>
               <w:drawing>
                 <wp:inline distT="0" distB="0" distL="114300" distR="114300">
-                  <wp:extent cx="5303520" cy="1743710"/>
-                  <wp:effectExtent l="0" t="0" r="0" b="8890"/>
+                  <wp:extent cx="5303520" cy="1503680"/>
+                  <wp:effectExtent l="0" t="0" r="0" b="5080"/>
                   <wp:docPr id="6" name="Picture 6"/>
                   <wp:cNvGraphicFramePr>
                     <a:graphicFrameLocks xmlns:a="http://schemas.openxmlformats.org/drawingml/2006/main" noChangeAspect="1"/>
@@ -19646,7 +19590,7 @@
                         <pic:spPr>
                           <a:xfrm>
                             <a:off x="0" y="0"/>
-                            <a:ext cx="5303520" cy="1744268"/>
+                            <a:ext cx="5303520" cy="1503680"/>
                           </a:xfrm>
                           <a:prstGeom prst="rect">
                             <a:avLst/>
@@ -19667,7 +19611,7 @@
         <w:pStyle w:val="175"/>
         <w:spacing w:before="80" w:after="100" w:line="269" w:lineRule="auto"/>
       </w:pPr>
-      <w:bookmarkStart w:id="46" w:name="_Toc31962"/>
+      <w:bookmarkStart w:id="46" w:name="_Toc11618"/>
       <w:r>
         <w:t xml:space="preserve">Hình 4.6 Biên 2 </w:t>
       </w:r>
@@ -19864,8 +19808,8 @@
             <w:r>
               <w:drawing>
                 <wp:inline distT="0" distB="0" distL="114300" distR="114300">
-                  <wp:extent cx="5303520" cy="1626235"/>
-                  <wp:effectExtent l="0" t="0" r="0" b="4445"/>
+                  <wp:extent cx="5303520" cy="1380490"/>
+                  <wp:effectExtent l="0" t="0" r="0" b="6350"/>
                   <wp:docPr id="7" name="Picture 7"/>
                   <wp:cNvGraphicFramePr>
                     <a:graphicFrameLocks xmlns:a="http://schemas.openxmlformats.org/drawingml/2006/main" noChangeAspect="1"/>
@@ -19888,7 +19832,7 @@
                         <pic:spPr>
                           <a:xfrm>
                             <a:off x="0" y="0"/>
-                            <a:ext cx="5303520" cy="1626413"/>
+                            <a:ext cx="5303520" cy="1380917"/>
                           </a:xfrm>
                           <a:prstGeom prst="rect">
                             <a:avLst/>
@@ -19909,7 +19853,7 @@
         <w:pStyle w:val="175"/>
         <w:spacing w:before="80" w:after="100" w:line="269" w:lineRule="auto"/>
       </w:pPr>
-      <w:bookmarkStart w:id="47" w:name="_Toc11542"/>
+      <w:bookmarkStart w:id="47" w:name="_Toc14583"/>
       <w:r>
         <w:t xml:space="preserve">Hình 4.7 Biên 3 </w:t>
       </w:r>
@@ -19956,7 +19900,7 @@
       <w:pPr>
         <w:pStyle w:val="3"/>
       </w:pPr>
-      <w:bookmarkStart w:id="48" w:name="_Toc10143"/>
+      <w:bookmarkStart w:id="48" w:name="_Toc2341"/>
       <w:r>
         <w:t>4.6. Kiểm tra input không hợp lệ — LOI01</w:t>
       </w:r>
@@ -20076,8 +20020,8 @@
             <w:r>
               <w:drawing>
                 <wp:inline distT="0" distB="0" distL="114300" distR="114300">
-                  <wp:extent cx="5303520" cy="1743710"/>
-                  <wp:effectExtent l="0" t="0" r="0" b="8890"/>
+                  <wp:extent cx="5303520" cy="1550670"/>
+                  <wp:effectExtent l="0" t="0" r="0" b="3810"/>
                   <wp:docPr id="8" name="Picture 8"/>
                   <wp:cNvGraphicFramePr>
                     <a:graphicFrameLocks xmlns:a="http://schemas.openxmlformats.org/drawingml/2006/main" noChangeAspect="1"/>
@@ -20100,7 +20044,7 @@
                         <pic:spPr>
                           <a:xfrm>
                             <a:off x="0" y="0"/>
-                            <a:ext cx="5303520" cy="1744268"/>
+                            <a:ext cx="5303520" cy="1551227"/>
                           </a:xfrm>
                           <a:prstGeom prst="rect">
                             <a:avLst/>
@@ -20121,7 +20065,7 @@
         <w:pStyle w:val="175"/>
         <w:spacing w:before="80" w:after="100" w:line="269" w:lineRule="auto"/>
       </w:pPr>
-      <w:bookmarkStart w:id="49" w:name="_Toc16179"/>
+      <w:bookmarkStart w:id="49" w:name="_Toc17019"/>
       <w:r>
         <w:t xml:space="preserve">Hình 4.8 Input không hợp lệ </w:t>
       </w:r>
@@ -20168,7 +20112,7 @@
       <w:pPr>
         <w:pStyle w:val="3"/>
       </w:pPr>
-      <w:bookmarkStart w:id="50" w:name="_Toc30714"/>
+      <w:bookmarkStart w:id="50" w:name="_Toc25237"/>
       <w:r>
         <w:t>4.7. Kết quả toàn bộ kiểm thử</w:t>
       </w:r>
@@ -20360,8 +20304,8 @@
             <w:r>
               <w:drawing>
                 <wp:inline distT="0" distB="0" distL="114300" distR="114300">
-                  <wp:extent cx="5303520" cy="3629660"/>
-                  <wp:effectExtent l="0" t="0" r="0" b="12700"/>
+                  <wp:extent cx="5303520" cy="3081655"/>
+                  <wp:effectExtent l="0" t="0" r="0" b="12065"/>
                   <wp:docPr id="9" name="Picture 9"/>
                   <wp:cNvGraphicFramePr>
                     <a:graphicFrameLocks xmlns:a="http://schemas.openxmlformats.org/drawingml/2006/main" noChangeAspect="1"/>
@@ -20384,7 +20328,7 @@
                         <pic:spPr>
                           <a:xfrm>
                             <a:off x="0" y="0"/>
-                            <a:ext cx="5303520" cy="3629965"/>
+                            <a:ext cx="5303520" cy="3082046"/>
                           </a:xfrm>
                           <a:prstGeom prst="rect">
                             <a:avLst/>
@@ -20405,7 +20349,7 @@
         <w:pStyle w:val="175"/>
         <w:spacing w:before="80" w:after="100" w:line="269" w:lineRule="auto"/>
       </w:pPr>
-      <w:bookmarkStart w:id="51" w:name="_Toc16667"/>
+      <w:bookmarkStart w:id="51" w:name="_Toc1176"/>
       <w:r>
         <w:t xml:space="preserve">Hình 4.9 Tổng kết kiểm thử </w:t>
       </w:r>
@@ -20452,7 +20396,7 @@
       <w:pPr>
         <w:pStyle w:val="3"/>
       </w:pPr>
-      <w:bookmarkStart w:id="52" w:name="_Toc32355"/>
+      <w:bookmarkStart w:id="52" w:name="_Toc22039"/>
       <w:r>
         <w:t>4.8. Khảo sát ba quy mô hoặc ba cấu hình hợp lệ</w:t>
       </w:r>
@@ -20714,7 +20658,7 @@
         <w:spacing w:before="0" w:after="100" w:line="269" w:lineRule="auto"/>
         <w:jc w:val="left"/>
       </w:pPr>
-      <w:bookmarkStart w:id="53" w:name="_Toc32168"/>
+      <w:bookmarkStart w:id="53" w:name="_Toc26875"/>
       <w:r>
         <w:t>Bảng 4.4 Khảo sát Q1 Q2 Q3</w:t>
       </w:r>
@@ -21280,7 +21224,7 @@
         <w:ind w:firstLine="0"/>
         <w:jc w:val="center"/>
       </w:pPr>
-      <w:bookmarkStart w:id="54" w:name="_Toc24492"/>
+      <w:bookmarkStart w:id="54" w:name="_Toc716"/>
       <w:r>
         <w:t>4.9. GitHub và chạy lại từ bản clone sạch</w:t>
       </w:r>
@@ -21340,7 +21284,7 @@
         <w:pStyle w:val="174"/>
         <w:spacing w:before="80" w:after="100" w:line="269" w:lineRule="auto"/>
       </w:pPr>
-      <w:bookmarkStart w:id="55" w:name="_Toc29823"/>
+      <w:bookmarkStart w:id="55" w:name="_Toc8226"/>
       <w:r>
         <w:t>Bảng 4.5 Kho mã và phiên bản có thể kiểm lại</w:t>
       </w:r>
@@ -21926,8 +21870,8 @@
             <w:r>
               <w:drawing>
                 <wp:inline distT="0" distB="0" distL="114300" distR="114300">
-                  <wp:extent cx="5303520" cy="2332990"/>
-                  <wp:effectExtent l="0" t="0" r="0" b="13970"/>
+                  <wp:extent cx="5303520" cy="1470660"/>
+                  <wp:effectExtent l="0" t="0" r="0" b="7620"/>
                   <wp:docPr id="10" name="Picture 10"/>
                   <wp:cNvGraphicFramePr>
                     <a:graphicFrameLocks xmlns:a="http://schemas.openxmlformats.org/drawingml/2006/main" noChangeAspect="1"/>
@@ -21950,7 +21894,7 @@
                         <pic:spPr>
                           <a:xfrm>
                             <a:off x="0" y="0"/>
-                            <a:ext cx="5303520" cy="2333549"/>
+                            <a:ext cx="5303520" cy="1470724"/>
                           </a:xfrm>
                           <a:prstGeom prst="rect">
                             <a:avLst/>
@@ -21971,7 +21915,7 @@
         <w:pStyle w:val="175"/>
         <w:spacing w:before="80" w:after="100" w:line="269" w:lineRule="auto"/>
       </w:pPr>
-      <w:bookmarkStart w:id="56" w:name="_Toc28825"/>
+      <w:bookmarkStart w:id="56" w:name="_Toc14325"/>
       <w:r>
         <w:t xml:space="preserve">Hình 4.10 Clone sạch và chạy lại </w:t>
       </w:r>
@@ -22079,8 +22023,8 @@
             <w:r>
               <w:drawing>
                 <wp:inline distT="0" distB="0" distL="114300" distR="114300">
-                  <wp:extent cx="5303520" cy="1626235"/>
-                  <wp:effectExtent l="0" t="0" r="0" b="4445"/>
+                  <wp:extent cx="5303520" cy="1036320"/>
+                  <wp:effectExtent l="0" t="0" r="0" b="0"/>
                   <wp:docPr id="11" name="Picture 11"/>
                   <wp:cNvGraphicFramePr>
                     <a:graphicFrameLocks xmlns:a="http://schemas.openxmlformats.org/drawingml/2006/main" noChangeAspect="1"/>
@@ -22103,7 +22047,7 @@
                         <pic:spPr>
                           <a:xfrm>
                             <a:off x="0" y="0"/>
-                            <a:ext cx="5303520" cy="1626413"/>
+                            <a:ext cx="5303520" cy="1036665"/>
                           </a:xfrm>
                           <a:prstGeom prst="rect">
                             <a:avLst/>
@@ -22124,7 +22068,7 @@
         <w:pStyle w:val="175"/>
         <w:spacing w:before="80" w:after="100" w:line="269" w:lineRule="auto"/>
       </w:pPr>
-      <w:bookmarkStart w:id="57" w:name="_Toc26803"/>
+      <w:bookmarkStart w:id="57" w:name="_Toc12212"/>
       <w:r>
         <w:t xml:space="preserve">Hình 4.11 GitHub repo và commit </w:t>
       </w:r>
@@ -22173,7 +22117,7 @@
         <w:keepNext w:val="0"/>
         <w:spacing w:before="0" w:after="320"/>
       </w:pPr>
-      <w:bookmarkStart w:id="58" w:name="_Toc3450"/>
+      <w:bookmarkStart w:id="58" w:name="_Toc4846"/>
       <w:r>
         <w:t>CHƯƠNG 5. KẾT LUẬN VÀ HƯỚNG PHÁT TRIỂN</w:t>
       </w:r>
@@ -22183,7 +22127,7 @@
       <w:pPr>
         <w:pStyle w:val="3"/>
       </w:pPr>
-      <w:bookmarkStart w:id="59" w:name="_Toc16770"/>
+      <w:bookmarkStart w:id="59" w:name="_Toc23541"/>
       <w:r>
         <w:t>5.1. Mức hoàn thành so với phiếu</w:t>
       </w:r>
@@ -22234,7 +22178,7 @@
       <w:pPr>
         <w:pStyle w:val="3"/>
       </w:pPr>
-      <w:bookmarkStart w:id="60" w:name="_Toc5570"/>
+      <w:bookmarkStart w:id="60" w:name="_Toc8204"/>
       <w:r>
         <w:t>5.2. Giới hạn và bài học</w:t>
       </w:r>
@@ -22303,7 +22247,7 @@
       <w:pPr>
         <w:pStyle w:val="3"/>
       </w:pPr>
-      <w:bookmarkStart w:id="61" w:name="_Toc3561"/>
+      <w:bookmarkStart w:id="61" w:name="_Toc5106"/>
       <w:r>
         <w:t>5.3. Hướng phát triển phù hợp</w:t>
       </w:r>
@@ -22391,7 +22335,7 @@
         <w:pStyle w:val="174"/>
         <w:spacing w:before="80" w:after="100" w:line="269" w:lineRule="auto"/>
       </w:pPr>
-      <w:bookmarkStart w:id="62" w:name="_Toc30056"/>
+      <w:bookmarkStart w:id="62" w:name="_Toc20603"/>
       <w:r>
         <w:t>Bảng 5.1 Mức hoàn thành và bằng chứng theo yêu cầu</w:t>
       </w:r>
@@ -23021,7 +22965,7 @@
         <w:keepNext w:val="0"/>
         <w:spacing w:before="0" w:after="320"/>
       </w:pPr>
-      <w:bookmarkStart w:id="63" w:name="_Toc13554"/>
+      <w:bookmarkStart w:id="63" w:name="_Toc24234"/>
       <w:r>
         <w:t>TÀI LIỆU THAM KHẢO</w:t>
       </w:r>
@@ -23087,7 +23031,7 @@
         <w:keepNext w:val="0"/>
         <w:spacing w:before="0" w:after="320"/>
       </w:pPr>
-      <w:bookmarkStart w:id="64" w:name="_Toc1739"/>
+      <w:bookmarkStart w:id="64" w:name="_Toc5750"/>
       <w:r>
         <w:t>PHỤ LỤC</w:t>
       </w:r>
@@ -23097,7 +23041,7 @@
       <w:pPr>
         <w:pStyle w:val="3"/>
       </w:pPr>
-      <w:bookmarkStart w:id="65" w:name="_Toc7187"/>
+      <w:bookmarkStart w:id="65" w:name="_Toc17828"/>
       <w:r>
         <w:t>PHỤ LỤC A. Tổ chức mã và hướng dẫn chạy</w:t>
       </w:r>
@@ -23587,7 +23531,7 @@
         <w:pStyle w:val="3"/>
         <w:pageBreakBefore/>
       </w:pPr>
-      <w:bookmarkStart w:id="66" w:name="_Toc23729"/>
+      <w:bookmarkStart w:id="66" w:name="_Toc6422"/>
       <w:r>
         <w:t>PHỤ LỤC B. Danh mục bằng chứng</w:t>
       </w:r>
@@ -23637,12 +23581,6 @@
             <w:insideH w:val="single" w:color="D9D9D9" w:sz="4" w:space="0"/>
             <w:insideV w:val="single" w:color="D9D9D9" w:sz="4" w:space="0"/>
           </w:tblBorders>
-          <w:tblCellMar>
-            <w:top w:w="70" w:type="dxa"/>
-            <w:left w:w="70" w:type="dxa"/>
-            <w:bottom w:w="70" w:type="dxa"/>
-            <w:right w:w="70" w:type="dxa"/>
-          </w:tblCellMar>
         </w:tblPrEx>
         <w:trPr>
           <w:cantSplit/>
@@ -24612,7 +24550,7 @@
         <w:pStyle w:val="3"/>
         <w:pageBreakBefore/>
       </w:pPr>
-      <w:bookmarkStart w:id="67" w:name="_Toc30373"/>
+      <w:bookmarkStart w:id="67" w:name="_Toc3519"/>
       <w:r>
         <w:t>PHỤ LỤC C. Tự kiểm trước khi nộp</w:t>
       </w:r>
@@ -24733,7 +24671,7 @@
         <w:pStyle w:val="3"/>
         <w:pageBreakBefore/>
       </w:pPr>
-      <w:bookmarkStart w:id="68" w:name="_Toc15820"/>
+      <w:bookmarkStart w:id="68" w:name="_Toc27900"/>
       <w:r>
         <w:t>PHỤ LỤC D HƯỚNG DẪN NỘP CLASSROOM</w:t>
       </w:r>
@@ -24781,7 +24719,7 @@
         <w:spacing w:before="0" w:after="100" w:line="269" w:lineRule="auto"/>
         <w:jc w:val="left"/>
       </w:pPr>
-      <w:bookmarkStart w:id="69" w:name="_Toc15255"/>
+      <w:bookmarkStart w:id="69" w:name="_Toc23540"/>
       <w:r>
         <w:t>Bảng PL.1 Bốn tệp cần nộp</w:t>
       </w:r>
@@ -25858,9 +25796,9 @@
     <w:lsdException w:uiPriority="99" w:name="index 7"/>
     <w:lsdException w:uiPriority="99" w:name="index 8"/>
     <w:lsdException w:uiPriority="99" w:name="index 9"/>
-    <w:lsdException w:qFormat="1" w:uiPriority="39" w:semiHidden="0" w:name="toc 1"/>
-    <w:lsdException w:qFormat="1" w:uiPriority="39" w:semiHidden="0" w:name="toc 2"/>
-    <w:lsdException w:qFormat="1" w:uiPriority="39" w:semiHidden="0" w:name="toc 3"/>
+    <w:lsdException w:uiPriority="39" w:semiHidden="0" w:name="toc 1"/>
+    <w:lsdException w:uiPriority="39" w:semiHidden="0" w:name="toc 2"/>
+    <w:lsdException w:uiPriority="39" w:semiHidden="0" w:name="toc 3"/>
     <w:lsdException w:uiPriority="39" w:name="toc 4"/>
     <w:lsdException w:uiPriority="39" w:name="toc 5"/>
     <w:lsdException w:uiPriority="39" w:name="toc 6"/>
@@ -25924,7 +25862,7 @@
     <w:lsdException w:uiPriority="99" w:name="Body Text Indent 2"/>
     <w:lsdException w:uiPriority="99" w:name="Body Text Indent 3"/>
     <w:lsdException w:uiPriority="99" w:name="Block Text"/>
-    <w:lsdException w:qFormat="1" w:uiPriority="99" w:semiHidden="0" w:name="Hyperlink"/>
+    <w:lsdException w:uiPriority="99" w:semiHidden="0" w:name="Hyperlink"/>
     <w:lsdException w:uiPriority="99" w:name="FollowedHyperlink"/>
     <w:lsdException w:qFormat="1" w:unhideWhenUsed="0" w:uiPriority="22" w:semiHidden="0" w:name="Strong"/>
     <w:lsdException w:qFormat="1" w:unhideWhenUsed="0" w:uiPriority="20" w:semiHidden="0" w:name="Emphasis"/>
@@ -26446,7 +26384,6 @@
     <w:name w:val="Hyperlink"/>
     <w:basedOn w:val="11"/>
     <w:unhideWhenUsed/>
-    <w:qFormat/>
     <w:uiPriority w:val="99"/>
     <w:rPr>
       <w:color w:val="0000FF" w:themeColor="hyperlink"/>
@@ -26702,7 +26639,6 @@
     <w:next w:val="1"/>
     <w:autoRedefine/>
     <w:unhideWhenUsed/>
-    <w:qFormat/>
     <w:uiPriority w:val="39"/>
     <w:pPr>
       <w:spacing w:after="100"/>
@@ -26714,7 +26650,6 @@
     <w:next w:val="1"/>
     <w:autoRedefine/>
     <w:unhideWhenUsed/>
-    <w:qFormat/>
     <w:uiPriority w:val="39"/>
     <w:pPr>
       <w:spacing w:after="100"/>
@@ -26727,7 +26662,6 @@
     <w:next w:val="1"/>
     <w:autoRedefine/>
     <w:unhideWhenUsed/>
-    <w:qFormat/>
     <w:uiPriority w:val="39"/>
     <w:pPr>
       <w:spacing w:after="100"/>
@@ -38153,7 +38087,6 @@
   <w:style w:type="paragraph" w:customStyle="1" w:styleId="178">
     <w:name w:val="TOC 21"/>
     <w:basedOn w:val="1"/>
-    <w:qFormat/>
     <w:uiPriority w:val="0"/>
     <w:pPr>
       <w:tabs>
@@ -38166,7 +38099,6 @@
   <w:style w:type="paragraph" w:customStyle="1" w:styleId="179">
     <w:name w:val="TOC 31"/>
     <w:basedOn w:val="1"/>
-    <w:qFormat/>
     <w:uiPriority w:val="0"/>
     <w:pPr>
       <w:tabs>

</xml_diff>

<commit_message>
Cap nhat ngay nop thanh 13/11/2026
</commit_message>
<xml_diff>
--- a/N24DCDT047_DT042_TuLeNhatLong_BaoCao.docx
+++ b/N24DCDT047_DT042_TuLeNhatLong_BaoCao.docx
@@ -437,7 +437,7 @@
           <w:i w:val="0"/>
           <w:sz w:val="26"/>
         </w:rPr>
-        <w:t>THÀNH PHỐ HỒ CHÍ MINH, THÁNG 10 NĂM 2026</w:t>
+        <w:t>THÀNH PHỐ HỒ CHÍ MINH, THÁNG 11 NĂM 2026</w:t>
       </w:r>
     </w:p>
     <w:p>
@@ -956,7 +956,7 @@
                 <w:b w:val="0"/>
                 <w:sz w:val="24"/>
               </w:rPr>
-              <w:t>Ngày 25/10/2026 (Commit C: 2c4f80ece002b45454fbc2461ec5c0b07c26ddb4)</w:t>
+              <w:t>Ngày nộp: 13/11/2026 (Commit C: 2c4f80ece002b45454fbc2461ec5c0b07c26ddb4)</w:t>
             </w:r>
           </w:p>
         </w:tc>
@@ -984,7 +984,7 @@
           <w:i w:val="0"/>
           <w:sz w:val="26"/>
         </w:rPr>
-        <w:t>THÀNH PHỐ HỒ CHÍ MINH, THÁNG 10 NĂM 2026</w:t>
+        <w:t>THÀNH PHỐ HỒ CHÍ MINH, THÁNG 11 NĂM 2026</w:t>
       </w:r>
     </w:p>
     <w:p>
@@ -1003,7 +1003,7 @@
         <w:keepNext w:val="0"/>
         <w:spacing w:before="0" w:after="320"/>
       </w:pPr>
-      <w:bookmarkStart w:id="0" w:name="_Toc8808"/>
+      <w:bookmarkStart w:id="0" w:name="_Toc13308"/>
       <w:r>
         <w:t>PHIẾU GIAO ĐỀ TÀI</w:t>
       </w:r>
@@ -1338,7 +1338,7 @@
                 <w:b w:val="0"/>
                 <w:sz w:val="22"/>
               </w:rPr>
-              <w:t>Ngày giao: 17/10/2026   Ngày nộp: 25/10/2026</w:t>
+              <w:t>Ngày giao: 17/10/2026   Ngày nộp: 13/11/2026</w:t>
             </w:r>
           </w:p>
         </w:tc>
@@ -1546,6 +1546,14 @@
       </w:tblGrid>
       <w:tr>
         <w:tblPrEx>
+          <w:tblBorders>
+            <w:top w:val="single" w:color="D9D9D9" w:sz="4" w:space="0"/>
+            <w:left w:val="single" w:color="D9D9D9" w:sz="4" w:space="0"/>
+            <w:bottom w:val="single" w:color="D9D9D9" w:sz="4" w:space="0"/>
+            <w:right w:val="single" w:color="D9D9D9" w:sz="4" w:space="0"/>
+            <w:insideH w:val="single" w:color="D9D9D9" w:sz="4" w:space="0"/>
+            <w:insideV w:val="single" w:color="D9D9D9" w:sz="4" w:space="0"/>
+          </w:tblBorders>
           <w:tblCellMar>
             <w:top w:w="70" w:type="dxa"/>
             <w:left w:w="70" w:type="dxa"/>
@@ -1736,7 +1744,7 @@
         <w:keepNext w:val="0"/>
         <w:spacing w:before="0" w:after="320"/>
       </w:pPr>
-      <w:bookmarkStart w:id="1" w:name="_Toc29789"/>
+      <w:bookmarkStart w:id="1" w:name="_Toc29957"/>
       <w:r>
         <w:t>PHIẾU CHẤM VÀ ĐỐI CHIẾU MINH CHỨNG</w:t>
       </w:r>
@@ -2604,7 +2612,7 @@
         <w:pStyle w:val="3"/>
         <w:pageBreakBefore/>
       </w:pPr>
-      <w:bookmarkStart w:id="2" w:name="_Toc10416"/>
+      <w:bookmarkStart w:id="2" w:name="_Toc18476"/>
       <w:r>
         <w:t>CÁCH ĐỐI CHIẾU RUBRIC</w:t>
       </w:r>
@@ -2832,7 +2840,7 @@
         <w:keepNext w:val="0"/>
         <w:spacing w:before="0" w:after="320"/>
       </w:pPr>
-      <w:bookmarkStart w:id="3" w:name="_Toc4430"/>
+      <w:bookmarkStart w:id="3" w:name="_Toc2460"/>
       <w:r>
         <w:t>HƯỚNG DẪN ĐIỀN KHUNG BÁO CÁO</w:t>
       </w:r>
@@ -2917,7 +2925,7 @@
         <w:keepNext w:val="0"/>
         <w:spacing w:before="0" w:after="320"/>
       </w:pPr>
-      <w:bookmarkStart w:id="4" w:name="_Toc31267"/>
+      <w:bookmarkStart w:id="4" w:name="_Toc23438"/>
       <w:r>
         <w:t>LỜI CAM ĐOAN</w:t>
       </w:r>
@@ -3006,7 +3014,7 @@
           <w:i w:val="0"/>
           <w:sz w:val="26"/>
         </w:rPr>
-        <w:t>TP. Hồ Chí Minh, ngày 25 tháng 10 năm 2026</w:t>
+        <w:t>TP. Hồ Chí Minh, ngày 13 tháng 11 năm 2026</w:t>
       </w:r>
       <w:r>
         <w:rPr>
@@ -3087,7 +3095,7 @@
         <w:keepNext w:val="0"/>
         <w:spacing w:before="0" w:after="320"/>
       </w:pPr>
-      <w:bookmarkStart w:id="5" w:name="_Toc32075"/>
+      <w:bookmarkStart w:id="5" w:name="_Toc3621"/>
       <w:r>
         <w:t>LỜI CẢM ƠN</w:t>
       </w:r>
@@ -3141,7 +3149,7 @@
         <w:keepNext w:val="0"/>
         <w:spacing w:before="0" w:after="320"/>
       </w:pPr>
-      <w:bookmarkStart w:id="6" w:name="_Toc2509"/>
+      <w:bookmarkStart w:id="6" w:name="_Toc31627"/>
       <w:r>
         <w:t>TÓM TẮT</w:t>
       </w:r>
@@ -3270,7 +3278,7 @@
         <w:fldChar w:fldCharType="begin"/>
       </w:r>
       <w:r>
-        <w:instrText xml:space="preserve"> HYPERLINK \l _Toc8808 </w:instrText>
+        <w:instrText xml:space="preserve"> HYPERLINK \l _Toc13308 </w:instrText>
       </w:r>
       <w:r>
         <w:fldChar w:fldCharType="separate"/>
@@ -3285,7 +3293,7 @@
         <w:fldChar w:fldCharType="begin"/>
       </w:r>
       <w:r>
-        <w:instrText xml:space="preserve"> PAGEREF _Toc8808 \h </w:instrText>
+        <w:instrText xml:space="preserve"> PAGEREF _Toc13308 \h </w:instrText>
       </w:r>
       <w:r>
         <w:fldChar w:fldCharType="separate"/>
@@ -3311,7 +3319,7 @@
         <w:fldChar w:fldCharType="begin"/>
       </w:r>
       <w:r>
-        <w:instrText xml:space="preserve"> HYPERLINK \l _Toc29789 </w:instrText>
+        <w:instrText xml:space="preserve"> HYPERLINK \l _Toc29957 </w:instrText>
       </w:r>
       <w:r>
         <w:fldChar w:fldCharType="separate"/>
@@ -3326,7 +3334,7 @@
         <w:fldChar w:fldCharType="begin"/>
       </w:r>
       <w:r>
-        <w:instrText xml:space="preserve"> PAGEREF _Toc29789 \h </w:instrText>
+        <w:instrText xml:space="preserve"> PAGEREF _Toc29957 \h </w:instrText>
       </w:r>
       <w:r>
         <w:fldChar w:fldCharType="separate"/>
@@ -3352,7 +3360,7 @@
         <w:fldChar w:fldCharType="begin"/>
       </w:r>
       <w:r>
-        <w:instrText xml:space="preserve"> HYPERLINK \l _Toc10416 </w:instrText>
+        <w:instrText xml:space="preserve"> HYPERLINK \l _Toc18476 </w:instrText>
       </w:r>
       <w:r>
         <w:fldChar w:fldCharType="separate"/>
@@ -3367,7 +3375,7 @@
         <w:fldChar w:fldCharType="begin"/>
       </w:r>
       <w:r>
-        <w:instrText xml:space="preserve"> PAGEREF _Toc10416 \h </w:instrText>
+        <w:instrText xml:space="preserve"> PAGEREF _Toc18476 \h </w:instrText>
       </w:r>
       <w:r>
         <w:fldChar w:fldCharType="separate"/>
@@ -3393,7 +3401,7 @@
         <w:fldChar w:fldCharType="begin"/>
       </w:r>
       <w:r>
-        <w:instrText xml:space="preserve"> HYPERLINK \l _Toc4430 </w:instrText>
+        <w:instrText xml:space="preserve"> HYPERLINK \l _Toc2460 </w:instrText>
       </w:r>
       <w:r>
         <w:fldChar w:fldCharType="separate"/>
@@ -3408,7 +3416,7 @@
         <w:fldChar w:fldCharType="begin"/>
       </w:r>
       <w:r>
-        <w:instrText xml:space="preserve"> PAGEREF _Toc4430 \h </w:instrText>
+        <w:instrText xml:space="preserve"> PAGEREF _Toc2460 \h </w:instrText>
       </w:r>
       <w:r>
         <w:fldChar w:fldCharType="separate"/>
@@ -3434,7 +3442,7 @@
         <w:fldChar w:fldCharType="begin"/>
       </w:r>
       <w:r>
-        <w:instrText xml:space="preserve"> HYPERLINK \l _Toc31267 </w:instrText>
+        <w:instrText xml:space="preserve"> HYPERLINK \l _Toc23438 </w:instrText>
       </w:r>
       <w:r>
         <w:fldChar w:fldCharType="separate"/>
@@ -3449,7 +3457,7 @@
         <w:fldChar w:fldCharType="begin"/>
       </w:r>
       <w:r>
-        <w:instrText xml:space="preserve"> PAGEREF _Toc31267 \h </w:instrText>
+        <w:instrText xml:space="preserve"> PAGEREF _Toc23438 \h </w:instrText>
       </w:r>
       <w:r>
         <w:fldChar w:fldCharType="separate"/>
@@ -3475,7 +3483,7 @@
         <w:fldChar w:fldCharType="begin"/>
       </w:r>
       <w:r>
-        <w:instrText xml:space="preserve"> HYPERLINK \l _Toc32075 </w:instrText>
+        <w:instrText xml:space="preserve"> HYPERLINK \l _Toc3621 </w:instrText>
       </w:r>
       <w:r>
         <w:fldChar w:fldCharType="separate"/>
@@ -3490,7 +3498,7 @@
         <w:fldChar w:fldCharType="begin"/>
       </w:r>
       <w:r>
-        <w:instrText xml:space="preserve"> PAGEREF _Toc32075 \h </w:instrText>
+        <w:instrText xml:space="preserve"> PAGEREF _Toc3621 \h </w:instrText>
       </w:r>
       <w:r>
         <w:fldChar w:fldCharType="separate"/>
@@ -3516,7 +3524,7 @@
         <w:fldChar w:fldCharType="begin"/>
       </w:r>
       <w:r>
-        <w:instrText xml:space="preserve"> HYPERLINK \l _Toc2509 </w:instrText>
+        <w:instrText xml:space="preserve"> HYPERLINK \l _Toc31627 </w:instrText>
       </w:r>
       <w:r>
         <w:fldChar w:fldCharType="separate"/>
@@ -3531,7 +3539,7 @@
         <w:fldChar w:fldCharType="begin"/>
       </w:r>
       <w:r>
-        <w:instrText xml:space="preserve"> PAGEREF _Toc2509 \h </w:instrText>
+        <w:instrText xml:space="preserve"> PAGEREF _Toc31627 \h </w:instrText>
       </w:r>
       <w:r>
         <w:fldChar w:fldCharType="separate"/>
@@ -3557,7 +3565,7 @@
         <w:fldChar w:fldCharType="begin"/>
       </w:r>
       <w:r>
-        <w:instrText xml:space="preserve"> HYPERLINK \l _Toc30086 </w:instrText>
+        <w:instrText xml:space="preserve"> HYPERLINK \l _Toc26765 </w:instrText>
       </w:r>
       <w:r>
         <w:fldChar w:fldCharType="separate"/>
@@ -3572,7 +3580,7 @@
         <w:fldChar w:fldCharType="begin"/>
       </w:r>
       <w:r>
-        <w:instrText xml:space="preserve"> PAGEREF _Toc30086 \h </w:instrText>
+        <w:instrText xml:space="preserve"> PAGEREF _Toc26765 \h </w:instrText>
       </w:r>
       <w:r>
         <w:fldChar w:fldCharType="separate"/>
@@ -3598,7 +3606,7 @@
         <w:fldChar w:fldCharType="begin"/>
       </w:r>
       <w:r>
-        <w:instrText xml:space="preserve"> HYPERLINK \l _Toc17680 </w:instrText>
+        <w:instrText xml:space="preserve"> HYPERLINK \l _Toc29659 </w:instrText>
       </w:r>
       <w:r>
         <w:fldChar w:fldCharType="separate"/>
@@ -3613,7 +3621,7 @@
         <w:fldChar w:fldCharType="begin"/>
       </w:r>
       <w:r>
-        <w:instrText xml:space="preserve"> PAGEREF _Toc17680 \h </w:instrText>
+        <w:instrText xml:space="preserve"> PAGEREF _Toc29659 \h </w:instrText>
       </w:r>
       <w:r>
         <w:fldChar w:fldCharType="separate"/>
@@ -3639,7 +3647,7 @@
         <w:fldChar w:fldCharType="begin"/>
       </w:r>
       <w:r>
-        <w:instrText xml:space="preserve"> HYPERLINK \l _Toc2823 </w:instrText>
+        <w:instrText xml:space="preserve"> HYPERLINK \l _Toc17697 </w:instrText>
       </w:r>
       <w:r>
         <w:fldChar w:fldCharType="separate"/>
@@ -3654,7 +3662,7 @@
         <w:fldChar w:fldCharType="begin"/>
       </w:r>
       <w:r>
-        <w:instrText xml:space="preserve"> PAGEREF _Toc2823 \h </w:instrText>
+        <w:instrText xml:space="preserve"> PAGEREF _Toc17697 \h </w:instrText>
       </w:r>
       <w:r>
         <w:fldChar w:fldCharType="separate"/>
@@ -3680,7 +3688,7 @@
         <w:fldChar w:fldCharType="begin"/>
       </w:r>
       <w:r>
-        <w:instrText xml:space="preserve"> HYPERLINK \l _Toc5457 </w:instrText>
+        <w:instrText xml:space="preserve"> HYPERLINK \l _Toc31018 </w:instrText>
       </w:r>
       <w:r>
         <w:fldChar w:fldCharType="separate"/>
@@ -3695,7 +3703,7 @@
         <w:fldChar w:fldCharType="begin"/>
       </w:r>
       <w:r>
-        <w:instrText xml:space="preserve"> PAGEREF _Toc5457 \h </w:instrText>
+        <w:instrText xml:space="preserve"> PAGEREF _Toc31018 \h </w:instrText>
       </w:r>
       <w:r>
         <w:fldChar w:fldCharType="separate"/>
@@ -3721,7 +3729,7 @@
         <w:fldChar w:fldCharType="begin"/>
       </w:r>
       <w:r>
-        <w:instrText xml:space="preserve"> HYPERLINK \l _Toc13333 </w:instrText>
+        <w:instrText xml:space="preserve"> HYPERLINK \l _Toc8494 </w:instrText>
       </w:r>
       <w:r>
         <w:fldChar w:fldCharType="separate"/>
@@ -3736,7 +3744,7 @@
         <w:fldChar w:fldCharType="begin"/>
       </w:r>
       <w:r>
-        <w:instrText xml:space="preserve"> PAGEREF _Toc13333 \h </w:instrText>
+        <w:instrText xml:space="preserve"> PAGEREF _Toc8494 \h </w:instrText>
       </w:r>
       <w:r>
         <w:fldChar w:fldCharType="separate"/>
@@ -3762,7 +3770,7 @@
         <w:fldChar w:fldCharType="begin"/>
       </w:r>
       <w:r>
-        <w:instrText xml:space="preserve"> HYPERLINK \l _Toc26702 </w:instrText>
+        <w:instrText xml:space="preserve"> HYPERLINK \l _Toc27065 </w:instrText>
       </w:r>
       <w:r>
         <w:fldChar w:fldCharType="separate"/>
@@ -3777,7 +3785,7 @@
         <w:fldChar w:fldCharType="begin"/>
       </w:r>
       <w:r>
-        <w:instrText xml:space="preserve"> PAGEREF _Toc26702 \h </w:instrText>
+        <w:instrText xml:space="preserve"> PAGEREF _Toc27065 \h </w:instrText>
       </w:r>
       <w:r>
         <w:fldChar w:fldCharType="separate"/>
@@ -3803,7 +3811,7 @@
         <w:fldChar w:fldCharType="begin"/>
       </w:r>
       <w:r>
-        <w:instrText xml:space="preserve"> HYPERLINK \l _Toc32196 </w:instrText>
+        <w:instrText xml:space="preserve"> HYPERLINK \l _Toc26506 </w:instrText>
       </w:r>
       <w:r>
         <w:fldChar w:fldCharType="separate"/>
@@ -3818,7 +3826,7 @@
         <w:fldChar w:fldCharType="begin"/>
       </w:r>
       <w:r>
-        <w:instrText xml:space="preserve"> PAGEREF _Toc32196 \h </w:instrText>
+        <w:instrText xml:space="preserve"> PAGEREF _Toc26506 \h </w:instrText>
       </w:r>
       <w:r>
         <w:fldChar w:fldCharType="separate"/>
@@ -3844,7 +3852,7 @@
         <w:fldChar w:fldCharType="begin"/>
       </w:r>
       <w:r>
-        <w:instrText xml:space="preserve"> HYPERLINK \l _Toc15344 </w:instrText>
+        <w:instrText xml:space="preserve"> HYPERLINK \l _Toc23600 </w:instrText>
       </w:r>
       <w:r>
         <w:fldChar w:fldCharType="separate"/>
@@ -3859,7 +3867,7 @@
         <w:fldChar w:fldCharType="begin"/>
       </w:r>
       <w:r>
-        <w:instrText xml:space="preserve"> PAGEREF _Toc15344 \h </w:instrText>
+        <w:instrText xml:space="preserve"> PAGEREF _Toc23600 \h </w:instrText>
       </w:r>
       <w:r>
         <w:fldChar w:fldCharType="separate"/>
@@ -3885,7 +3893,7 @@
         <w:fldChar w:fldCharType="begin"/>
       </w:r>
       <w:r>
-        <w:instrText xml:space="preserve"> HYPERLINK \l _Toc1778 </w:instrText>
+        <w:instrText xml:space="preserve"> HYPERLINK \l _Toc5795 </w:instrText>
       </w:r>
       <w:r>
         <w:fldChar w:fldCharType="separate"/>
@@ -3900,7 +3908,7 @@
         <w:fldChar w:fldCharType="begin"/>
       </w:r>
       <w:r>
-        <w:instrText xml:space="preserve"> PAGEREF _Toc1778 \h </w:instrText>
+        <w:instrText xml:space="preserve"> PAGEREF _Toc5795 \h </w:instrText>
       </w:r>
       <w:r>
         <w:fldChar w:fldCharType="separate"/>
@@ -3926,7 +3934,7 @@
         <w:fldChar w:fldCharType="begin"/>
       </w:r>
       <w:r>
-        <w:instrText xml:space="preserve"> HYPERLINK \l _Toc20943 </w:instrText>
+        <w:instrText xml:space="preserve"> HYPERLINK \l _Toc13833 </w:instrText>
       </w:r>
       <w:r>
         <w:fldChar w:fldCharType="separate"/>
@@ -3941,7 +3949,7 @@
         <w:fldChar w:fldCharType="begin"/>
       </w:r>
       <w:r>
-        <w:instrText xml:space="preserve"> PAGEREF _Toc20943 \h </w:instrText>
+        <w:instrText xml:space="preserve"> PAGEREF _Toc13833 \h </w:instrText>
       </w:r>
       <w:r>
         <w:fldChar w:fldCharType="separate"/>
@@ -3967,7 +3975,7 @@
         <w:fldChar w:fldCharType="begin"/>
       </w:r>
       <w:r>
-        <w:instrText xml:space="preserve"> HYPERLINK \l _Toc30782 </w:instrText>
+        <w:instrText xml:space="preserve"> HYPERLINK \l _Toc25541 </w:instrText>
       </w:r>
       <w:r>
         <w:fldChar w:fldCharType="separate"/>
@@ -3982,7 +3990,7 @@
         <w:fldChar w:fldCharType="begin"/>
       </w:r>
       <w:r>
-        <w:instrText xml:space="preserve"> PAGEREF _Toc30782 \h </w:instrText>
+        <w:instrText xml:space="preserve"> PAGEREF _Toc25541 \h </w:instrText>
       </w:r>
       <w:r>
         <w:fldChar w:fldCharType="separate"/>
@@ -4008,7 +4016,7 @@
         <w:fldChar w:fldCharType="begin"/>
       </w:r>
       <w:r>
-        <w:instrText xml:space="preserve"> HYPERLINK \l _Toc4042 </w:instrText>
+        <w:instrText xml:space="preserve"> HYPERLINK \l _Toc3638 </w:instrText>
       </w:r>
       <w:r>
         <w:fldChar w:fldCharType="separate"/>
@@ -4023,7 +4031,7 @@
         <w:fldChar w:fldCharType="begin"/>
       </w:r>
       <w:r>
-        <w:instrText xml:space="preserve"> PAGEREF _Toc4042 \h </w:instrText>
+        <w:instrText xml:space="preserve"> PAGEREF _Toc3638 \h </w:instrText>
       </w:r>
       <w:r>
         <w:fldChar w:fldCharType="separate"/>
@@ -4049,7 +4057,7 @@
         <w:fldChar w:fldCharType="begin"/>
       </w:r>
       <w:r>
-        <w:instrText xml:space="preserve"> HYPERLINK \l _Toc2248 </w:instrText>
+        <w:instrText xml:space="preserve"> HYPERLINK \l _Toc11691 </w:instrText>
       </w:r>
       <w:r>
         <w:fldChar w:fldCharType="separate"/>
@@ -4064,7 +4072,7 @@
         <w:fldChar w:fldCharType="begin"/>
       </w:r>
       <w:r>
-        <w:instrText xml:space="preserve"> PAGEREF _Toc2248 \h </w:instrText>
+        <w:instrText xml:space="preserve"> PAGEREF _Toc11691 \h </w:instrText>
       </w:r>
       <w:r>
         <w:fldChar w:fldCharType="separate"/>
@@ -4090,7 +4098,7 @@
         <w:fldChar w:fldCharType="begin"/>
       </w:r>
       <w:r>
-        <w:instrText xml:space="preserve"> HYPERLINK \l _Toc32348 </w:instrText>
+        <w:instrText xml:space="preserve"> HYPERLINK \l _Toc1506 </w:instrText>
       </w:r>
       <w:r>
         <w:fldChar w:fldCharType="separate"/>
@@ -4105,7 +4113,7 @@
         <w:fldChar w:fldCharType="begin"/>
       </w:r>
       <w:r>
-        <w:instrText xml:space="preserve"> PAGEREF _Toc32348 \h </w:instrText>
+        <w:instrText xml:space="preserve"> PAGEREF _Toc1506 \h </w:instrText>
       </w:r>
       <w:r>
         <w:fldChar w:fldCharType="separate"/>
@@ -4131,7 +4139,7 @@
         <w:fldChar w:fldCharType="begin"/>
       </w:r>
       <w:r>
-        <w:instrText xml:space="preserve"> HYPERLINK \l _Toc23978 </w:instrText>
+        <w:instrText xml:space="preserve"> HYPERLINK \l _Toc24742 </w:instrText>
       </w:r>
       <w:r>
         <w:fldChar w:fldCharType="separate"/>
@@ -4146,7 +4154,7 @@
         <w:fldChar w:fldCharType="begin"/>
       </w:r>
       <w:r>
-        <w:instrText xml:space="preserve"> PAGEREF _Toc23978 \h </w:instrText>
+        <w:instrText xml:space="preserve"> PAGEREF _Toc24742 \h </w:instrText>
       </w:r>
       <w:r>
         <w:fldChar w:fldCharType="separate"/>
@@ -4172,7 +4180,7 @@
         <w:fldChar w:fldCharType="begin"/>
       </w:r>
       <w:r>
-        <w:instrText xml:space="preserve"> HYPERLINK \l _Toc6803 </w:instrText>
+        <w:instrText xml:space="preserve"> HYPERLINK \l _Toc20626 </w:instrText>
       </w:r>
       <w:r>
         <w:fldChar w:fldCharType="separate"/>
@@ -4187,7 +4195,7 @@
         <w:fldChar w:fldCharType="begin"/>
       </w:r>
       <w:r>
-        <w:instrText xml:space="preserve"> PAGEREF _Toc6803 \h </w:instrText>
+        <w:instrText xml:space="preserve"> PAGEREF _Toc20626 \h </w:instrText>
       </w:r>
       <w:r>
         <w:fldChar w:fldCharType="separate"/>
@@ -4213,7 +4221,7 @@
         <w:fldChar w:fldCharType="begin"/>
       </w:r>
       <w:r>
-        <w:instrText xml:space="preserve"> HYPERLINK \l _Toc17041 </w:instrText>
+        <w:instrText xml:space="preserve"> HYPERLINK \l _Toc16596 </w:instrText>
       </w:r>
       <w:r>
         <w:fldChar w:fldCharType="separate"/>
@@ -4228,7 +4236,7 @@
         <w:fldChar w:fldCharType="begin"/>
       </w:r>
       <w:r>
-        <w:instrText xml:space="preserve"> PAGEREF _Toc17041 \h </w:instrText>
+        <w:instrText xml:space="preserve"> PAGEREF _Toc16596 \h </w:instrText>
       </w:r>
       <w:r>
         <w:fldChar w:fldCharType="separate"/>
@@ -4254,7 +4262,7 @@
         <w:fldChar w:fldCharType="begin"/>
       </w:r>
       <w:r>
-        <w:instrText xml:space="preserve"> HYPERLINK \l _Toc8409 </w:instrText>
+        <w:instrText xml:space="preserve"> HYPERLINK \l _Toc11756 </w:instrText>
       </w:r>
       <w:r>
         <w:fldChar w:fldCharType="separate"/>
@@ -4269,7 +4277,7 @@
         <w:fldChar w:fldCharType="begin"/>
       </w:r>
       <w:r>
-        <w:instrText xml:space="preserve"> PAGEREF _Toc8409 \h </w:instrText>
+        <w:instrText xml:space="preserve"> PAGEREF _Toc11756 \h </w:instrText>
       </w:r>
       <w:r>
         <w:fldChar w:fldCharType="separate"/>
@@ -4295,7 +4303,7 @@
         <w:fldChar w:fldCharType="begin"/>
       </w:r>
       <w:r>
-        <w:instrText xml:space="preserve"> HYPERLINK \l _Toc27624 </w:instrText>
+        <w:instrText xml:space="preserve"> HYPERLINK \l _Toc29505 </w:instrText>
       </w:r>
       <w:r>
         <w:fldChar w:fldCharType="separate"/>
@@ -4310,7 +4318,7 @@
         <w:fldChar w:fldCharType="begin"/>
       </w:r>
       <w:r>
-        <w:instrText xml:space="preserve"> PAGEREF _Toc27624 \h </w:instrText>
+        <w:instrText xml:space="preserve"> PAGEREF _Toc29505 \h </w:instrText>
       </w:r>
       <w:r>
         <w:fldChar w:fldCharType="separate"/>
@@ -4336,7 +4344,7 @@
         <w:fldChar w:fldCharType="begin"/>
       </w:r>
       <w:r>
-        <w:instrText xml:space="preserve"> HYPERLINK \l _Toc24305 </w:instrText>
+        <w:instrText xml:space="preserve"> HYPERLINK \l _Toc27356 </w:instrText>
       </w:r>
       <w:r>
         <w:fldChar w:fldCharType="separate"/>
@@ -4351,7 +4359,7 @@
         <w:fldChar w:fldCharType="begin"/>
       </w:r>
       <w:r>
-        <w:instrText xml:space="preserve"> PAGEREF _Toc24305 \h </w:instrText>
+        <w:instrText xml:space="preserve"> PAGEREF _Toc27356 \h </w:instrText>
       </w:r>
       <w:r>
         <w:fldChar w:fldCharType="separate"/>
@@ -4377,7 +4385,7 @@
         <w:fldChar w:fldCharType="begin"/>
       </w:r>
       <w:r>
-        <w:instrText xml:space="preserve"> HYPERLINK \l _Toc14182 </w:instrText>
+        <w:instrText xml:space="preserve"> HYPERLINK \l _Toc9451 </w:instrText>
       </w:r>
       <w:r>
         <w:fldChar w:fldCharType="separate"/>
@@ -4392,7 +4400,7 @@
         <w:fldChar w:fldCharType="begin"/>
       </w:r>
       <w:r>
-        <w:instrText xml:space="preserve"> PAGEREF _Toc14182 \h </w:instrText>
+        <w:instrText xml:space="preserve"> PAGEREF _Toc9451 \h </w:instrText>
       </w:r>
       <w:r>
         <w:fldChar w:fldCharType="separate"/>
@@ -4418,7 +4426,7 @@
         <w:fldChar w:fldCharType="begin"/>
       </w:r>
       <w:r>
-        <w:instrText xml:space="preserve"> HYPERLINK \l _Toc20171 </w:instrText>
+        <w:instrText xml:space="preserve"> HYPERLINK \l _Toc27913 </w:instrText>
       </w:r>
       <w:r>
         <w:fldChar w:fldCharType="separate"/>
@@ -4433,7 +4441,7 @@
         <w:fldChar w:fldCharType="begin"/>
       </w:r>
       <w:r>
-        <w:instrText xml:space="preserve"> PAGEREF _Toc20171 \h </w:instrText>
+        <w:instrText xml:space="preserve"> PAGEREF _Toc27913 \h </w:instrText>
       </w:r>
       <w:r>
         <w:fldChar w:fldCharType="separate"/>
@@ -4459,7 +4467,7 @@
         <w:fldChar w:fldCharType="begin"/>
       </w:r>
       <w:r>
-        <w:instrText xml:space="preserve"> HYPERLINK \l _Toc17920 </w:instrText>
+        <w:instrText xml:space="preserve"> HYPERLINK \l _Toc26364 </w:instrText>
       </w:r>
       <w:r>
         <w:fldChar w:fldCharType="separate"/>
@@ -4474,7 +4482,7 @@
         <w:fldChar w:fldCharType="begin"/>
       </w:r>
       <w:r>
-        <w:instrText xml:space="preserve"> PAGEREF _Toc17920 \h </w:instrText>
+        <w:instrText xml:space="preserve"> PAGEREF _Toc26364 \h </w:instrText>
       </w:r>
       <w:r>
         <w:fldChar w:fldCharType="separate"/>
@@ -4500,7 +4508,7 @@
         <w:fldChar w:fldCharType="begin"/>
       </w:r>
       <w:r>
-        <w:instrText xml:space="preserve"> HYPERLINK \l _Toc2341 </w:instrText>
+        <w:instrText xml:space="preserve"> HYPERLINK \l _Toc8875 </w:instrText>
       </w:r>
       <w:r>
         <w:fldChar w:fldCharType="separate"/>
@@ -4515,7 +4523,7 @@
         <w:fldChar w:fldCharType="begin"/>
       </w:r>
       <w:r>
-        <w:instrText xml:space="preserve"> PAGEREF _Toc2341 \h </w:instrText>
+        <w:instrText xml:space="preserve"> PAGEREF _Toc8875 \h </w:instrText>
       </w:r>
       <w:r>
         <w:fldChar w:fldCharType="separate"/>
@@ -4541,7 +4549,7 @@
         <w:fldChar w:fldCharType="begin"/>
       </w:r>
       <w:r>
-        <w:instrText xml:space="preserve"> HYPERLINK \l _Toc25237 </w:instrText>
+        <w:instrText xml:space="preserve"> HYPERLINK \l _Toc20919 </w:instrText>
       </w:r>
       <w:r>
         <w:fldChar w:fldCharType="separate"/>
@@ -4556,7 +4564,7 @@
         <w:fldChar w:fldCharType="begin"/>
       </w:r>
       <w:r>
-        <w:instrText xml:space="preserve"> PAGEREF _Toc25237 \h </w:instrText>
+        <w:instrText xml:space="preserve"> PAGEREF _Toc20919 \h </w:instrText>
       </w:r>
       <w:r>
         <w:fldChar w:fldCharType="separate"/>
@@ -4582,7 +4590,7 @@
         <w:fldChar w:fldCharType="begin"/>
       </w:r>
       <w:r>
-        <w:instrText xml:space="preserve"> HYPERLINK \l _Toc22039 </w:instrText>
+        <w:instrText xml:space="preserve"> HYPERLINK \l _Toc16955 </w:instrText>
       </w:r>
       <w:r>
         <w:fldChar w:fldCharType="separate"/>
@@ -4597,7 +4605,7 @@
         <w:fldChar w:fldCharType="begin"/>
       </w:r>
       <w:r>
-        <w:instrText xml:space="preserve"> PAGEREF _Toc22039 \h </w:instrText>
+        <w:instrText xml:space="preserve"> PAGEREF _Toc16955 \h </w:instrText>
       </w:r>
       <w:r>
         <w:fldChar w:fldCharType="separate"/>
@@ -4623,7 +4631,7 @@
         <w:fldChar w:fldCharType="begin"/>
       </w:r>
       <w:r>
-        <w:instrText xml:space="preserve"> HYPERLINK \l _Toc716 </w:instrText>
+        <w:instrText xml:space="preserve"> HYPERLINK \l _Toc19433 </w:instrText>
       </w:r>
       <w:r>
         <w:fldChar w:fldCharType="separate"/>
@@ -4638,7 +4646,7 @@
         <w:fldChar w:fldCharType="begin"/>
       </w:r>
       <w:r>
-        <w:instrText xml:space="preserve"> PAGEREF _Toc716 \h </w:instrText>
+        <w:instrText xml:space="preserve"> PAGEREF _Toc19433 \h </w:instrText>
       </w:r>
       <w:r>
         <w:fldChar w:fldCharType="separate"/>
@@ -4664,7 +4672,7 @@
         <w:fldChar w:fldCharType="begin"/>
       </w:r>
       <w:r>
-        <w:instrText xml:space="preserve"> HYPERLINK \l _Toc4846 </w:instrText>
+        <w:instrText xml:space="preserve"> HYPERLINK \l _Toc24736 </w:instrText>
       </w:r>
       <w:r>
         <w:fldChar w:fldCharType="separate"/>
@@ -4679,7 +4687,7 @@
         <w:fldChar w:fldCharType="begin"/>
       </w:r>
       <w:r>
-        <w:instrText xml:space="preserve"> PAGEREF _Toc4846 \h </w:instrText>
+        <w:instrText xml:space="preserve"> PAGEREF _Toc24736 \h </w:instrText>
       </w:r>
       <w:r>
         <w:fldChar w:fldCharType="separate"/>
@@ -4705,7 +4713,7 @@
         <w:fldChar w:fldCharType="begin"/>
       </w:r>
       <w:r>
-        <w:instrText xml:space="preserve"> HYPERLINK \l _Toc23541 </w:instrText>
+        <w:instrText xml:space="preserve"> HYPERLINK \l _Toc743 </w:instrText>
       </w:r>
       <w:r>
         <w:fldChar w:fldCharType="separate"/>
@@ -4720,7 +4728,7 @@
         <w:fldChar w:fldCharType="begin"/>
       </w:r>
       <w:r>
-        <w:instrText xml:space="preserve"> PAGEREF _Toc23541 \h </w:instrText>
+        <w:instrText xml:space="preserve"> PAGEREF _Toc743 \h </w:instrText>
       </w:r>
       <w:r>
         <w:fldChar w:fldCharType="separate"/>
@@ -4746,7 +4754,7 @@
         <w:fldChar w:fldCharType="begin"/>
       </w:r>
       <w:r>
-        <w:instrText xml:space="preserve"> HYPERLINK \l _Toc8204 </w:instrText>
+        <w:instrText xml:space="preserve"> HYPERLINK \l _Toc22978 </w:instrText>
       </w:r>
       <w:r>
         <w:fldChar w:fldCharType="separate"/>
@@ -4761,7 +4769,7 @@
         <w:fldChar w:fldCharType="begin"/>
       </w:r>
       <w:r>
-        <w:instrText xml:space="preserve"> PAGEREF _Toc8204 \h </w:instrText>
+        <w:instrText xml:space="preserve"> PAGEREF _Toc22978 \h </w:instrText>
       </w:r>
       <w:r>
         <w:fldChar w:fldCharType="separate"/>
@@ -4787,7 +4795,7 @@
         <w:fldChar w:fldCharType="begin"/>
       </w:r>
       <w:r>
-        <w:instrText xml:space="preserve"> HYPERLINK \l _Toc5106 </w:instrText>
+        <w:instrText xml:space="preserve"> HYPERLINK \l _Toc16211 </w:instrText>
       </w:r>
       <w:r>
         <w:fldChar w:fldCharType="separate"/>
@@ -4802,7 +4810,7 @@
         <w:fldChar w:fldCharType="begin"/>
       </w:r>
       <w:r>
-        <w:instrText xml:space="preserve"> PAGEREF _Toc5106 \h </w:instrText>
+        <w:instrText xml:space="preserve"> PAGEREF _Toc16211 \h </w:instrText>
       </w:r>
       <w:r>
         <w:fldChar w:fldCharType="separate"/>
@@ -4828,7 +4836,7 @@
         <w:fldChar w:fldCharType="begin"/>
       </w:r>
       <w:r>
-        <w:instrText xml:space="preserve"> HYPERLINK \l _Toc24234 </w:instrText>
+        <w:instrText xml:space="preserve"> HYPERLINK \l _Toc9894 </w:instrText>
       </w:r>
       <w:r>
         <w:fldChar w:fldCharType="separate"/>
@@ -4843,7 +4851,7 @@
         <w:fldChar w:fldCharType="begin"/>
       </w:r>
       <w:r>
-        <w:instrText xml:space="preserve"> PAGEREF _Toc24234 \h </w:instrText>
+        <w:instrText xml:space="preserve"> PAGEREF _Toc9894 \h </w:instrText>
       </w:r>
       <w:r>
         <w:fldChar w:fldCharType="separate"/>
@@ -4869,7 +4877,7 @@
         <w:fldChar w:fldCharType="begin"/>
       </w:r>
       <w:r>
-        <w:instrText xml:space="preserve"> HYPERLINK \l _Toc5750 </w:instrText>
+        <w:instrText xml:space="preserve"> HYPERLINK \l _Toc25928 </w:instrText>
       </w:r>
       <w:r>
         <w:fldChar w:fldCharType="separate"/>
@@ -4884,7 +4892,7 @@
         <w:fldChar w:fldCharType="begin"/>
       </w:r>
       <w:r>
-        <w:instrText xml:space="preserve"> PAGEREF _Toc5750 \h </w:instrText>
+        <w:instrText xml:space="preserve"> PAGEREF _Toc25928 \h </w:instrText>
       </w:r>
       <w:r>
         <w:fldChar w:fldCharType="separate"/>
@@ -4910,7 +4918,7 @@
         <w:fldChar w:fldCharType="begin"/>
       </w:r>
       <w:r>
-        <w:instrText xml:space="preserve"> HYPERLINK \l _Toc17828 </w:instrText>
+        <w:instrText xml:space="preserve"> HYPERLINK \l _Toc21892 </w:instrText>
       </w:r>
       <w:r>
         <w:fldChar w:fldCharType="separate"/>
@@ -4925,7 +4933,7 @@
         <w:fldChar w:fldCharType="begin"/>
       </w:r>
       <w:r>
-        <w:instrText xml:space="preserve"> PAGEREF _Toc17828 \h </w:instrText>
+        <w:instrText xml:space="preserve"> PAGEREF _Toc21892 \h </w:instrText>
       </w:r>
       <w:r>
         <w:fldChar w:fldCharType="separate"/>
@@ -4951,7 +4959,7 @@
         <w:fldChar w:fldCharType="begin"/>
       </w:r>
       <w:r>
-        <w:instrText xml:space="preserve"> HYPERLINK \l _Toc6422 </w:instrText>
+        <w:instrText xml:space="preserve"> HYPERLINK \l _Toc8855 </w:instrText>
       </w:r>
       <w:r>
         <w:fldChar w:fldCharType="separate"/>
@@ -4966,7 +4974,7 @@
         <w:fldChar w:fldCharType="begin"/>
       </w:r>
       <w:r>
-        <w:instrText xml:space="preserve"> PAGEREF _Toc6422 \h </w:instrText>
+        <w:instrText xml:space="preserve"> PAGEREF _Toc8855 \h </w:instrText>
       </w:r>
       <w:r>
         <w:fldChar w:fldCharType="separate"/>
@@ -4992,7 +5000,7 @@
         <w:fldChar w:fldCharType="begin"/>
       </w:r>
       <w:r>
-        <w:instrText xml:space="preserve"> HYPERLINK \l _Toc3519 </w:instrText>
+        <w:instrText xml:space="preserve"> HYPERLINK \l _Toc15223 </w:instrText>
       </w:r>
       <w:r>
         <w:fldChar w:fldCharType="separate"/>
@@ -5007,7 +5015,7 @@
         <w:fldChar w:fldCharType="begin"/>
       </w:r>
       <w:r>
-        <w:instrText xml:space="preserve"> PAGEREF _Toc3519 \h </w:instrText>
+        <w:instrText xml:space="preserve"> PAGEREF _Toc15223 \h </w:instrText>
       </w:r>
       <w:r>
         <w:fldChar w:fldCharType="separate"/>
@@ -5033,7 +5041,7 @@
         <w:fldChar w:fldCharType="begin"/>
       </w:r>
       <w:r>
-        <w:instrText xml:space="preserve"> HYPERLINK \l _Toc27900 </w:instrText>
+        <w:instrText xml:space="preserve"> HYPERLINK \l _Toc9275 </w:instrText>
       </w:r>
       <w:r>
         <w:fldChar w:fldCharType="separate"/>
@@ -5048,7 +5056,7 @@
         <w:fldChar w:fldCharType="begin"/>
       </w:r>
       <w:r>
-        <w:instrText xml:space="preserve"> PAGEREF _Toc27900 \h </w:instrText>
+        <w:instrText xml:space="preserve"> PAGEREF _Toc9275 \h </w:instrText>
       </w:r>
       <w:r>
         <w:fldChar w:fldCharType="separate"/>
@@ -5643,7 +5651,7 @@
         <w:fldChar w:fldCharType="begin"/>
       </w:r>
       <w:r>
-        <w:instrText xml:space="preserve"> HYPERLINK \l _Toc14599 </w:instrText>
+        <w:instrText xml:space="preserve"> HYPERLINK \l _Toc29874 </w:instrText>
       </w:r>
       <w:r>
         <w:fldChar w:fldCharType="separate"/>
@@ -5658,7 +5666,7 @@
         <w:fldChar w:fldCharType="begin"/>
       </w:r>
       <w:r>
-        <w:instrText xml:space="preserve"> PAGEREF _Toc14599 \h </w:instrText>
+        <w:instrText xml:space="preserve"> PAGEREF _Toc29874 \h </w:instrText>
       </w:r>
       <w:r>
         <w:fldChar w:fldCharType="separate"/>
@@ -5684,7 +5692,7 @@
         <w:fldChar w:fldCharType="begin"/>
       </w:r>
       <w:r>
-        <w:instrText xml:space="preserve"> HYPERLINK \l _Toc29517 </w:instrText>
+        <w:instrText xml:space="preserve"> HYPERLINK \l _Toc13365 </w:instrText>
       </w:r>
       <w:r>
         <w:fldChar w:fldCharType="separate"/>
@@ -5699,7 +5707,7 @@
         <w:fldChar w:fldCharType="begin"/>
       </w:r>
       <w:r>
-        <w:instrText xml:space="preserve"> PAGEREF _Toc29517 \h </w:instrText>
+        <w:instrText xml:space="preserve"> PAGEREF _Toc13365 \h </w:instrText>
       </w:r>
       <w:r>
         <w:fldChar w:fldCharType="separate"/>
@@ -5725,7 +5733,7 @@
         <w:fldChar w:fldCharType="begin"/>
       </w:r>
       <w:r>
-        <w:instrText xml:space="preserve"> HYPERLINK \l _Toc5689 </w:instrText>
+        <w:instrText xml:space="preserve"> HYPERLINK \l _Toc12131 </w:instrText>
       </w:r>
       <w:r>
         <w:fldChar w:fldCharType="separate"/>
@@ -5740,7 +5748,7 @@
         <w:fldChar w:fldCharType="begin"/>
       </w:r>
       <w:r>
-        <w:instrText xml:space="preserve"> PAGEREF _Toc5689 \h </w:instrText>
+        <w:instrText xml:space="preserve"> PAGEREF _Toc12131 \h </w:instrText>
       </w:r>
       <w:r>
         <w:fldChar w:fldCharType="separate"/>
@@ -5766,7 +5774,7 @@
         <w:fldChar w:fldCharType="begin"/>
       </w:r>
       <w:r>
-        <w:instrText xml:space="preserve"> HYPERLINK \l _Toc29038 </w:instrText>
+        <w:instrText xml:space="preserve"> HYPERLINK \l _Toc27495 </w:instrText>
       </w:r>
       <w:r>
         <w:fldChar w:fldCharType="separate"/>
@@ -5781,7 +5789,7 @@
         <w:fldChar w:fldCharType="begin"/>
       </w:r>
       <w:r>
-        <w:instrText xml:space="preserve"> PAGEREF _Toc29038 \h </w:instrText>
+        <w:instrText xml:space="preserve"> PAGEREF _Toc27495 \h </w:instrText>
       </w:r>
       <w:r>
         <w:fldChar w:fldCharType="separate"/>
@@ -5807,7 +5815,7 @@
         <w:fldChar w:fldCharType="begin"/>
       </w:r>
       <w:r>
-        <w:instrText xml:space="preserve"> HYPERLINK \l _Toc10321 </w:instrText>
+        <w:instrText xml:space="preserve"> HYPERLINK \l _Toc24233 </w:instrText>
       </w:r>
       <w:r>
         <w:fldChar w:fldCharType="separate"/>
@@ -5822,7 +5830,7 @@
         <w:fldChar w:fldCharType="begin"/>
       </w:r>
       <w:r>
-        <w:instrText xml:space="preserve"> PAGEREF _Toc10321 \h </w:instrText>
+        <w:instrText xml:space="preserve"> PAGEREF _Toc24233 \h </w:instrText>
       </w:r>
       <w:r>
         <w:fldChar w:fldCharType="separate"/>
@@ -5848,7 +5856,7 @@
         <w:fldChar w:fldCharType="begin"/>
       </w:r>
       <w:r>
-        <w:instrText xml:space="preserve"> HYPERLINK \l _Toc11476 </w:instrText>
+        <w:instrText xml:space="preserve"> HYPERLINK \l _Toc16167 </w:instrText>
       </w:r>
       <w:r>
         <w:fldChar w:fldCharType="separate"/>
@@ -5863,7 +5871,7 @@
         <w:fldChar w:fldCharType="begin"/>
       </w:r>
       <w:r>
-        <w:instrText xml:space="preserve"> PAGEREF _Toc11476 \h </w:instrText>
+        <w:instrText xml:space="preserve"> PAGEREF _Toc16167 \h </w:instrText>
       </w:r>
       <w:r>
         <w:fldChar w:fldCharType="separate"/>
@@ -5889,7 +5897,7 @@
         <w:fldChar w:fldCharType="begin"/>
       </w:r>
       <w:r>
-        <w:instrText xml:space="preserve"> HYPERLINK \l _Toc23477 </w:instrText>
+        <w:instrText xml:space="preserve"> HYPERLINK \l _Toc7757 </w:instrText>
       </w:r>
       <w:r>
         <w:fldChar w:fldCharType="separate"/>
@@ -5901,7 +5909,7 @@
         <w:sdtPr>
           <w:alias w:val="MÃ CA TRUY VẾT"/>
           <w:tag w:val="SV_0120"/>
-          <w:id w:val="147464658"/>
+          <w:id w:val="147478116"/>
           <w:text w:multiLine="1"/>
         </w:sdtPr>
         <w:sdtContent>
@@ -5917,7 +5925,7 @@
         <w:fldChar w:fldCharType="begin"/>
       </w:r>
       <w:r>
-        <w:instrText xml:space="preserve"> PAGEREF _Toc23477 \h </w:instrText>
+        <w:instrText xml:space="preserve"> PAGEREF _Toc7757 \h </w:instrText>
       </w:r>
       <w:r>
         <w:fldChar w:fldCharType="separate"/>
@@ -5943,7 +5951,7 @@
         <w:fldChar w:fldCharType="begin"/>
       </w:r>
       <w:r>
-        <w:instrText xml:space="preserve"> HYPERLINK \l _Toc12809 </w:instrText>
+        <w:instrText xml:space="preserve"> HYPERLINK \l _Toc12459 </w:instrText>
       </w:r>
       <w:r>
         <w:fldChar w:fldCharType="separate"/>
@@ -5958,7 +5966,7 @@
         <w:fldChar w:fldCharType="begin"/>
       </w:r>
       <w:r>
-        <w:instrText xml:space="preserve"> PAGEREF _Toc12809 \h </w:instrText>
+        <w:instrText xml:space="preserve"> PAGEREF _Toc12459 \h </w:instrText>
       </w:r>
       <w:r>
         <w:fldChar w:fldCharType="separate"/>
@@ -5984,7 +5992,7 @@
         <w:fldChar w:fldCharType="begin"/>
       </w:r>
       <w:r>
-        <w:instrText xml:space="preserve"> HYPERLINK \l _Toc32149 </w:instrText>
+        <w:instrText xml:space="preserve"> HYPERLINK \l _Toc5398 </w:instrText>
       </w:r>
       <w:r>
         <w:fldChar w:fldCharType="separate"/>
@@ -5999,7 +6007,7 @@
         <w:fldChar w:fldCharType="begin"/>
       </w:r>
       <w:r>
-        <w:instrText xml:space="preserve"> PAGEREF _Toc32149 \h </w:instrText>
+        <w:instrText xml:space="preserve"> PAGEREF _Toc5398 \h </w:instrText>
       </w:r>
       <w:r>
         <w:fldChar w:fldCharType="separate"/>
@@ -6025,7 +6033,7 @@
         <w:fldChar w:fldCharType="begin"/>
       </w:r>
       <w:r>
-        <w:instrText xml:space="preserve"> HYPERLINK \l _Toc2306 </w:instrText>
+        <w:instrText xml:space="preserve"> HYPERLINK \l _Toc21618 </w:instrText>
       </w:r>
       <w:r>
         <w:fldChar w:fldCharType="separate"/>
@@ -6040,7 +6048,7 @@
         <w:fldChar w:fldCharType="begin"/>
       </w:r>
       <w:r>
-        <w:instrText xml:space="preserve"> PAGEREF _Toc2306 \h </w:instrText>
+        <w:instrText xml:space="preserve"> PAGEREF _Toc21618 \h </w:instrText>
       </w:r>
       <w:r>
         <w:fldChar w:fldCharType="separate"/>
@@ -6066,7 +6074,7 @@
         <w:fldChar w:fldCharType="begin"/>
       </w:r>
       <w:r>
-        <w:instrText xml:space="preserve"> HYPERLINK \l _Toc20349 </w:instrText>
+        <w:instrText xml:space="preserve"> HYPERLINK \l _Toc21238 </w:instrText>
       </w:r>
       <w:r>
         <w:fldChar w:fldCharType="separate"/>
@@ -6081,7 +6089,7 @@
         <w:fldChar w:fldCharType="begin"/>
       </w:r>
       <w:r>
-        <w:instrText xml:space="preserve"> PAGEREF _Toc20349 \h </w:instrText>
+        <w:instrText xml:space="preserve"> PAGEREF _Toc21238 \h </w:instrText>
       </w:r>
       <w:r>
         <w:fldChar w:fldCharType="separate"/>
@@ -6107,7 +6115,7 @@
         <w:fldChar w:fldCharType="begin"/>
       </w:r>
       <w:r>
-        <w:instrText xml:space="preserve"> HYPERLINK \l _Toc26875 </w:instrText>
+        <w:instrText xml:space="preserve"> HYPERLINK \l _Toc23126 </w:instrText>
       </w:r>
       <w:r>
         <w:fldChar w:fldCharType="separate"/>
@@ -6122,7 +6130,7 @@
         <w:fldChar w:fldCharType="begin"/>
       </w:r>
       <w:r>
-        <w:instrText xml:space="preserve"> PAGEREF _Toc26875 \h </w:instrText>
+        <w:instrText xml:space="preserve"> PAGEREF _Toc23126 \h </w:instrText>
       </w:r>
       <w:r>
         <w:fldChar w:fldCharType="separate"/>
@@ -6148,7 +6156,7 @@
         <w:fldChar w:fldCharType="begin"/>
       </w:r>
       <w:r>
-        <w:instrText xml:space="preserve"> HYPERLINK \l _Toc8226 </w:instrText>
+        <w:instrText xml:space="preserve"> HYPERLINK \l _Toc20830 </w:instrText>
       </w:r>
       <w:r>
         <w:fldChar w:fldCharType="separate"/>
@@ -6163,7 +6171,7 @@
         <w:fldChar w:fldCharType="begin"/>
       </w:r>
       <w:r>
-        <w:instrText xml:space="preserve"> PAGEREF _Toc8226 \h </w:instrText>
+        <w:instrText xml:space="preserve"> PAGEREF _Toc20830 \h </w:instrText>
       </w:r>
       <w:r>
         <w:fldChar w:fldCharType="separate"/>
@@ -6189,7 +6197,7 @@
         <w:fldChar w:fldCharType="begin"/>
       </w:r>
       <w:r>
-        <w:instrText xml:space="preserve"> HYPERLINK \l _Toc20603 </w:instrText>
+        <w:instrText xml:space="preserve"> HYPERLINK \l _Toc17146 </w:instrText>
       </w:r>
       <w:r>
         <w:fldChar w:fldCharType="separate"/>
@@ -6204,7 +6212,7 @@
         <w:fldChar w:fldCharType="begin"/>
       </w:r>
       <w:r>
-        <w:instrText xml:space="preserve"> PAGEREF _Toc20603 \h </w:instrText>
+        <w:instrText xml:space="preserve"> PAGEREF _Toc17146 \h </w:instrText>
       </w:r>
       <w:r>
         <w:fldChar w:fldCharType="separate"/>
@@ -6230,7 +6238,7 @@
         <w:fldChar w:fldCharType="begin"/>
       </w:r>
       <w:r>
-        <w:instrText xml:space="preserve"> HYPERLINK \l _Toc23540 </w:instrText>
+        <w:instrText xml:space="preserve"> HYPERLINK \l _Toc12158 </w:instrText>
       </w:r>
       <w:r>
         <w:fldChar w:fldCharType="separate"/>
@@ -6245,7 +6253,7 @@
         <w:fldChar w:fldCharType="begin"/>
       </w:r>
       <w:r>
-        <w:instrText xml:space="preserve"> PAGEREF _Toc23540 \h </w:instrText>
+        <w:instrText xml:space="preserve"> PAGEREF _Toc12158 \h </w:instrText>
       </w:r>
       <w:r>
         <w:fldChar w:fldCharType="separate"/>
@@ -6319,7 +6327,7 @@
         <w:fldChar w:fldCharType="begin"/>
       </w:r>
       <w:r>
-        <w:instrText xml:space="preserve"> HYPERLINK \l _Toc23301 </w:instrText>
+        <w:instrText xml:space="preserve"> HYPERLINK \l _Toc20797 </w:instrText>
       </w:r>
       <w:r>
         <w:fldChar w:fldCharType="separate"/>
@@ -6331,7 +6339,7 @@
         <w:sdtPr>
           <w:alias w:val="MÃ CA HOẶC ĐỐI TƯỢNG"/>
           <w:tag w:val="SV_0265"/>
-          <w:id w:val="147461596"/>
+          <w:id w:val="147480915"/>
           <w:text w:multiLine="1"/>
         </w:sdtPr>
         <w:sdtContent>
@@ -6347,7 +6355,7 @@
         <w:fldChar w:fldCharType="begin"/>
       </w:r>
       <w:r>
-        <w:instrText xml:space="preserve"> PAGEREF _Toc23301 \h </w:instrText>
+        <w:instrText xml:space="preserve"> PAGEREF _Toc20797 \h </w:instrText>
       </w:r>
       <w:r>
         <w:fldChar w:fldCharType="separate"/>
@@ -6373,7 +6381,7 @@
         <w:fldChar w:fldCharType="begin"/>
       </w:r>
       <w:r>
-        <w:instrText xml:space="preserve"> HYPERLINK \l _Toc11687 </w:instrText>
+        <w:instrText xml:space="preserve"> HYPERLINK \l _Toc16794 </w:instrText>
       </w:r>
       <w:r>
         <w:fldChar w:fldCharType="separate"/>
@@ -6385,7 +6393,7 @@
         <w:sdtPr>
           <w:alias w:val="MÃ CA HOẶC ĐỐI TƯỢNG"/>
           <w:tag w:val="SV_0274"/>
-          <w:id w:val="147471292"/>
+          <w:id w:val="147461773"/>
           <w:text w:multiLine="1"/>
         </w:sdtPr>
         <w:sdtContent>
@@ -6401,7 +6409,7 @@
         <w:fldChar w:fldCharType="begin"/>
       </w:r>
       <w:r>
-        <w:instrText xml:space="preserve"> PAGEREF _Toc11687 \h </w:instrText>
+        <w:instrText xml:space="preserve"> PAGEREF _Toc16794 \h </w:instrText>
       </w:r>
       <w:r>
         <w:fldChar w:fldCharType="separate"/>
@@ -6427,7 +6435,7 @@
         <w:fldChar w:fldCharType="begin"/>
       </w:r>
       <w:r>
-        <w:instrText xml:space="preserve"> HYPERLINK \l _Toc7989 </w:instrText>
+        <w:instrText xml:space="preserve"> HYPERLINK \l _Toc32551 </w:instrText>
       </w:r>
       <w:r>
         <w:fldChar w:fldCharType="separate"/>
@@ -6439,7 +6447,7 @@
         <w:sdtPr>
           <w:alias w:val="MÃ CA HOẶC ĐỐI TƯỢNG"/>
           <w:tag w:val="SV_0278"/>
-          <w:id w:val="147477946"/>
+          <w:id w:val="147459968"/>
           <w:text w:multiLine="1"/>
         </w:sdtPr>
         <w:sdtContent>
@@ -6455,7 +6463,7 @@
         <w:fldChar w:fldCharType="begin"/>
       </w:r>
       <w:r>
-        <w:instrText xml:space="preserve"> PAGEREF _Toc7989 \h </w:instrText>
+        <w:instrText xml:space="preserve"> PAGEREF _Toc32551 \h </w:instrText>
       </w:r>
       <w:r>
         <w:fldChar w:fldCharType="separate"/>
@@ -6481,7 +6489,7 @@
         <w:fldChar w:fldCharType="begin"/>
       </w:r>
       <w:r>
-        <w:instrText xml:space="preserve"> HYPERLINK \l _Toc25440 </w:instrText>
+        <w:instrText xml:space="preserve"> HYPERLINK \l _Toc28991 </w:instrText>
       </w:r>
       <w:r>
         <w:fldChar w:fldCharType="separate"/>
@@ -6493,7 +6501,7 @@
         <w:sdtPr>
           <w:alias w:val="MÃ CA HOẶC ĐỐI TƯỢNG"/>
           <w:tag w:val="SV_0282"/>
-          <w:id w:val="147471093"/>
+          <w:id w:val="147466575"/>
           <w:text w:multiLine="1"/>
         </w:sdtPr>
         <w:sdtContent>
@@ -6509,7 +6517,7 @@
         <w:fldChar w:fldCharType="begin"/>
       </w:r>
       <w:r>
-        <w:instrText xml:space="preserve"> PAGEREF _Toc25440 \h </w:instrText>
+        <w:instrText xml:space="preserve"> PAGEREF _Toc28991 \h </w:instrText>
       </w:r>
       <w:r>
         <w:fldChar w:fldCharType="separate"/>
@@ -6535,7 +6543,7 @@
         <w:fldChar w:fldCharType="begin"/>
       </w:r>
       <w:r>
-        <w:instrText xml:space="preserve"> HYPERLINK \l _Toc3279 </w:instrText>
+        <w:instrText xml:space="preserve"> HYPERLINK \l _Toc22189 </w:instrText>
       </w:r>
       <w:r>
         <w:fldChar w:fldCharType="separate"/>
@@ -6547,7 +6555,7 @@
         <w:sdtPr>
           <w:alias w:val="MÃ CA HOẶC ĐỐI TƯỢNG"/>
           <w:tag w:val="SV_0287"/>
-          <w:id w:val="147468146"/>
+          <w:id w:val="147464760"/>
           <w:text w:multiLine="1"/>
         </w:sdtPr>
         <w:sdtContent>
@@ -6563,7 +6571,7 @@
         <w:fldChar w:fldCharType="begin"/>
       </w:r>
       <w:r>
-        <w:instrText xml:space="preserve"> PAGEREF _Toc3279 \h </w:instrText>
+        <w:instrText xml:space="preserve"> PAGEREF _Toc22189 \h </w:instrText>
       </w:r>
       <w:r>
         <w:fldChar w:fldCharType="separate"/>
@@ -6589,7 +6597,7 @@
         <w:fldChar w:fldCharType="begin"/>
       </w:r>
       <w:r>
-        <w:instrText xml:space="preserve"> HYPERLINK \l _Toc11618 </w:instrText>
+        <w:instrText xml:space="preserve"> HYPERLINK \l _Toc32628 </w:instrText>
       </w:r>
       <w:r>
         <w:fldChar w:fldCharType="separate"/>
@@ -6601,7 +6609,7 @@
         <w:sdtPr>
           <w:alias w:val="MÃ CA HOẶC ĐỐI TƯỢNG"/>
           <w:tag w:val="SV_0291"/>
-          <w:id w:val="147483643"/>
+          <w:id w:val="147466125"/>
           <w:text w:multiLine="1"/>
         </w:sdtPr>
         <w:sdtContent>
@@ -6617,7 +6625,7 @@
         <w:fldChar w:fldCharType="begin"/>
       </w:r>
       <w:r>
-        <w:instrText xml:space="preserve"> PAGEREF _Toc11618 \h </w:instrText>
+        <w:instrText xml:space="preserve"> PAGEREF _Toc32628 \h </w:instrText>
       </w:r>
       <w:r>
         <w:fldChar w:fldCharType="separate"/>
@@ -6643,7 +6651,7 @@
         <w:fldChar w:fldCharType="begin"/>
       </w:r>
       <w:r>
-        <w:instrText xml:space="preserve"> HYPERLINK \l _Toc14583 </w:instrText>
+        <w:instrText xml:space="preserve"> HYPERLINK \l _Toc5469 </w:instrText>
       </w:r>
       <w:r>
         <w:fldChar w:fldCharType="separate"/>
@@ -6655,7 +6663,7 @@
         <w:sdtPr>
           <w:alias w:val="MÃ CA HOẶC ĐỐI TƯỢNG"/>
           <w:tag w:val="SV_0296"/>
-          <w:id w:val="147461300"/>
+          <w:id w:val="147471919"/>
           <w:text w:multiLine="1"/>
         </w:sdtPr>
         <w:sdtContent>
@@ -6671,7 +6679,7 @@
         <w:fldChar w:fldCharType="begin"/>
       </w:r>
       <w:r>
-        <w:instrText xml:space="preserve"> PAGEREF _Toc14583 \h </w:instrText>
+        <w:instrText xml:space="preserve"> PAGEREF _Toc5469 \h </w:instrText>
       </w:r>
       <w:r>
         <w:fldChar w:fldCharType="separate"/>
@@ -6697,7 +6705,7 @@
         <w:fldChar w:fldCharType="begin"/>
       </w:r>
       <w:r>
-        <w:instrText xml:space="preserve"> HYPERLINK \l _Toc17019 </w:instrText>
+        <w:instrText xml:space="preserve"> HYPERLINK \l _Toc4245 </w:instrText>
       </w:r>
       <w:r>
         <w:fldChar w:fldCharType="separate"/>
@@ -6709,7 +6717,7 @@
         <w:sdtPr>
           <w:alias w:val="MÃ CA HOẶC ĐỐI TƯỢNG"/>
           <w:tag w:val="SV_0300"/>
-          <w:id w:val="147471006"/>
+          <w:id w:val="147481077"/>
           <w:text w:multiLine="1"/>
         </w:sdtPr>
         <w:sdtContent>
@@ -6725,7 +6733,7 @@
         <w:fldChar w:fldCharType="begin"/>
       </w:r>
       <w:r>
-        <w:instrText xml:space="preserve"> PAGEREF _Toc17019 \h </w:instrText>
+        <w:instrText xml:space="preserve"> PAGEREF _Toc4245 \h </w:instrText>
       </w:r>
       <w:r>
         <w:fldChar w:fldCharType="separate"/>
@@ -6751,7 +6759,7 @@
         <w:fldChar w:fldCharType="begin"/>
       </w:r>
       <w:r>
-        <w:instrText xml:space="preserve"> HYPERLINK \l _Toc1176 </w:instrText>
+        <w:instrText xml:space="preserve"> HYPERLINK \l _Toc24329 </w:instrText>
       </w:r>
       <w:r>
         <w:fldChar w:fldCharType="separate"/>
@@ -6763,7 +6771,7 @@
         <w:sdtPr>
           <w:alias w:val="MÃ CA HOẶC ĐỐI TƯỢNG"/>
           <w:tag w:val="SV_0304"/>
-          <w:id w:val="147453807"/>
+          <w:id w:val="147451122"/>
           <w:text w:multiLine="1"/>
         </w:sdtPr>
         <w:sdtContent>
@@ -6779,7 +6787,7 @@
         <w:fldChar w:fldCharType="begin"/>
       </w:r>
       <w:r>
-        <w:instrText xml:space="preserve"> PAGEREF _Toc1176 \h </w:instrText>
+        <w:instrText xml:space="preserve"> PAGEREF _Toc24329 \h </w:instrText>
       </w:r>
       <w:r>
         <w:fldChar w:fldCharType="separate"/>
@@ -6805,7 +6813,7 @@
         <w:fldChar w:fldCharType="begin"/>
       </w:r>
       <w:r>
-        <w:instrText xml:space="preserve"> HYPERLINK \l _Toc14325 </w:instrText>
+        <w:instrText xml:space="preserve"> HYPERLINK \l _Toc3718 </w:instrText>
       </w:r>
       <w:r>
         <w:fldChar w:fldCharType="separate"/>
@@ -6817,7 +6825,7 @@
         <w:sdtPr>
           <w:alias w:val="MÃ CA HOẶC ĐỐI TƯỢNG"/>
           <w:tag w:val="SV_0329"/>
-          <w:id w:val="147474655"/>
+          <w:id w:val="147464480"/>
           <w:text w:multiLine="1"/>
         </w:sdtPr>
         <w:sdtContent>
@@ -6833,7 +6841,7 @@
         <w:fldChar w:fldCharType="begin"/>
       </w:r>
       <w:r>
-        <w:instrText xml:space="preserve"> PAGEREF _Toc14325 \h </w:instrText>
+        <w:instrText xml:space="preserve"> PAGEREF _Toc3718 \h </w:instrText>
       </w:r>
       <w:r>
         <w:fldChar w:fldCharType="separate"/>
@@ -6859,7 +6867,7 @@
         <w:fldChar w:fldCharType="begin"/>
       </w:r>
       <w:r>
-        <w:instrText xml:space="preserve"> HYPERLINK \l _Toc12212 </w:instrText>
+        <w:instrText xml:space="preserve"> HYPERLINK \l _Toc24051 </w:instrText>
       </w:r>
       <w:r>
         <w:fldChar w:fldCharType="separate"/>
@@ -6871,7 +6879,7 @@
         <w:sdtPr>
           <w:alias w:val="MÃ CA HOẶC ĐỐI TƯỢNG"/>
           <w:tag w:val="SV_0332"/>
-          <w:id w:val="147472955"/>
+          <w:id w:val="147463418"/>
           <w:text w:multiLine="1"/>
         </w:sdtPr>
         <w:sdtContent>
@@ -6887,7 +6895,7 @@
         <w:fldChar w:fldCharType="begin"/>
       </w:r>
       <w:r>
-        <w:instrText xml:space="preserve"> PAGEREF _Toc12212 \h </w:instrText>
+        <w:instrText xml:space="preserve"> PAGEREF _Toc24051 \h </w:instrText>
       </w:r>
       <w:r>
         <w:fldChar w:fldCharType="separate"/>
@@ -6925,7 +6933,7 @@
         <w:keepNext w:val="0"/>
         <w:spacing w:before="0" w:after="320"/>
       </w:pPr>
-      <w:bookmarkStart w:id="7" w:name="_Toc30086"/>
+      <w:bookmarkStart w:id="7" w:name="_Toc26765"/>
       <w:r>
         <w:t>CHƯƠNG 1. TỔNG QUAN ĐỀ TÀI</w:t>
       </w:r>
@@ -6935,7 +6943,7 @@
       <w:pPr>
         <w:pStyle w:val="3"/>
       </w:pPr>
-      <w:bookmarkStart w:id="8" w:name="_Toc17680"/>
+      <w:bookmarkStart w:id="8" w:name="_Toc29659"/>
       <w:r>
         <w:t>1.1. Bài toán và lý do thực hiện</w:t>
       </w:r>
@@ -7022,7 +7030,7 @@
       <w:pPr>
         <w:pStyle w:val="3"/>
       </w:pPr>
-      <w:bookmarkStart w:id="9" w:name="_Toc2823"/>
+      <w:bookmarkStart w:id="9" w:name="_Toc17697"/>
       <w:r>
         <w:t>1.2. Mục tiêu và sản phẩm</w:t>
       </w:r>
@@ -7145,7 +7153,7 @@
       <w:pPr>
         <w:pStyle w:val="3"/>
       </w:pPr>
-      <w:bookmarkStart w:id="10" w:name="_Toc5457"/>
+      <w:bookmarkStart w:id="10" w:name="_Toc31018"/>
       <w:r>
         <w:t>1.3. Phạm vi, đầu vào và đầu ra</w:t>
       </w:r>
@@ -7381,7 +7389,7 @@
         <w:spacing w:before="0" w:after="100" w:line="269" w:lineRule="auto"/>
         <w:jc w:val="left"/>
       </w:pPr>
-      <w:bookmarkStart w:id="11" w:name="_Toc14599"/>
+      <w:bookmarkStart w:id="11" w:name="_Toc29874"/>
       <w:r>
         <w:t>Bảng 1.1 Đặc tả dữ liệu vào</w:t>
       </w:r>
@@ -7822,7 +7830,7 @@
         <w:spacing w:before="0" w:after="100" w:line="269" w:lineRule="auto"/>
         <w:jc w:val="left"/>
       </w:pPr>
-      <w:bookmarkStart w:id="12" w:name="_Toc29517"/>
+      <w:bookmarkStart w:id="12" w:name="_Toc13365"/>
       <w:r>
         <w:t>Bảng 1.2 Đặc tả kết quả đầu ra</w:t>
       </w:r>
@@ -7857,6 +7865,14 @@
       </w:tblGrid>
       <w:tr>
         <w:tblPrEx>
+          <w:tblBorders>
+            <w:top w:val="single" w:color="D9D9D9" w:sz="4" w:space="0"/>
+            <w:left w:val="single" w:color="D9D9D9" w:sz="4" w:space="0"/>
+            <w:bottom w:val="single" w:color="D9D9D9" w:sz="4" w:space="0"/>
+            <w:right w:val="single" w:color="D9D9D9" w:sz="4" w:space="0"/>
+            <w:insideH w:val="single" w:color="D9D9D9" w:sz="4" w:space="0"/>
+            <w:insideV w:val="single" w:color="D9D9D9" w:sz="4" w:space="0"/>
+          </w:tblBorders>
           <w:tblCellMar>
             <w:top w:w="80" w:type="dxa"/>
             <w:left w:w="80" w:type="dxa"/>
@@ -8166,7 +8182,7 @@
       <w:pPr>
         <w:pStyle w:val="3"/>
       </w:pPr>
-      <w:bookmarkStart w:id="13" w:name="_Toc13333"/>
+      <w:bookmarkStart w:id="13" w:name="_Toc8494"/>
       <w:r>
         <w:t>1.4. Cách thực hiện và cấu trúc báo cáo</w:t>
       </w:r>
@@ -8326,7 +8342,7 @@
         <w:pStyle w:val="174"/>
         <w:spacing w:before="80" w:after="100" w:line="269" w:lineRule="auto"/>
       </w:pPr>
-      <w:bookmarkStart w:id="14" w:name="_Toc5689"/>
+      <w:bookmarkStart w:id="14" w:name="_Toc12131"/>
       <w:r>
         <w:t>Bảng 1.3 Đối chiếu yêu cầu và sản phẩm</w:t>
       </w:r>
@@ -8995,7 +9011,7 @@
         <w:keepNext w:val="0"/>
         <w:spacing w:before="0" w:after="320"/>
       </w:pPr>
-      <w:bookmarkStart w:id="15" w:name="_Toc26702"/>
+      <w:bookmarkStart w:id="15" w:name="_Toc27065"/>
       <w:r>
         <w:t>CHƯƠNG 2. CƠ SỞ LÝ THUYẾT</w:t>
       </w:r>
@@ -9005,7 +9021,7 @@
       <w:pPr>
         <w:pStyle w:val="3"/>
       </w:pPr>
-      <w:bookmarkStart w:id="16" w:name="_Toc32196"/>
+      <w:bookmarkStart w:id="16" w:name="_Toc26506"/>
       <w:r>
         <w:t>2.1. Khái niệm và mô hình dữ liệu</w:t>
       </w:r>
@@ -9137,7 +9153,7 @@
       <w:pPr>
         <w:pStyle w:val="3"/>
       </w:pPr>
-      <w:bookmarkStart w:id="17" w:name="_Toc15344"/>
+      <w:bookmarkStart w:id="17" w:name="_Toc23600"/>
       <w:r>
         <w:t>2.2. Cấu trúc dữ liệu sử dụng</w:t>
       </w:r>
@@ -9390,7 +9406,7 @@
         <w:pStyle w:val="174"/>
         <w:spacing w:before="80" w:after="100" w:line="269" w:lineRule="auto"/>
       </w:pPr>
-      <w:bookmarkStart w:id="18" w:name="_Toc29038"/>
+      <w:bookmarkStart w:id="18" w:name="_Toc27495"/>
       <w:r>
         <w:t>Bảng 2.1 Biến cấu trúc và điều kiện phải duy trì</w:t>
       </w:r>
@@ -9424,6 +9440,14 @@
       </w:tblGrid>
       <w:tr>
         <w:tblPrEx>
+          <w:tblBorders>
+            <w:top w:val="single" w:color="D9D9D9" w:sz="4" w:space="0"/>
+            <w:left w:val="single" w:color="D9D9D9" w:sz="4" w:space="0"/>
+            <w:bottom w:val="single" w:color="D9D9D9" w:sz="4" w:space="0"/>
+            <w:right w:val="single" w:color="D9D9D9" w:sz="4" w:space="0"/>
+            <w:insideH w:val="single" w:color="D9D9D9" w:sz="4" w:space="0"/>
+            <w:insideV w:val="single" w:color="D9D9D9" w:sz="4" w:space="0"/>
+          </w:tblBorders>
           <w:tblCellMar>
             <w:top w:w="70" w:type="dxa"/>
             <w:left w:w="70" w:type="dxa"/>
@@ -9797,7 +9821,7 @@
       <w:pPr>
         <w:pStyle w:val="3"/>
       </w:pPr>
-      <w:bookmarkStart w:id="19" w:name="_Toc1778"/>
+      <w:bookmarkStart w:id="19" w:name="_Toc5795"/>
       <w:r>
         <w:t>2.3. Nguyên lý thuật toán</w:t>
       </w:r>
@@ -10031,7 +10055,7 @@
       <w:pPr>
         <w:pStyle w:val="3"/>
       </w:pPr>
-      <w:bookmarkStart w:id="20" w:name="_Toc20943"/>
+      <w:bookmarkStart w:id="20" w:name="_Toc13833"/>
       <w:r>
         <w:t>2.4. Cơ sở đánh giá thời gian và bộ nhớ</w:t>
       </w:r>
@@ -10212,7 +10236,7 @@
         <w:keepNext w:val="0"/>
         <w:spacing w:before="0" w:after="320"/>
       </w:pPr>
-      <w:bookmarkStart w:id="21" w:name="_Toc30782"/>
+      <w:bookmarkStart w:id="21" w:name="_Toc25541"/>
       <w:r>
         <w:t>CHƯƠNG 3. PHÂN TÍCH, THIẾT KẾ VÀ CÀI ĐẶT</w:t>
       </w:r>
@@ -10222,7 +10246,7 @@
       <w:pPr>
         <w:pStyle w:val="3"/>
       </w:pPr>
-      <w:bookmarkStart w:id="22" w:name="_Toc4042"/>
+      <w:bookmarkStart w:id="22" w:name="_Toc3638"/>
       <w:r>
         <w:t>3.1. Phân tích yêu cầu chương trình</w:t>
       </w:r>
@@ -10438,7 +10462,7 @@
       <w:pPr>
         <w:pStyle w:val="3"/>
       </w:pPr>
-      <w:bookmarkStart w:id="23" w:name="_Toc2248"/>
+      <w:bookmarkStart w:id="23" w:name="_Toc11691"/>
       <w:r>
         <w:t>3.2. Thiết kế các hàm và dữ liệu</w:t>
       </w:r>
@@ -10490,7 +10514,7 @@
         <w:pStyle w:val="174"/>
         <w:spacing w:before="80" w:after="100" w:line="269" w:lineRule="auto"/>
       </w:pPr>
-      <w:bookmarkStart w:id="24" w:name="_Toc10321"/>
+      <w:bookmarkStart w:id="24" w:name="_Toc24233"/>
       <w:r>
         <w:t>Bảng 3.1 Tổ chức các hàm và tệp</w:t>
       </w:r>
@@ -11181,7 +11205,7 @@
         <w:spacing w:before="0" w:after="100" w:line="269" w:lineRule="auto"/>
         <w:jc w:val="left"/>
       </w:pPr>
-      <w:bookmarkStart w:id="25" w:name="_Toc11476"/>
+      <w:bookmarkStart w:id="25" w:name="_Toc16167"/>
       <w:r>
         <w:t>Bảng 3.2 Tiền điều kiện và hậu điều kiện của các hàm</w:t>
       </w:r>
@@ -11822,7 +11846,7 @@
       <w:pPr>
         <w:pStyle w:val="3"/>
       </w:pPr>
-      <w:bookmarkStart w:id="26" w:name="_Toc32348"/>
+      <w:bookmarkStart w:id="26" w:name="_Toc1506"/>
       <w:r>
         <w:t>3.3. Thuật toán và mã nguồn chính</w:t>
       </w:r>
@@ -12728,7 +12752,7 @@
       <w:pPr>
         <w:pStyle w:val="3"/>
       </w:pPr>
-      <w:bookmarkStart w:id="27" w:name="_Toc23978"/>
+      <w:bookmarkStart w:id="27" w:name="_Toc24742"/>
       <w:r>
         <w:t>3.4. Lần vết ví dụ nhỏ</w:t>
       </w:r>
@@ -12845,7 +12869,7 @@
         <w:pStyle w:val="174"/>
         <w:spacing w:before="80" w:after="100" w:line="269" w:lineRule="auto"/>
       </w:pPr>
-      <w:bookmarkStart w:id="28" w:name="_Toc23477"/>
+      <w:bookmarkStart w:id="28" w:name="_Toc7757"/>
       <w:r>
         <w:t xml:space="preserve">Bảng 3.3 Truy vết ca </w:t>
       </w:r>
@@ -12894,6 +12918,14 @@
       </w:tblGrid>
       <w:tr>
         <w:tblPrEx>
+          <w:tblBorders>
+            <w:top w:val="single" w:color="D9D9D9" w:sz="4" w:space="0"/>
+            <w:left w:val="single" w:color="D9D9D9" w:sz="4" w:space="0"/>
+            <w:bottom w:val="single" w:color="D9D9D9" w:sz="4" w:space="0"/>
+            <w:right w:val="single" w:color="D9D9D9" w:sz="4" w:space="0"/>
+            <w:insideH w:val="single" w:color="D9D9D9" w:sz="4" w:space="0"/>
+            <w:insideV w:val="single" w:color="D9D9D9" w:sz="4" w:space="0"/>
+          </w:tblBorders>
           <w:tblCellMar>
             <w:top w:w="70" w:type="dxa"/>
             <w:left w:w="70" w:type="dxa"/>
@@ -13515,7 +13547,7 @@
       <w:pPr>
         <w:pStyle w:val="3"/>
       </w:pPr>
-      <w:bookmarkStart w:id="29" w:name="_Toc6803"/>
+      <w:bookmarkStart w:id="29" w:name="_Toc20626"/>
       <w:r>
         <w:t>3.5. Giải thích tính đúng và điều kiện dừng</w:t>
       </w:r>
@@ -13695,7 +13727,7 @@
       <w:pPr>
         <w:pStyle w:val="3"/>
       </w:pPr>
-      <w:bookmarkStart w:id="30" w:name="_Toc17041"/>
+      <w:bookmarkStart w:id="30" w:name="_Toc16596"/>
       <w:r>
         <w:t>3.6. Phân tích độ phức tạp</w:t>
       </w:r>
@@ -13756,7 +13788,7 @@
         <w:spacing w:before="0" w:after="100" w:line="269" w:lineRule="auto"/>
         <w:jc w:val="left"/>
       </w:pPr>
-      <w:bookmarkStart w:id="31" w:name="_Toc12809"/>
+      <w:bookmarkStart w:id="31" w:name="_Toc12459"/>
       <w:r>
         <w:t>Bảng 3.4 Chi phí của từng pha trong bản cài</w:t>
       </w:r>
@@ -14646,7 +14678,7 @@
         <w:keepNext w:val="0"/>
         <w:spacing w:before="0" w:after="320"/>
       </w:pPr>
-      <w:bookmarkStart w:id="32" w:name="_Toc8409"/>
+      <w:bookmarkStart w:id="32" w:name="_Toc11756"/>
       <w:r>
         <w:t>CHƯƠNG 4. KẾT QUẢ THỬ NGHIỆM VÀ NHẬN XÉT</w:t>
       </w:r>
@@ -14656,7 +14688,7 @@
       <w:pPr>
         <w:pStyle w:val="3"/>
       </w:pPr>
-      <w:bookmarkStart w:id="33" w:name="_Toc27624"/>
+      <w:bookmarkStart w:id="33" w:name="_Toc29505"/>
       <w:r>
         <w:t>4.1. Môi trường và kế hoạch kiểm thử</w:t>
       </w:r>
@@ -14872,7 +14904,7 @@
       <w:pPr>
         <w:pStyle w:val="3"/>
       </w:pPr>
-      <w:bookmarkStart w:id="34" w:name="_Toc24305"/>
+      <w:bookmarkStart w:id="34" w:name="_Toc27356"/>
       <w:r>
         <w:t>4.2. Bảng kết quả ít nhất 12 ca</w:t>
       </w:r>
@@ -14948,7 +14980,7 @@
         <w:spacing w:before="0" w:after="100" w:line="269" w:lineRule="auto"/>
         <w:jc w:val="left"/>
       </w:pPr>
-      <w:bookmarkStart w:id="35" w:name="_Toc32149"/>
+      <w:bookmarkStart w:id="35" w:name="_Toc5398"/>
       <w:r>
         <w:t>Bảng 4.1 Ánh xạ năm ca kiểm trên phiếu</w:t>
       </w:r>
@@ -14997,6 +15029,14 @@
       </w:tblGrid>
       <w:tr>
         <w:tblPrEx>
+          <w:tblBorders>
+            <w:top w:val="single" w:color="D9D9D9" w:sz="4" w:space="0"/>
+            <w:left w:val="single" w:color="D9D9D9" w:sz="4" w:space="0"/>
+            <w:bottom w:val="single" w:color="D9D9D9" w:sz="4" w:space="0"/>
+            <w:right w:val="single" w:color="D9D9D9" w:sz="4" w:space="0"/>
+            <w:insideH w:val="single" w:color="D9D9D9" w:sz="4" w:space="0"/>
+            <w:insideV w:val="single" w:color="D9D9D9" w:sz="4" w:space="0"/>
+          </w:tblBorders>
           <w:tblCellMar>
             <w:top w:w="80" w:type="dxa"/>
             <w:left w:w="80" w:type="dxa"/>
@@ -15610,7 +15650,7 @@
         <w:pStyle w:val="174"/>
         <w:spacing w:before="80" w:after="100" w:line="269" w:lineRule="auto"/>
       </w:pPr>
-      <w:bookmarkStart w:id="36" w:name="_Toc2306"/>
+      <w:bookmarkStart w:id="36" w:name="_Toc21618"/>
       <w:r>
         <w:t>Bảng 4.2 Thiết kế ít nhất 12 ca kiểm độc lập</w:t>
       </w:r>
@@ -15645,6 +15685,14 @@
       </w:tblGrid>
       <w:tr>
         <w:tblPrEx>
+          <w:tblBorders>
+            <w:top w:val="single" w:color="D9D9D9" w:sz="4" w:space="0"/>
+            <w:left w:val="single" w:color="D9D9D9" w:sz="4" w:space="0"/>
+            <w:bottom w:val="single" w:color="D9D9D9" w:sz="4" w:space="0"/>
+            <w:right w:val="single" w:color="D9D9D9" w:sz="4" w:space="0"/>
+            <w:insideH w:val="single" w:color="D9D9D9" w:sz="4" w:space="0"/>
+            <w:insideV w:val="single" w:color="D9D9D9" w:sz="4" w:space="0"/>
+          </w:tblBorders>
           <w:tblCellMar>
             <w:top w:w="70" w:type="dxa"/>
             <w:left w:w="70" w:type="dxa"/>
@@ -16961,7 +17009,7 @@
         <w:pageBreakBefore/>
         <w:spacing w:before="80" w:after="100" w:line="269" w:lineRule="auto"/>
       </w:pPr>
-      <w:bookmarkStart w:id="37" w:name="_Toc20349"/>
+      <w:bookmarkStart w:id="37" w:name="_Toc21238"/>
       <w:r>
         <w:t>Bảng 4.3 Actual kết luận và vị trí minh chứng</w:t>
       </w:r>
@@ -16996,6 +17044,14 @@
       </w:tblGrid>
       <w:tr>
         <w:tblPrEx>
+          <w:tblBorders>
+            <w:top w:val="single" w:color="D9D9D9" w:sz="4" w:space="0"/>
+            <w:left w:val="single" w:color="D9D9D9" w:sz="4" w:space="0"/>
+            <w:bottom w:val="single" w:color="D9D9D9" w:sz="4" w:space="0"/>
+            <w:right w:val="single" w:color="D9D9D9" w:sz="4" w:space="0"/>
+            <w:insideH w:val="single" w:color="D9D9D9" w:sz="4" w:space="0"/>
+            <w:insideV w:val="single" w:color="D9D9D9" w:sz="4" w:space="0"/>
+          </w:tblBorders>
           <w:tblCellMar>
             <w:top w:w="70" w:type="dxa"/>
             <w:left w:w="70" w:type="dxa"/>
@@ -18314,7 +18370,7 @@
         <w:ind w:firstLine="0"/>
         <w:jc w:val="center"/>
       </w:pPr>
-      <w:bookmarkStart w:id="38" w:name="_Toc14182"/>
+      <w:bookmarkStart w:id="38" w:name="_Toc9451"/>
       <w:r>
         <w:t>4.3. Hai ví dụ trên phiếu</w:t>
       </w:r>
@@ -18487,7 +18543,7 @@
         <w:pStyle w:val="175"/>
         <w:spacing w:before="80" w:after="100" w:line="269" w:lineRule="auto"/>
       </w:pPr>
-      <w:bookmarkStart w:id="39" w:name="_Toc23301"/>
+      <w:bookmarkStart w:id="39" w:name="_Toc20797"/>
       <w:r>
         <w:t xml:space="preserve">Hình 4.1 Ví dụ 1 </w:t>
       </w:r>
@@ -18711,7 +18767,7 @@
         <w:pStyle w:val="175"/>
         <w:spacing w:before="80" w:after="100" w:line="269" w:lineRule="auto"/>
       </w:pPr>
-      <w:bookmarkStart w:id="40" w:name="_Toc11687"/>
+      <w:bookmarkStart w:id="40" w:name="_Toc16794"/>
       <w:r>
         <w:t xml:space="preserve">Hình 4.2 Ví dụ 2 </w:t>
       </w:r>
@@ -18762,7 +18818,7 @@
         <w:ind w:firstLine="0"/>
         <w:jc w:val="center"/>
       </w:pPr>
-      <w:bookmarkStart w:id="41" w:name="_Toc20171"/>
+      <w:bookmarkStart w:id="41" w:name="_Toc27913"/>
       <w:r>
         <w:t>4.4. Hai ca sinh viên tự thiết kế</w:t>
       </w:r>
@@ -18935,7 +18991,7 @@
         <w:pStyle w:val="175"/>
         <w:spacing w:before="80" w:after="100" w:line="269" w:lineRule="auto"/>
       </w:pPr>
-      <w:bookmarkStart w:id="42" w:name="_Toc7989"/>
+      <w:bookmarkStart w:id="42" w:name="_Toc32551"/>
       <w:r>
         <w:t xml:space="preserve">Hình 4.3 Ca tự thiết kế 1 </w:t>
       </w:r>
@@ -19145,7 +19201,7 @@
         <w:pStyle w:val="175"/>
         <w:spacing w:before="80" w:after="100" w:line="269" w:lineRule="auto"/>
       </w:pPr>
-      <w:bookmarkStart w:id="43" w:name="_Toc25440"/>
+      <w:bookmarkStart w:id="43" w:name="_Toc28991"/>
       <w:r>
         <w:t xml:space="preserve">Hình 4.4 Ca tự thiết kế 2 </w:t>
       </w:r>
@@ -19196,7 +19252,7 @@
         <w:ind w:firstLine="0"/>
         <w:jc w:val="center"/>
       </w:pPr>
-      <w:bookmarkStart w:id="44" w:name="_Toc17920"/>
+      <w:bookmarkStart w:id="44" w:name="_Toc26364"/>
       <w:r>
         <w:t>4.5. Ba ca biên phù hợp với đề tài</w:t>
       </w:r>
@@ -19401,7 +19457,7 @@
         <w:pStyle w:val="175"/>
         <w:spacing w:before="80" w:after="100" w:line="269" w:lineRule="auto"/>
       </w:pPr>
-      <w:bookmarkStart w:id="45" w:name="_Toc3279"/>
+      <w:bookmarkStart w:id="45" w:name="_Toc22189"/>
       <w:r>
         <w:t xml:space="preserve">Hình 4.5 Biên 1 </w:t>
       </w:r>
@@ -19611,7 +19667,7 @@
         <w:pStyle w:val="175"/>
         <w:spacing w:before="80" w:after="100" w:line="269" w:lineRule="auto"/>
       </w:pPr>
-      <w:bookmarkStart w:id="46" w:name="_Toc11618"/>
+      <w:bookmarkStart w:id="46" w:name="_Toc32628"/>
       <w:r>
         <w:t xml:space="preserve">Hình 4.6 Biên 2 </w:t>
       </w:r>
@@ -19853,7 +19909,7 @@
         <w:pStyle w:val="175"/>
         <w:spacing w:before="80" w:after="100" w:line="269" w:lineRule="auto"/>
       </w:pPr>
-      <w:bookmarkStart w:id="47" w:name="_Toc14583"/>
+      <w:bookmarkStart w:id="47" w:name="_Toc5469"/>
       <w:r>
         <w:t xml:space="preserve">Hình 4.7 Biên 3 </w:t>
       </w:r>
@@ -19900,7 +19956,7 @@
       <w:pPr>
         <w:pStyle w:val="3"/>
       </w:pPr>
-      <w:bookmarkStart w:id="48" w:name="_Toc2341"/>
+      <w:bookmarkStart w:id="48" w:name="_Toc8875"/>
       <w:r>
         <w:t>4.6. Kiểm tra input không hợp lệ — LOI01</w:t>
       </w:r>
@@ -20065,7 +20121,7 @@
         <w:pStyle w:val="175"/>
         <w:spacing w:before="80" w:after="100" w:line="269" w:lineRule="auto"/>
       </w:pPr>
-      <w:bookmarkStart w:id="49" w:name="_Toc17019"/>
+      <w:bookmarkStart w:id="49" w:name="_Toc4245"/>
       <w:r>
         <w:t xml:space="preserve">Hình 4.8 Input không hợp lệ </w:t>
       </w:r>
@@ -20112,7 +20168,7 @@
       <w:pPr>
         <w:pStyle w:val="3"/>
       </w:pPr>
-      <w:bookmarkStart w:id="50" w:name="_Toc25237"/>
+      <w:bookmarkStart w:id="50" w:name="_Toc20919"/>
       <w:r>
         <w:t>4.7. Kết quả toàn bộ kiểm thử</w:t>
       </w:r>
@@ -20349,7 +20405,7 @@
         <w:pStyle w:val="175"/>
         <w:spacing w:before="80" w:after="100" w:line="269" w:lineRule="auto"/>
       </w:pPr>
-      <w:bookmarkStart w:id="51" w:name="_Toc1176"/>
+      <w:bookmarkStart w:id="51" w:name="_Toc24329"/>
       <w:r>
         <w:t xml:space="preserve">Hình 4.9 Tổng kết kiểm thử </w:t>
       </w:r>
@@ -20396,7 +20452,7 @@
       <w:pPr>
         <w:pStyle w:val="3"/>
       </w:pPr>
-      <w:bookmarkStart w:id="52" w:name="_Toc22039"/>
+      <w:bookmarkStart w:id="52" w:name="_Toc16955"/>
       <w:r>
         <w:t>4.8. Khảo sát ba quy mô hoặc ba cấu hình hợp lệ</w:t>
       </w:r>
@@ -20658,7 +20714,7 @@
         <w:spacing w:before="0" w:after="100" w:line="269" w:lineRule="auto"/>
         <w:jc w:val="left"/>
       </w:pPr>
-      <w:bookmarkStart w:id="53" w:name="_Toc26875"/>
+      <w:bookmarkStart w:id="53" w:name="_Toc23126"/>
       <w:r>
         <w:t>Bảng 4.4 Khảo sát Q1 Q2 Q3</w:t>
       </w:r>
@@ -21224,7 +21280,7 @@
         <w:ind w:firstLine="0"/>
         <w:jc w:val="center"/>
       </w:pPr>
-      <w:bookmarkStart w:id="54" w:name="_Toc716"/>
+      <w:bookmarkStart w:id="54" w:name="_Toc19433"/>
       <w:r>
         <w:t>4.9. GitHub và chạy lại từ bản clone sạch</w:t>
       </w:r>
@@ -21284,7 +21340,7 @@
         <w:pStyle w:val="174"/>
         <w:spacing w:before="80" w:after="100" w:line="269" w:lineRule="auto"/>
       </w:pPr>
-      <w:bookmarkStart w:id="55" w:name="_Toc8226"/>
+      <w:bookmarkStart w:id="55" w:name="_Toc20830"/>
       <w:r>
         <w:t>Bảng 4.5 Kho mã và phiên bản có thể kiểm lại</w:t>
       </w:r>
@@ -21915,7 +21971,7 @@
         <w:pStyle w:val="175"/>
         <w:spacing w:before="80" w:after="100" w:line="269" w:lineRule="auto"/>
       </w:pPr>
-      <w:bookmarkStart w:id="56" w:name="_Toc14325"/>
+      <w:bookmarkStart w:id="56" w:name="_Toc3718"/>
       <w:r>
         <w:t xml:space="preserve">Hình 4.10 Clone sạch và chạy lại </w:t>
       </w:r>
@@ -22068,7 +22124,7 @@
         <w:pStyle w:val="175"/>
         <w:spacing w:before="80" w:after="100" w:line="269" w:lineRule="auto"/>
       </w:pPr>
-      <w:bookmarkStart w:id="57" w:name="_Toc12212"/>
+      <w:bookmarkStart w:id="57" w:name="_Toc24051"/>
       <w:r>
         <w:t xml:space="preserve">Hình 4.11 GitHub repo và commit </w:t>
       </w:r>
@@ -22117,7 +22173,7 @@
         <w:keepNext w:val="0"/>
         <w:spacing w:before="0" w:after="320"/>
       </w:pPr>
-      <w:bookmarkStart w:id="58" w:name="_Toc4846"/>
+      <w:bookmarkStart w:id="58" w:name="_Toc24736"/>
       <w:r>
         <w:t>CHƯƠNG 5. KẾT LUẬN VÀ HƯỚNG PHÁT TRIỂN</w:t>
       </w:r>
@@ -22127,7 +22183,7 @@
       <w:pPr>
         <w:pStyle w:val="3"/>
       </w:pPr>
-      <w:bookmarkStart w:id="59" w:name="_Toc23541"/>
+      <w:bookmarkStart w:id="59" w:name="_Toc743"/>
       <w:r>
         <w:t>5.1. Mức hoàn thành so với phiếu</w:t>
       </w:r>
@@ -22178,7 +22234,7 @@
       <w:pPr>
         <w:pStyle w:val="3"/>
       </w:pPr>
-      <w:bookmarkStart w:id="60" w:name="_Toc8204"/>
+      <w:bookmarkStart w:id="60" w:name="_Toc22978"/>
       <w:r>
         <w:t>5.2. Giới hạn và bài học</w:t>
       </w:r>
@@ -22247,7 +22303,7 @@
       <w:pPr>
         <w:pStyle w:val="3"/>
       </w:pPr>
-      <w:bookmarkStart w:id="61" w:name="_Toc5106"/>
+      <w:bookmarkStart w:id="61" w:name="_Toc16211"/>
       <w:r>
         <w:t>5.3. Hướng phát triển phù hợp</w:t>
       </w:r>
@@ -22335,7 +22391,7 @@
         <w:pStyle w:val="174"/>
         <w:spacing w:before="80" w:after="100" w:line="269" w:lineRule="auto"/>
       </w:pPr>
-      <w:bookmarkStart w:id="62" w:name="_Toc20603"/>
+      <w:bookmarkStart w:id="62" w:name="_Toc17146"/>
       <w:r>
         <w:t>Bảng 5.1 Mức hoàn thành và bằng chứng theo yêu cầu</w:t>
       </w:r>
@@ -22965,7 +23021,7 @@
         <w:keepNext w:val="0"/>
         <w:spacing w:before="0" w:after="320"/>
       </w:pPr>
-      <w:bookmarkStart w:id="63" w:name="_Toc24234"/>
+      <w:bookmarkStart w:id="63" w:name="_Toc9894"/>
       <w:r>
         <w:t>TÀI LIỆU THAM KHẢO</w:t>
       </w:r>
@@ -23031,7 +23087,7 @@
         <w:keepNext w:val="0"/>
         <w:spacing w:before="0" w:after="320"/>
       </w:pPr>
-      <w:bookmarkStart w:id="64" w:name="_Toc5750"/>
+      <w:bookmarkStart w:id="64" w:name="_Toc25928"/>
       <w:r>
         <w:t>PHỤ LỤC</w:t>
       </w:r>
@@ -23041,7 +23097,7 @@
       <w:pPr>
         <w:pStyle w:val="3"/>
       </w:pPr>
-      <w:bookmarkStart w:id="65" w:name="_Toc17828"/>
+      <w:bookmarkStart w:id="65" w:name="_Toc21892"/>
       <w:r>
         <w:t>PHỤ LỤC A. Tổ chức mã và hướng dẫn chạy</w:t>
       </w:r>
@@ -23531,7 +23587,7 @@
         <w:pStyle w:val="3"/>
         <w:pageBreakBefore/>
       </w:pPr>
-      <w:bookmarkStart w:id="66" w:name="_Toc6422"/>
+      <w:bookmarkStart w:id="66" w:name="_Toc8855"/>
       <w:r>
         <w:t>PHỤ LỤC B. Danh mục bằng chứng</w:t>
       </w:r>
@@ -23581,6 +23637,12 @@
             <w:insideH w:val="single" w:color="D9D9D9" w:sz="4" w:space="0"/>
             <w:insideV w:val="single" w:color="D9D9D9" w:sz="4" w:space="0"/>
           </w:tblBorders>
+          <w:tblCellMar>
+            <w:top w:w="70" w:type="dxa"/>
+            <w:left w:w="70" w:type="dxa"/>
+            <w:bottom w:w="70" w:type="dxa"/>
+            <w:right w:w="70" w:type="dxa"/>
+          </w:tblCellMar>
         </w:tblPrEx>
         <w:trPr>
           <w:cantSplit/>
@@ -24550,7 +24612,7 @@
         <w:pStyle w:val="3"/>
         <w:pageBreakBefore/>
       </w:pPr>
-      <w:bookmarkStart w:id="67" w:name="_Toc3519"/>
+      <w:bookmarkStart w:id="67" w:name="_Toc15223"/>
       <w:r>
         <w:t>PHỤ LỤC C. Tự kiểm trước khi nộp</w:t>
       </w:r>
@@ -24671,7 +24733,7 @@
         <w:pStyle w:val="3"/>
         <w:pageBreakBefore/>
       </w:pPr>
-      <w:bookmarkStart w:id="68" w:name="_Toc27900"/>
+      <w:bookmarkStart w:id="68" w:name="_Toc9275"/>
       <w:r>
         <w:t>PHỤ LỤC D HƯỚNG DẪN NỘP CLASSROOM</w:t>
       </w:r>
@@ -24719,7 +24781,7 @@
         <w:spacing w:before="0" w:after="100" w:line="269" w:lineRule="auto"/>
         <w:jc w:val="left"/>
       </w:pPr>
-      <w:bookmarkStart w:id="69" w:name="_Toc23540"/>
+      <w:bookmarkStart w:id="69" w:name="_Toc12158"/>
       <w:r>
         <w:t>Bảng PL.1 Bốn tệp cần nộp</w:t>
       </w:r>
@@ -25808,7 +25870,7 @@
     <w:lsdException w:uiPriority="99" w:name="Normal Indent"/>
     <w:lsdException w:uiPriority="99" w:name="footnote text"/>
     <w:lsdException w:uiPriority="99" w:name="annotation text"/>
-    <w:lsdException w:uiPriority="99" w:semiHidden="0" w:name="header"/>
+    <w:lsdException w:qFormat="1" w:uiPriority="99" w:semiHidden="0" w:name="header"/>
     <w:lsdException w:uiPriority="99" w:semiHidden="0" w:name="footer"/>
     <w:lsdException w:uiPriority="99" w:name="index heading"/>
     <w:lsdException w:qFormat="1" w:uiPriority="35" w:name="caption"/>
@@ -25842,7 +25904,7 @@
     <w:lsdException w:qFormat="1" w:unhideWhenUsed="0" w:uiPriority="10" w:semiHidden="0" w:name="Title"/>
     <w:lsdException w:uiPriority="99" w:name="Closing"/>
     <w:lsdException w:uiPriority="99" w:name="Signature"/>
-    <w:lsdException w:uiPriority="1" w:name="Default Paragraph Font"/>
+    <w:lsdException w:qFormat="1" w:uiPriority="1" w:name="Default Paragraph Font"/>
     <w:lsdException w:uiPriority="99" w:semiHidden="0" w:name="Body Text"/>
     <w:lsdException w:uiPriority="99" w:name="Body Text Indent"/>
     <w:lsdException w:uiPriority="99" w:semiHidden="0" w:name="List Continue"/>
@@ -25880,7 +25942,7 @@
     <w:lsdException w:uiPriority="99" w:name="HTML Sample"/>
     <w:lsdException w:uiPriority="99" w:name="HTML Typewriter"/>
     <w:lsdException w:uiPriority="99" w:name="HTML Variable"/>
-    <w:lsdException w:uiPriority="99" w:name="Normal Table"/>
+    <w:lsdException w:qFormat="1" w:uiPriority="99" w:name="Normal Table"/>
     <w:lsdException w:uiPriority="99" w:name="annotation subject"/>
     <w:lsdException w:uiPriority="99" w:name="Table Simple 1"/>
     <w:lsdException w:uiPriority="99" w:name="Table Simple 2"/>
@@ -25951,9 +26013,9 @@
     <w:lsdException w:qFormat="1" w:unhideWhenUsed="0" w:uiPriority="34" w:semiHidden="0" w:name="List Paragraph"/>
     <w:lsdException w:qFormat="1" w:unhideWhenUsed="0" w:uiPriority="29" w:semiHidden="0" w:name="Quote"/>
     <w:lsdException w:qFormat="1" w:unhideWhenUsed="0" w:uiPriority="30" w:semiHidden="0" w:name="Intense Quote"/>
-    <w:lsdException w:unhideWhenUsed="0" w:uiPriority="66" w:semiHidden="0" w:name="Medium List 2 Accent 1"/>
+    <w:lsdException w:qFormat="1" w:unhideWhenUsed="0" w:uiPriority="66" w:semiHidden="0" w:name="Medium List 2 Accent 1"/>
     <w:lsdException w:unhideWhenUsed="0" w:uiPriority="67" w:semiHidden="0" w:name="Medium Grid 1 Accent 1"/>
-    <w:lsdException w:unhideWhenUsed="0" w:uiPriority="68" w:semiHidden="0" w:name="Medium Grid 2 Accent 1"/>
+    <w:lsdException w:qFormat="1" w:unhideWhenUsed="0" w:uiPriority="68" w:semiHidden="0" w:name="Medium Grid 2 Accent 1"/>
     <w:lsdException w:unhideWhenUsed="0" w:uiPriority="69" w:semiHidden="0" w:name="Medium Grid 3 Accent 1"/>
     <w:lsdException w:unhideWhenUsed="0" w:uiPriority="70" w:semiHidden="0" w:name="Dark List Accent 1"/>
     <w:lsdException w:unhideWhenUsed="0" w:uiPriority="71" w:semiHidden="0" w:name="Colorful Shading Accent 1"/>
@@ -26020,10 +26082,10 @@
     <w:lsdException w:unhideWhenUsed="0" w:uiPriority="62" w:semiHidden="0" w:name="Light Grid Accent 6"/>
     <w:lsdException w:unhideWhenUsed="0" w:uiPriority="63" w:semiHidden="0" w:name="Medium Shading 1 Accent 6"/>
     <w:lsdException w:unhideWhenUsed="0" w:uiPriority="64" w:semiHidden="0" w:name="Medium Shading 2 Accent 6"/>
-    <w:lsdException w:unhideWhenUsed="0" w:uiPriority="65" w:semiHidden="0" w:name="Medium List 1 Accent 6"/>
+    <w:lsdException w:qFormat="1" w:unhideWhenUsed="0" w:uiPriority="65" w:semiHidden="0" w:name="Medium List 1 Accent 6"/>
     <w:lsdException w:unhideWhenUsed="0" w:uiPriority="66" w:semiHidden="0" w:name="Medium List 2 Accent 6"/>
     <w:lsdException w:unhideWhenUsed="0" w:uiPriority="67" w:semiHidden="0" w:name="Medium Grid 1 Accent 6"/>
-    <w:lsdException w:unhideWhenUsed="0" w:uiPriority="68" w:semiHidden="0" w:name="Medium Grid 2 Accent 6"/>
+    <w:lsdException w:qFormat="1" w:unhideWhenUsed="0" w:uiPriority="68" w:semiHidden="0" w:name="Medium Grid 2 Accent 6"/>
     <w:lsdException w:unhideWhenUsed="0" w:uiPriority="69" w:semiHidden="0" w:name="Medium Grid 3 Accent 6"/>
     <w:lsdException w:unhideWhenUsed="0" w:uiPriority="70" w:semiHidden="0" w:name="Dark List Accent 6"/>
     <w:lsdException w:unhideWhenUsed="0" w:uiPriority="71" w:semiHidden="0" w:name="Colorful Shading Accent 6"/>
@@ -26273,12 +26335,14 @@
     <w:name w:val="Default Paragraph Font"/>
     <w:semiHidden/>
     <w:unhideWhenUsed/>
+    <w:qFormat/>
     <w:uiPriority w:val="1"/>
   </w:style>
   <w:style w:type="table" w:default="1" w:styleId="12">
     <w:name w:val="Normal Table"/>
     <w:semiHidden/>
     <w:unhideWhenUsed/>
+    <w:qFormat/>
     <w:uiPriority w:val="99"/>
     <w:tblPr>
       <w:tblCellMar>
@@ -26372,6 +26436,7 @@
     <w:basedOn w:val="1"/>
     <w:link w:val="139"/>
     <w:unhideWhenUsed/>
+    <w:qFormat/>
     <w:uiPriority w:val="99"/>
     <w:pPr>
       <w:tabs>
@@ -31095,6 +31160,7 @@
   <w:style w:type="table" w:styleId="82">
     <w:name w:val="Medium List 1 Accent 6"/>
     <w:basedOn w:val="12"/>
+    <w:qFormat/>
     <w:uiPriority w:val="65"/>
     <w:pPr>
       <w:spacing w:after="0" w:line="240" w:lineRule="auto"/>
@@ -31302,6 +31368,7 @@
   <w:style w:type="table" w:styleId="84">
     <w:name w:val="Medium List 2 Accent 1"/>
     <w:basedOn w:val="12"/>
+    <w:qFormat/>
     <w:uiPriority w:val="66"/>
     <w:pPr>
       <w:spacing w:after="0" w:line="240" w:lineRule="auto"/>
@@ -32621,6 +32688,7 @@
   <w:style w:type="table" w:styleId="98">
     <w:name w:val="Medium Grid 2 Accent 1"/>
     <w:basedOn w:val="12"/>
+    <w:qFormat/>
     <w:uiPriority w:val="68"/>
     <w:pPr>
       <w:spacing w:after="0" w:line="240" w:lineRule="auto"/>
@@ -33321,6 +33389,7 @@
   <w:style w:type="table" w:styleId="103">
     <w:name w:val="Medium Grid 2 Accent 6"/>
     <w:basedOn w:val="12"/>
+    <w:qFormat/>
     <w:uiPriority w:val="68"/>
     <w:pPr>
       <w:spacing w:after="0" w:line="240" w:lineRule="auto"/>
@@ -37516,6 +37585,7 @@
     <w:name w:val="Header Char"/>
     <w:basedOn w:val="11"/>
     <w:link w:val="19"/>
+    <w:qFormat/>
     <w:uiPriority w:val="99"/>
   </w:style>
   <w:style w:type="character" w:customStyle="1" w:styleId="140">
@@ -38072,7 +38142,6 @@
   <w:style w:type="paragraph" w:customStyle="1" w:styleId="177">
     <w:name w:val="TOC 11"/>
     <w:basedOn w:val="1"/>
-    <w:qFormat/>
     <w:uiPriority w:val="0"/>
     <w:pPr>
       <w:tabs>

</xml_diff>